<commit_message>
Final Draft till Scene-20
</commit_message>
<xml_diff>
--- a/The_A_Shorts/2. Vyuthi/Vyuthi - The Lists/Vyuthi - The Props List.docx
+++ b/The_A_Shorts/2. Vyuthi/Vyuthi - The Lists/Vyuthi - The Props List.docx
@@ -1873,16 +1873,25 @@
                 <w:kern w:val="0"/>
                 <w14:ligatures w14:val="none"/>
               </w:rPr>
-              <w:t xml:space="preserve">5, </w:t>
-            </w:r>
-            <w:r>
-              <w:rPr>
-                <w:rFonts w:ascii="Courier New" w:eastAsia="Times New Roman" w:hAnsi="Courier New" w:cs="Courier New"/>
-                <w:color w:val="000000"/>
-                <w:kern w:val="0"/>
-                <w14:ligatures w14:val="none"/>
-              </w:rPr>
-              <w:t>16</w:t>
+              <w:t>5</w:t>
+            </w:r>
+            <w:r>
+              <w:rPr>
+                <w:rFonts w:ascii="Courier New" w:eastAsia="Times New Roman" w:hAnsi="Courier New" w:cs="Courier New"/>
+                <w:color w:val="000000"/>
+                <w:kern w:val="0"/>
+                <w14:ligatures w14:val="none"/>
+              </w:rPr>
+              <w:t>, 1</w:t>
+            </w:r>
+            <w:r>
+              <w:rPr>
+                <w:rFonts w:ascii="Courier New" w:eastAsia="Times New Roman" w:hAnsi="Courier New" w:cs="Courier New"/>
+                <w:color w:val="000000"/>
+                <w:kern w:val="0"/>
+                <w14:ligatures w14:val="none"/>
+              </w:rPr>
+              <w:t>7</w:t>
             </w:r>
           </w:p>
         </w:tc>
@@ -2020,6 +2029,28 @@
                 <w14:ligatures w14:val="none"/>
               </w:rPr>
               <w:t>, 12</w:t>
+            </w:r>
+            <w:r>
+              <w:rPr>
+                <w:rFonts w:ascii="Courier New" w:eastAsia="Times New Roman" w:hAnsi="Courier New" w:cs="Courier New"/>
+                <w:b/>
+                <w:bCs/>
+                <w:color w:val="000000"/>
+                <w:kern w:val="0"/>
+                <w14:ligatures w14:val="none"/>
+              </w:rPr>
+              <w:t>, 17</w:t>
+            </w:r>
+            <w:r>
+              <w:rPr>
+                <w:rFonts w:ascii="Courier New" w:eastAsia="Times New Roman" w:hAnsi="Courier New" w:cs="Courier New"/>
+                <w:b/>
+                <w:bCs/>
+                <w:color w:val="000000"/>
+                <w:kern w:val="0"/>
+                <w14:ligatures w14:val="none"/>
+              </w:rPr>
+              <w:t>, 20</w:t>
             </w:r>
           </w:p>
         </w:tc>
@@ -2322,7 +2353,38 @@
                 <w:kern w:val="0"/>
                 <w14:ligatures w14:val="none"/>
               </w:rPr>
-              <w:t>, 15, 16, 19</w:t>
+              <w:t xml:space="preserve">, </w:t>
+            </w:r>
+            <w:r>
+              <w:rPr>
+                <w:rFonts w:ascii="Courier New" w:eastAsia="Times New Roman" w:hAnsi="Courier New" w:cs="Courier New"/>
+                <w:b/>
+                <w:bCs/>
+                <w:color w:val="000000"/>
+                <w:kern w:val="0"/>
+                <w14:ligatures w14:val="none"/>
+              </w:rPr>
+              <w:t>14,</w:t>
+            </w:r>
+            <w:r>
+              <w:rPr>
+                <w:rFonts w:ascii="Courier New" w:eastAsia="Times New Roman" w:hAnsi="Courier New" w:cs="Courier New"/>
+                <w:color w:val="000000"/>
+                <w:kern w:val="0"/>
+                <w14:ligatures w14:val="none"/>
+              </w:rPr>
+              <w:t xml:space="preserve"> </w:t>
+            </w:r>
+            <w:r>
+              <w:rPr>
+                <w:rFonts w:ascii="Courier New" w:eastAsia="Times New Roman" w:hAnsi="Courier New" w:cs="Courier New"/>
+                <w:b/>
+                <w:bCs/>
+                <w:color w:val="000000"/>
+                <w:kern w:val="0"/>
+                <w14:ligatures w14:val="none"/>
+              </w:rPr>
+              <w:t>15</w:t>
             </w:r>
           </w:p>
         </w:tc>
@@ -2443,11 +2505,24 @@
             <w:r>
               <w:rPr>
                 <w:rFonts w:ascii="Courier New" w:eastAsia="Times New Roman" w:hAnsi="Courier New" w:cs="Courier New"/>
-                <w:color w:val="000000"/>
-                <w:kern w:val="0"/>
-                <w14:ligatures w14:val="none"/>
-              </w:rPr>
-              <w:t xml:space="preserve"> 16</w:t>
+                <w:b/>
+                <w:bCs/>
+                <w:color w:val="000000"/>
+                <w:kern w:val="0"/>
+                <w14:ligatures w14:val="none"/>
+              </w:rPr>
+              <w:t xml:space="preserve"> 1</w:t>
+            </w:r>
+            <w:r>
+              <w:rPr>
+                <w:rFonts w:ascii="Courier New" w:eastAsia="Times New Roman" w:hAnsi="Courier New" w:cs="Courier New"/>
+                <w:b/>
+                <w:bCs/>
+                <w:color w:val="000000"/>
+                <w:kern w:val="0"/>
+                <w14:ligatures w14:val="none"/>
+              </w:rPr>
+              <w:t>5</w:t>
             </w:r>
           </w:p>
         </w:tc>
@@ -2567,7 +2642,56 @@
                 <w:kern w:val="0"/>
                 <w14:ligatures w14:val="none"/>
               </w:rPr>
-              <w:t xml:space="preserve"> 9, 21</w:t>
+              <w:t xml:space="preserve"> </w:t>
+            </w:r>
+            <w:r>
+              <w:rPr>
+                <w:rFonts w:ascii="Courier New" w:eastAsia="Times New Roman" w:hAnsi="Courier New" w:cs="Courier New"/>
+                <w:b/>
+                <w:bCs/>
+                <w:color w:val="000000"/>
+                <w:kern w:val="0"/>
+                <w14:ligatures w14:val="none"/>
+              </w:rPr>
+              <w:t>9,</w:t>
+            </w:r>
+            <w:r>
+              <w:rPr>
+                <w:rFonts w:ascii="Courier New" w:eastAsia="Times New Roman" w:hAnsi="Courier New" w:cs="Courier New"/>
+                <w:color w:val="000000"/>
+                <w:kern w:val="0"/>
+                <w14:ligatures w14:val="none"/>
+              </w:rPr>
+              <w:t xml:space="preserve"> </w:t>
+            </w:r>
+            <w:r>
+              <w:rPr>
+                <w:rFonts w:ascii="Courier New" w:eastAsia="Times New Roman" w:hAnsi="Courier New" w:cs="Courier New"/>
+                <w:b/>
+                <w:bCs/>
+                <w:color w:val="000000"/>
+                <w:kern w:val="0"/>
+                <w14:ligatures w14:val="none"/>
+              </w:rPr>
+              <w:t>18</w:t>
+            </w:r>
+            <w:r>
+              <w:rPr>
+                <w:rFonts w:ascii="Courier New" w:eastAsia="Times New Roman" w:hAnsi="Courier New" w:cs="Courier New"/>
+                <w:color w:val="000000"/>
+                <w:kern w:val="0"/>
+                <w14:ligatures w14:val="none"/>
+              </w:rPr>
+              <w:t xml:space="preserve">, </w:t>
+            </w:r>
+            <w:r>
+              <w:rPr>
+                <w:rFonts w:ascii="Courier New" w:eastAsia="Times New Roman" w:hAnsi="Courier New" w:cs="Courier New"/>
+                <w:color w:val="000000"/>
+                <w:kern w:val="0"/>
+                <w14:ligatures w14:val="none"/>
+              </w:rPr>
+              <w:t>21</w:t>
             </w:r>
           </w:p>
         </w:tc>
@@ -2679,16 +2803,7 @@
                 <w:kern w:val="0"/>
                 <w14:ligatures w14:val="none"/>
               </w:rPr>
-              <w:t>7,</w:t>
-            </w:r>
-            <w:r>
-              <w:rPr>
-                <w:rFonts w:ascii="Courier New" w:eastAsia="Times New Roman" w:hAnsi="Courier New" w:cs="Courier New"/>
-                <w:color w:val="000000"/>
-                <w:kern w:val="0"/>
-                <w14:ligatures w14:val="none"/>
-              </w:rPr>
-              <w:t xml:space="preserve"> 19</w:t>
+              <w:t>7</w:t>
             </w:r>
           </w:p>
         </w:tc>
@@ -2799,16 +2914,7 @@
                 <w:kern w:val="0"/>
                 <w14:ligatures w14:val="none"/>
               </w:rPr>
-              <w:t>7,</w:t>
-            </w:r>
-            <w:r>
-              <w:rPr>
-                <w:rFonts w:ascii="Courier New" w:eastAsia="Times New Roman" w:hAnsi="Courier New" w:cs="Courier New"/>
-                <w:color w:val="000000"/>
-                <w:kern w:val="0"/>
-                <w14:ligatures w14:val="none"/>
-              </w:rPr>
-              <w:t xml:space="preserve"> 19</w:t>
+              <w:t>7</w:t>
             </w:r>
           </w:p>
         </w:tc>
@@ -3062,7 +3168,7 @@
                 <w:kern w:val="0"/>
                 <w14:ligatures w14:val="none"/>
               </w:rPr>
-              <w:t>, 19, 21, 22</w:t>
+              <w:t>, 21, 22</w:t>
             </w:r>
           </w:p>
         </w:tc>
@@ -3542,7 +3648,7 @@
                 <w:kern w:val="0"/>
                 <w14:ligatures w14:val="none"/>
               </w:rPr>
-              <w:t xml:space="preserve"> 9, 19</w:t>
+              <w:t xml:space="preserve"> 9</w:t>
             </w:r>
           </w:p>
         </w:tc>
@@ -3775,16 +3881,29 @@
                 <w:kern w:val="0"/>
                 <w14:ligatures w14:val="none"/>
               </w:rPr>
-              <w:t>10,</w:t>
-            </w:r>
-            <w:r>
-              <w:rPr>
-                <w:rFonts w:ascii="Courier New" w:eastAsia="Times New Roman" w:hAnsi="Courier New" w:cs="Courier New"/>
-                <w:color w:val="000000"/>
-                <w:kern w:val="0"/>
-                <w14:ligatures w14:val="none"/>
-              </w:rPr>
-              <w:t xml:space="preserve"> 18</w:t>
+              <w:t>10</w:t>
+            </w:r>
+            <w:r>
+              <w:rPr>
+                <w:rFonts w:ascii="Courier New" w:eastAsia="Times New Roman" w:hAnsi="Courier New" w:cs="Courier New"/>
+                <w:b/>
+                <w:bCs/>
+                <w:color w:val="000000"/>
+                <w:kern w:val="0"/>
+                <w14:ligatures w14:val="none"/>
+              </w:rPr>
+              <w:t>, 1</w:t>
+            </w:r>
+            <w:r>
+              <w:rPr>
+                <w:rFonts w:ascii="Courier New" w:eastAsia="Times New Roman" w:hAnsi="Courier New" w:cs="Courier New"/>
+                <w:b/>
+                <w:bCs/>
+                <w:color w:val="000000"/>
+                <w:kern w:val="0"/>
+                <w14:ligatures w14:val="none"/>
+              </w:rPr>
+              <w:t>7</w:t>
             </w:r>
           </w:p>
         </w:tc>
@@ -4659,16 +4778,7 @@
                 <w:kern w:val="0"/>
                 <w14:ligatures w14:val="none"/>
               </w:rPr>
-              <w:t>Laptop &amp; w</w:t>
-            </w:r>
-            <w:r>
-              <w:rPr>
-                <w:rFonts w:ascii="Courier New" w:eastAsia="Times New Roman" w:hAnsi="Courier New" w:cs="Courier New"/>
-                <w:color w:val="000000"/>
-                <w:kern w:val="0"/>
-                <w14:ligatures w14:val="none"/>
-              </w:rPr>
-              <w:t>orktable in Bedroom</w:t>
+              <w:t>Laptop &amp; worktable in Bedroom</w:t>
             </w:r>
           </w:p>
         </w:tc>
@@ -4957,11 +5067,22 @@
             <w:r>
               <w:rPr>
                 <w:rFonts w:ascii="Courier New" w:eastAsia="Times New Roman" w:hAnsi="Courier New" w:cs="Courier New"/>
-                <w:color w:val="000000"/>
-                <w:kern w:val="0"/>
-                <w14:ligatures w14:val="none"/>
-              </w:rPr>
-              <w:t>12, 17, 27</w:t>
+                <w:b/>
+                <w:bCs/>
+                <w:color w:val="000000"/>
+                <w:kern w:val="0"/>
+                <w14:ligatures w14:val="none"/>
+              </w:rPr>
+              <w:t>12,</w:t>
+            </w:r>
+            <w:r>
+              <w:rPr>
+                <w:rFonts w:ascii="Courier New" w:eastAsia="Times New Roman" w:hAnsi="Courier New" w:cs="Courier New"/>
+                <w:color w:val="000000"/>
+                <w:kern w:val="0"/>
+                <w14:ligatures w14:val="none"/>
+              </w:rPr>
+              <w:t xml:space="preserve"> 17, 27</w:t>
             </w:r>
           </w:p>
         </w:tc>
@@ -5230,29 +5351,24 @@
             <w:tcW w:w="4405" w:type="dxa"/>
             <w:noWrap/>
             <w:vAlign w:val="center"/>
-            <w:hideMark/>
-          </w:tcPr>
-          <w:p>
-            <w:pPr>
-              <w:rPr>
-                <w:rFonts w:ascii="Courier New" w:eastAsia="Times New Roman" w:hAnsi="Courier New" w:cs="Courier New"/>
-                <w:b w:val="0"/>
-                <w:bCs w:val="0"/>
-                <w:color w:val="000000"/>
-                <w:kern w:val="0"/>
-                <w14:ligatures w14:val="none"/>
-              </w:rPr>
-            </w:pPr>
-            <w:r>
-              <w:rPr>
-                <w:rFonts w:ascii="Courier New" w:eastAsia="Times New Roman" w:hAnsi="Courier New" w:cs="Courier New"/>
-                <w:b w:val="0"/>
-                <w:bCs w:val="0"/>
-                <w:color w:val="000000"/>
-                <w:kern w:val="0"/>
-                <w14:ligatures w14:val="none"/>
-              </w:rPr>
-              <w:t>Water Bottle</w:t>
+          </w:tcPr>
+          <w:p>
+            <w:pPr>
+              <w:rPr>
+                <w:rFonts w:ascii="Courier New" w:eastAsia="Times New Roman" w:hAnsi="Courier New" w:cs="Courier New"/>
+                <w:color w:val="000000"/>
+                <w:kern w:val="0"/>
+                <w14:ligatures w14:val="none"/>
+              </w:rPr>
+            </w:pPr>
+            <w:r>
+              <w:rPr>
+                <w:rFonts w:ascii="Courier New" w:eastAsia="Times New Roman" w:hAnsi="Courier New" w:cs="Courier New"/>
+                <w:color w:val="000000"/>
+                <w:kern w:val="0"/>
+                <w14:ligatures w14:val="none"/>
+              </w:rPr>
+              <w:t>Ace of Spades</w:t>
             </w:r>
           </w:p>
         </w:tc>
@@ -5261,22 +5377,25 @@
             <w:tcW w:w="1890" w:type="dxa"/>
             <w:noWrap/>
             <w:vAlign w:val="center"/>
-            <w:hideMark/>
-          </w:tcPr>
-          <w:p>
-            <w:pPr>
-              <w:jc w:val="center"/>
-              <w:cnfStyle w:val="000000100000" w:firstRow="0" w:lastRow="0" w:firstColumn="0" w:lastColumn="0" w:oddVBand="0" w:evenVBand="0" w:oddHBand="1" w:evenHBand="0" w:firstRowFirstColumn="0" w:firstRowLastColumn="0" w:lastRowFirstColumn="0" w:lastRowLastColumn="0"/>
-              <w:rPr>
-                <w:rFonts w:ascii="Courier New" w:eastAsia="Times New Roman" w:hAnsi="Courier New" w:cs="Courier New"/>
-                <w:color w:val="000000"/>
-                <w:kern w:val="0"/>
-                <w14:ligatures w14:val="none"/>
-              </w:rPr>
-            </w:pPr>
-            <w:r>
-              <w:rPr>
-                <w:rFonts w:ascii="Courier New" w:eastAsia="Times New Roman" w:hAnsi="Courier New" w:cs="Courier New"/>
+          </w:tcPr>
+          <w:p>
+            <w:pPr>
+              <w:jc w:val="center"/>
+              <w:cnfStyle w:val="000000100000" w:firstRow="0" w:lastRow="0" w:firstColumn="0" w:lastColumn="0" w:oddVBand="0" w:evenVBand="0" w:oddHBand="1" w:evenHBand="0" w:firstRowFirstColumn="0" w:firstRowLastColumn="0" w:lastRowFirstColumn="0" w:lastRowLastColumn="0"/>
+              <w:rPr>
+                <w:rFonts w:ascii="Courier New" w:eastAsia="Times New Roman" w:hAnsi="Courier New" w:cs="Courier New"/>
+                <w:b/>
+                <w:bCs/>
+                <w:color w:val="000000"/>
+                <w:kern w:val="0"/>
+                <w14:ligatures w14:val="none"/>
+              </w:rPr>
+            </w:pPr>
+            <w:r>
+              <w:rPr>
+                <w:rFonts w:ascii="Courier New" w:eastAsia="Times New Roman" w:hAnsi="Courier New" w:cs="Courier New"/>
+                <w:b/>
+                <w:bCs/>
                 <w:color w:val="000000"/>
                 <w:kern w:val="0"/>
                 <w14:ligatures w14:val="none"/>
@@ -5290,27 +5409,30 @@
             <w:tcW w:w="3268" w:type="dxa"/>
             <w:noWrap/>
             <w:vAlign w:val="center"/>
-            <w:hideMark/>
-          </w:tcPr>
-          <w:p>
-            <w:pPr>
-              <w:jc w:val="center"/>
-              <w:cnfStyle w:val="000000100000" w:firstRow="0" w:lastRow="0" w:firstColumn="0" w:lastColumn="0" w:oddVBand="0" w:evenVBand="0" w:oddHBand="1" w:evenHBand="0" w:firstRowFirstColumn="0" w:firstRowLastColumn="0" w:lastRowFirstColumn="0" w:lastRowLastColumn="0"/>
-              <w:rPr>
-                <w:rFonts w:ascii="Courier New" w:eastAsia="Times New Roman" w:hAnsi="Courier New" w:cs="Courier New"/>
-                <w:color w:val="000000"/>
-                <w:kern w:val="0"/>
-                <w14:ligatures w14:val="none"/>
-              </w:rPr>
-            </w:pPr>
-            <w:r>
-              <w:rPr>
-                <w:rFonts w:ascii="Courier New" w:eastAsia="Times New Roman" w:hAnsi="Courier New" w:cs="Courier New"/>
-                <w:color w:val="000000"/>
-                <w:kern w:val="0"/>
-                <w14:ligatures w14:val="none"/>
-              </w:rPr>
-              <w:t>13, 17, 19</w:t>
+          </w:tcPr>
+          <w:p>
+            <w:pPr>
+              <w:jc w:val="center"/>
+              <w:cnfStyle w:val="000000100000" w:firstRow="0" w:lastRow="0" w:firstColumn="0" w:lastColumn="0" w:oddVBand="0" w:evenVBand="0" w:oddHBand="1" w:evenHBand="0" w:firstRowFirstColumn="0" w:firstRowLastColumn="0" w:lastRowFirstColumn="0" w:lastRowLastColumn="0"/>
+              <w:rPr>
+                <w:rFonts w:ascii="Courier New" w:eastAsia="Times New Roman" w:hAnsi="Courier New" w:cs="Courier New"/>
+                <w:b/>
+                <w:bCs/>
+                <w:color w:val="000000"/>
+                <w:kern w:val="0"/>
+                <w14:ligatures w14:val="none"/>
+              </w:rPr>
+            </w:pPr>
+            <w:r>
+              <w:rPr>
+                <w:rFonts w:ascii="Courier New" w:eastAsia="Times New Roman" w:hAnsi="Courier New" w:cs="Courier New"/>
+                <w:b/>
+                <w:bCs/>
+                <w:color w:val="000000"/>
+                <w:kern w:val="0"/>
+                <w14:ligatures w14:val="none"/>
+              </w:rPr>
+              <w:t>13</w:t>
             </w:r>
           </w:p>
         </w:tc>
@@ -5343,29 +5465,24 @@
             <w:tcW w:w="4405" w:type="dxa"/>
             <w:noWrap/>
             <w:vAlign w:val="center"/>
-            <w:hideMark/>
-          </w:tcPr>
-          <w:p>
-            <w:pPr>
-              <w:rPr>
-                <w:rFonts w:ascii="Courier New" w:eastAsia="Times New Roman" w:hAnsi="Courier New" w:cs="Courier New"/>
-                <w:b w:val="0"/>
-                <w:bCs w:val="0"/>
-                <w:color w:val="000000"/>
-                <w:kern w:val="0"/>
-                <w14:ligatures w14:val="none"/>
-              </w:rPr>
-            </w:pPr>
-            <w:r>
-              <w:rPr>
-                <w:rFonts w:ascii="Courier New" w:eastAsia="Times New Roman" w:hAnsi="Courier New" w:cs="Courier New"/>
-                <w:b w:val="0"/>
-                <w:bCs w:val="0"/>
-                <w:color w:val="000000"/>
-                <w:kern w:val="0"/>
-                <w14:ligatures w14:val="none"/>
-              </w:rPr>
-              <w:t>Doctor’s apron</w:t>
+          </w:tcPr>
+          <w:p>
+            <w:pPr>
+              <w:rPr>
+                <w:rFonts w:ascii="Courier New" w:eastAsia="Times New Roman" w:hAnsi="Courier New" w:cs="Courier New"/>
+                <w:color w:val="000000"/>
+                <w:kern w:val="0"/>
+                <w14:ligatures w14:val="none"/>
+              </w:rPr>
+            </w:pPr>
+            <w:r>
+              <w:rPr>
+                <w:rFonts w:ascii="Courier New" w:eastAsia="Times New Roman" w:hAnsi="Courier New" w:cs="Courier New"/>
+                <w:color w:val="000000"/>
+                <w:kern w:val="0"/>
+                <w14:ligatures w14:val="none"/>
+              </w:rPr>
+              <w:t>Cigarette pack and match</w:t>
             </w:r>
           </w:p>
         </w:tc>
@@ -5374,22 +5491,25 @@
             <w:tcW w:w="1890" w:type="dxa"/>
             <w:noWrap/>
             <w:vAlign w:val="center"/>
-            <w:hideMark/>
-          </w:tcPr>
-          <w:p>
-            <w:pPr>
-              <w:jc w:val="center"/>
-              <w:cnfStyle w:val="000000000000" w:firstRow="0" w:lastRow="0" w:firstColumn="0" w:lastColumn="0" w:oddVBand="0" w:evenVBand="0" w:oddHBand="0" w:evenHBand="0" w:firstRowFirstColumn="0" w:firstRowLastColumn="0" w:lastRowFirstColumn="0" w:lastRowLastColumn="0"/>
-              <w:rPr>
-                <w:rFonts w:ascii="Courier New" w:eastAsia="Times New Roman" w:hAnsi="Courier New" w:cs="Courier New"/>
-                <w:color w:val="000000"/>
-                <w:kern w:val="0"/>
-                <w14:ligatures w14:val="none"/>
-              </w:rPr>
-            </w:pPr>
-            <w:r>
-              <w:rPr>
-                <w:rFonts w:ascii="Courier New" w:eastAsia="Times New Roman" w:hAnsi="Courier New" w:cs="Courier New"/>
+          </w:tcPr>
+          <w:p>
+            <w:pPr>
+              <w:jc w:val="center"/>
+              <w:cnfStyle w:val="000000000000" w:firstRow="0" w:lastRow="0" w:firstColumn="0" w:lastColumn="0" w:oddVBand="0" w:evenVBand="0" w:oddHBand="0" w:evenHBand="0" w:firstRowFirstColumn="0" w:firstRowLastColumn="0" w:lastRowFirstColumn="0" w:lastRowLastColumn="0"/>
+              <w:rPr>
+                <w:rFonts w:ascii="Courier New" w:eastAsia="Times New Roman" w:hAnsi="Courier New" w:cs="Courier New"/>
+                <w:b/>
+                <w:bCs/>
+                <w:color w:val="000000"/>
+                <w:kern w:val="0"/>
+                <w14:ligatures w14:val="none"/>
+              </w:rPr>
+            </w:pPr>
+            <w:r>
+              <w:rPr>
+                <w:rFonts w:ascii="Courier New" w:eastAsia="Times New Roman" w:hAnsi="Courier New" w:cs="Courier New"/>
+                <w:b/>
+                <w:bCs/>
                 <w:color w:val="000000"/>
                 <w:kern w:val="0"/>
                 <w14:ligatures w14:val="none"/>
@@ -5403,27 +5523,30 @@
             <w:tcW w:w="3268" w:type="dxa"/>
             <w:noWrap/>
             <w:vAlign w:val="center"/>
-            <w:hideMark/>
-          </w:tcPr>
-          <w:p>
-            <w:pPr>
-              <w:jc w:val="center"/>
-              <w:cnfStyle w:val="000000000000" w:firstRow="0" w:lastRow="0" w:firstColumn="0" w:lastColumn="0" w:oddVBand="0" w:evenVBand="0" w:oddHBand="0" w:evenHBand="0" w:firstRowFirstColumn="0" w:firstRowLastColumn="0" w:lastRowFirstColumn="0" w:lastRowLastColumn="0"/>
-              <w:rPr>
-                <w:rFonts w:ascii="Courier New" w:eastAsia="Times New Roman" w:hAnsi="Courier New" w:cs="Courier New"/>
-                <w:color w:val="000000"/>
-                <w:kern w:val="0"/>
-                <w14:ligatures w14:val="none"/>
-              </w:rPr>
-            </w:pPr>
-            <w:r>
-              <w:rPr>
-                <w:rFonts w:ascii="Courier New" w:eastAsia="Times New Roman" w:hAnsi="Courier New" w:cs="Courier New"/>
-                <w:color w:val="000000"/>
-                <w:kern w:val="0"/>
-                <w14:ligatures w14:val="none"/>
-              </w:rPr>
-              <w:t>15</w:t>
+          </w:tcPr>
+          <w:p>
+            <w:pPr>
+              <w:jc w:val="center"/>
+              <w:cnfStyle w:val="000000000000" w:firstRow="0" w:lastRow="0" w:firstColumn="0" w:lastColumn="0" w:oddVBand="0" w:evenVBand="0" w:oddHBand="0" w:evenHBand="0" w:firstRowFirstColumn="0" w:firstRowLastColumn="0" w:lastRowFirstColumn="0" w:lastRowLastColumn="0"/>
+              <w:rPr>
+                <w:rFonts w:ascii="Courier New" w:eastAsia="Times New Roman" w:hAnsi="Courier New" w:cs="Courier New"/>
+                <w:b/>
+                <w:bCs/>
+                <w:color w:val="000000"/>
+                <w:kern w:val="0"/>
+                <w14:ligatures w14:val="none"/>
+              </w:rPr>
+            </w:pPr>
+            <w:r>
+              <w:rPr>
+                <w:rFonts w:ascii="Courier New" w:eastAsia="Times New Roman" w:hAnsi="Courier New" w:cs="Courier New"/>
+                <w:b/>
+                <w:bCs/>
+                <w:color w:val="000000"/>
+                <w:kern w:val="0"/>
+                <w14:ligatures w14:val="none"/>
+              </w:rPr>
+              <w:t>13</w:t>
             </w:r>
           </w:p>
         </w:tc>
@@ -5457,29 +5580,24 @@
             <w:tcW w:w="4405" w:type="dxa"/>
             <w:noWrap/>
             <w:vAlign w:val="center"/>
-            <w:hideMark/>
-          </w:tcPr>
-          <w:p>
-            <w:pPr>
-              <w:rPr>
-                <w:rFonts w:ascii="Courier New" w:eastAsia="Times New Roman" w:hAnsi="Courier New" w:cs="Courier New"/>
-                <w:b w:val="0"/>
-                <w:bCs w:val="0"/>
-                <w:color w:val="000000"/>
-                <w:kern w:val="0"/>
-                <w14:ligatures w14:val="none"/>
-              </w:rPr>
-            </w:pPr>
-            <w:r>
-              <w:rPr>
-                <w:rFonts w:ascii="Courier New" w:eastAsia="Times New Roman" w:hAnsi="Courier New" w:cs="Courier New"/>
-                <w:b w:val="0"/>
-                <w:bCs w:val="0"/>
-                <w:color w:val="000000"/>
-                <w:kern w:val="0"/>
-                <w14:ligatures w14:val="none"/>
-              </w:rPr>
-              <w:t>Ashtray with Cigarette butts</w:t>
+          </w:tcPr>
+          <w:p>
+            <w:pPr>
+              <w:rPr>
+                <w:rFonts w:ascii="Courier New" w:eastAsia="Times New Roman" w:hAnsi="Courier New" w:cs="Courier New"/>
+                <w:color w:val="000000"/>
+                <w:kern w:val="0"/>
+                <w14:ligatures w14:val="none"/>
+              </w:rPr>
+            </w:pPr>
+            <w:r>
+              <w:rPr>
+                <w:rFonts w:ascii="Courier New" w:eastAsia="Times New Roman" w:hAnsi="Courier New" w:cs="Courier New"/>
+                <w:color w:val="000000"/>
+                <w:kern w:val="0"/>
+                <w14:ligatures w14:val="none"/>
+              </w:rPr>
+              <w:t>Ashtray with butts</w:t>
             </w:r>
           </w:p>
         </w:tc>
@@ -5488,22 +5606,25 @@
             <w:tcW w:w="1890" w:type="dxa"/>
             <w:noWrap/>
             <w:vAlign w:val="center"/>
-            <w:hideMark/>
-          </w:tcPr>
-          <w:p>
-            <w:pPr>
-              <w:jc w:val="center"/>
-              <w:cnfStyle w:val="000000100000" w:firstRow="0" w:lastRow="0" w:firstColumn="0" w:lastColumn="0" w:oddVBand="0" w:evenVBand="0" w:oddHBand="1" w:evenHBand="0" w:firstRowFirstColumn="0" w:firstRowLastColumn="0" w:lastRowFirstColumn="0" w:lastRowLastColumn="0"/>
-              <w:rPr>
-                <w:rFonts w:ascii="Courier New" w:eastAsia="Times New Roman" w:hAnsi="Courier New" w:cs="Courier New"/>
-                <w:color w:val="000000"/>
-                <w:kern w:val="0"/>
-                <w14:ligatures w14:val="none"/>
-              </w:rPr>
-            </w:pPr>
-            <w:r>
-              <w:rPr>
-                <w:rFonts w:ascii="Courier New" w:eastAsia="Times New Roman" w:hAnsi="Courier New" w:cs="Courier New"/>
+          </w:tcPr>
+          <w:p>
+            <w:pPr>
+              <w:jc w:val="center"/>
+              <w:cnfStyle w:val="000000100000" w:firstRow="0" w:lastRow="0" w:firstColumn="0" w:lastColumn="0" w:oddVBand="0" w:evenVBand="0" w:oddHBand="1" w:evenHBand="0" w:firstRowFirstColumn="0" w:firstRowLastColumn="0" w:lastRowFirstColumn="0" w:lastRowLastColumn="0"/>
+              <w:rPr>
+                <w:rFonts w:ascii="Courier New" w:eastAsia="Times New Roman" w:hAnsi="Courier New" w:cs="Courier New"/>
+                <w:b/>
+                <w:bCs/>
+                <w:color w:val="000000"/>
+                <w:kern w:val="0"/>
+                <w14:ligatures w14:val="none"/>
+              </w:rPr>
+            </w:pPr>
+            <w:r>
+              <w:rPr>
+                <w:rFonts w:ascii="Courier New" w:eastAsia="Times New Roman" w:hAnsi="Courier New" w:cs="Courier New"/>
+                <w:b/>
+                <w:bCs/>
                 <w:color w:val="000000"/>
                 <w:kern w:val="0"/>
                 <w14:ligatures w14:val="none"/>
@@ -5517,27 +5638,30 @@
             <w:tcW w:w="3268" w:type="dxa"/>
             <w:noWrap/>
             <w:vAlign w:val="center"/>
-            <w:hideMark/>
-          </w:tcPr>
-          <w:p>
-            <w:pPr>
-              <w:jc w:val="center"/>
-              <w:cnfStyle w:val="000000100000" w:firstRow="0" w:lastRow="0" w:firstColumn="0" w:lastColumn="0" w:oddVBand="0" w:evenVBand="0" w:oddHBand="1" w:evenHBand="0" w:firstRowFirstColumn="0" w:firstRowLastColumn="0" w:lastRowFirstColumn="0" w:lastRowLastColumn="0"/>
-              <w:rPr>
-                <w:rFonts w:ascii="Courier New" w:eastAsia="Times New Roman" w:hAnsi="Courier New" w:cs="Courier New"/>
-                <w:color w:val="000000"/>
-                <w:kern w:val="0"/>
-                <w14:ligatures w14:val="none"/>
-              </w:rPr>
-            </w:pPr>
-            <w:r>
-              <w:rPr>
-                <w:rFonts w:ascii="Courier New" w:eastAsia="Times New Roman" w:hAnsi="Courier New" w:cs="Courier New"/>
-                <w:color w:val="000000"/>
-                <w:kern w:val="0"/>
-                <w14:ligatures w14:val="none"/>
-              </w:rPr>
-              <w:t>14</w:t>
+          </w:tcPr>
+          <w:p>
+            <w:pPr>
+              <w:jc w:val="center"/>
+              <w:cnfStyle w:val="000000100000" w:firstRow="0" w:lastRow="0" w:firstColumn="0" w:lastColumn="0" w:oddVBand="0" w:evenVBand="0" w:oddHBand="1" w:evenHBand="0" w:firstRowFirstColumn="0" w:firstRowLastColumn="0" w:lastRowFirstColumn="0" w:lastRowLastColumn="0"/>
+              <w:rPr>
+                <w:rFonts w:ascii="Courier New" w:eastAsia="Times New Roman" w:hAnsi="Courier New" w:cs="Courier New"/>
+                <w:b/>
+                <w:bCs/>
+                <w:color w:val="000000"/>
+                <w:kern w:val="0"/>
+                <w14:ligatures w14:val="none"/>
+              </w:rPr>
+            </w:pPr>
+            <w:r>
+              <w:rPr>
+                <w:rFonts w:ascii="Courier New" w:eastAsia="Times New Roman" w:hAnsi="Courier New" w:cs="Courier New"/>
+                <w:b/>
+                <w:bCs/>
+                <w:color w:val="000000"/>
+                <w:kern w:val="0"/>
+                <w14:ligatures w14:val="none"/>
+              </w:rPr>
+              <w:t>13</w:t>
             </w:r>
           </w:p>
         </w:tc>
@@ -5570,29 +5694,24 @@
             <w:tcW w:w="4405" w:type="dxa"/>
             <w:noWrap/>
             <w:vAlign w:val="center"/>
-            <w:hideMark/>
-          </w:tcPr>
-          <w:p>
-            <w:pPr>
-              <w:rPr>
-                <w:rFonts w:ascii="Courier New" w:eastAsia="Times New Roman" w:hAnsi="Courier New" w:cs="Courier New"/>
-                <w:b w:val="0"/>
-                <w:bCs w:val="0"/>
-                <w:color w:val="000000"/>
-                <w:kern w:val="0"/>
-                <w14:ligatures w14:val="none"/>
-              </w:rPr>
-            </w:pPr>
-            <w:r>
-              <w:rPr>
-                <w:rFonts w:ascii="Courier New" w:eastAsia="Times New Roman" w:hAnsi="Courier New" w:cs="Courier New"/>
-                <w:b w:val="0"/>
-                <w:bCs w:val="0"/>
-                <w:color w:val="000000"/>
-                <w:kern w:val="0"/>
-                <w14:ligatures w14:val="none"/>
-              </w:rPr>
-              <w:t>Pool table with ball and cue</w:t>
+          </w:tcPr>
+          <w:p>
+            <w:pPr>
+              <w:rPr>
+                <w:rFonts w:ascii="Courier New" w:eastAsia="Times New Roman" w:hAnsi="Courier New" w:cs="Courier New"/>
+                <w:color w:val="000000"/>
+                <w:kern w:val="0"/>
+                <w14:ligatures w14:val="none"/>
+              </w:rPr>
+            </w:pPr>
+            <w:r>
+              <w:rPr>
+                <w:rFonts w:ascii="Courier New" w:eastAsia="Times New Roman" w:hAnsi="Courier New" w:cs="Courier New"/>
+                <w:color w:val="000000"/>
+                <w:kern w:val="0"/>
+                <w14:ligatures w14:val="none"/>
+              </w:rPr>
+              <w:t>Empty water bottle</w:t>
             </w:r>
           </w:p>
         </w:tc>
@@ -5601,22 +5720,25 @@
             <w:tcW w:w="1890" w:type="dxa"/>
             <w:noWrap/>
             <w:vAlign w:val="center"/>
-            <w:hideMark/>
-          </w:tcPr>
-          <w:p>
-            <w:pPr>
-              <w:jc w:val="center"/>
-              <w:cnfStyle w:val="000000000000" w:firstRow="0" w:lastRow="0" w:firstColumn="0" w:lastColumn="0" w:oddVBand="0" w:evenVBand="0" w:oddHBand="0" w:evenHBand="0" w:firstRowFirstColumn="0" w:firstRowLastColumn="0" w:lastRowFirstColumn="0" w:lastRowLastColumn="0"/>
-              <w:rPr>
-                <w:rFonts w:ascii="Courier New" w:eastAsia="Times New Roman" w:hAnsi="Courier New" w:cs="Courier New"/>
-                <w:color w:val="000000"/>
-                <w:kern w:val="0"/>
-                <w14:ligatures w14:val="none"/>
-              </w:rPr>
-            </w:pPr>
-            <w:r>
-              <w:rPr>
-                <w:rFonts w:ascii="Courier New" w:eastAsia="Times New Roman" w:hAnsi="Courier New" w:cs="Courier New"/>
+          </w:tcPr>
+          <w:p>
+            <w:pPr>
+              <w:jc w:val="center"/>
+              <w:cnfStyle w:val="000000000000" w:firstRow="0" w:lastRow="0" w:firstColumn="0" w:lastColumn="0" w:oddVBand="0" w:evenVBand="0" w:oddHBand="0" w:evenHBand="0" w:firstRowFirstColumn="0" w:firstRowLastColumn="0" w:lastRowFirstColumn="0" w:lastRowLastColumn="0"/>
+              <w:rPr>
+                <w:rFonts w:ascii="Courier New" w:eastAsia="Times New Roman" w:hAnsi="Courier New" w:cs="Courier New"/>
+                <w:b/>
+                <w:bCs/>
+                <w:color w:val="000000"/>
+                <w:kern w:val="0"/>
+                <w14:ligatures w14:val="none"/>
+              </w:rPr>
+            </w:pPr>
+            <w:r>
+              <w:rPr>
+                <w:rFonts w:ascii="Courier New" w:eastAsia="Times New Roman" w:hAnsi="Courier New" w:cs="Courier New"/>
+                <w:b/>
+                <w:bCs/>
                 <w:color w:val="000000"/>
                 <w:kern w:val="0"/>
                 <w14:ligatures w14:val="none"/>
@@ -5630,27 +5752,30 @@
             <w:tcW w:w="3268" w:type="dxa"/>
             <w:noWrap/>
             <w:vAlign w:val="center"/>
-            <w:hideMark/>
-          </w:tcPr>
-          <w:p>
-            <w:pPr>
-              <w:jc w:val="center"/>
-              <w:cnfStyle w:val="000000000000" w:firstRow="0" w:lastRow="0" w:firstColumn="0" w:lastColumn="0" w:oddVBand="0" w:evenVBand="0" w:oddHBand="0" w:evenHBand="0" w:firstRowFirstColumn="0" w:firstRowLastColumn="0" w:lastRowFirstColumn="0" w:lastRowLastColumn="0"/>
-              <w:rPr>
-                <w:rFonts w:ascii="Courier New" w:eastAsia="Times New Roman" w:hAnsi="Courier New" w:cs="Courier New"/>
-                <w:color w:val="000000"/>
-                <w:kern w:val="0"/>
-                <w14:ligatures w14:val="none"/>
-              </w:rPr>
-            </w:pPr>
-            <w:r>
-              <w:rPr>
-                <w:rFonts w:ascii="Courier New" w:eastAsia="Times New Roman" w:hAnsi="Courier New" w:cs="Courier New"/>
-                <w:color w:val="000000"/>
-                <w:kern w:val="0"/>
-                <w14:ligatures w14:val="none"/>
-              </w:rPr>
-              <w:t>14</w:t>
+          </w:tcPr>
+          <w:p>
+            <w:pPr>
+              <w:jc w:val="center"/>
+              <w:cnfStyle w:val="000000000000" w:firstRow="0" w:lastRow="0" w:firstColumn="0" w:lastColumn="0" w:oddVBand="0" w:evenVBand="0" w:oddHBand="0" w:evenHBand="0" w:firstRowFirstColumn="0" w:firstRowLastColumn="0" w:lastRowFirstColumn="0" w:lastRowLastColumn="0"/>
+              <w:rPr>
+                <w:rFonts w:ascii="Courier New" w:eastAsia="Times New Roman" w:hAnsi="Courier New" w:cs="Courier New"/>
+                <w:b/>
+                <w:bCs/>
+                <w:color w:val="000000"/>
+                <w:kern w:val="0"/>
+                <w14:ligatures w14:val="none"/>
+              </w:rPr>
+            </w:pPr>
+            <w:r>
+              <w:rPr>
+                <w:rFonts w:ascii="Courier New" w:eastAsia="Times New Roman" w:hAnsi="Courier New" w:cs="Courier New"/>
+                <w:b/>
+                <w:bCs/>
+                <w:color w:val="000000"/>
+                <w:kern w:val="0"/>
+                <w14:ligatures w14:val="none"/>
+              </w:rPr>
+              <w:t>13</w:t>
             </w:r>
           </w:p>
         </w:tc>
@@ -5684,29 +5809,24 @@
             <w:tcW w:w="4405" w:type="dxa"/>
             <w:noWrap/>
             <w:vAlign w:val="center"/>
-            <w:hideMark/>
-          </w:tcPr>
-          <w:p>
-            <w:pPr>
-              <w:rPr>
-                <w:rFonts w:ascii="Courier New" w:eastAsia="Times New Roman" w:hAnsi="Courier New" w:cs="Courier New"/>
-                <w:b w:val="0"/>
-                <w:bCs w:val="0"/>
-                <w:color w:val="000000"/>
-                <w:kern w:val="0"/>
-                <w14:ligatures w14:val="none"/>
-              </w:rPr>
-            </w:pPr>
-            <w:r>
-              <w:rPr>
-                <w:rFonts w:ascii="Courier New" w:eastAsia="Times New Roman" w:hAnsi="Courier New" w:cs="Courier New"/>
-                <w:b w:val="0"/>
-                <w:bCs w:val="0"/>
-                <w:color w:val="000000"/>
-                <w:kern w:val="0"/>
-                <w14:ligatures w14:val="none"/>
-              </w:rPr>
-              <w:t>Some Engineering Book</w:t>
+          </w:tcPr>
+          <w:p>
+            <w:pPr>
+              <w:rPr>
+                <w:rFonts w:ascii="Courier New" w:eastAsia="Times New Roman" w:hAnsi="Courier New" w:cs="Courier New"/>
+                <w:color w:val="000000"/>
+                <w:kern w:val="0"/>
+                <w14:ligatures w14:val="none"/>
+              </w:rPr>
+            </w:pPr>
+            <w:r>
+              <w:rPr>
+                <w:rFonts w:ascii="Courier New" w:eastAsia="Times New Roman" w:hAnsi="Courier New" w:cs="Courier New"/>
+                <w:color w:val="000000"/>
+                <w:kern w:val="0"/>
+                <w14:ligatures w14:val="none"/>
+              </w:rPr>
+              <w:t>Table in between sitting</w:t>
             </w:r>
           </w:p>
         </w:tc>
@@ -5715,22 +5835,25 @@
             <w:tcW w:w="1890" w:type="dxa"/>
             <w:noWrap/>
             <w:vAlign w:val="center"/>
-            <w:hideMark/>
-          </w:tcPr>
-          <w:p>
-            <w:pPr>
-              <w:jc w:val="center"/>
-              <w:cnfStyle w:val="000000100000" w:firstRow="0" w:lastRow="0" w:firstColumn="0" w:lastColumn="0" w:oddVBand="0" w:evenVBand="0" w:oddHBand="1" w:evenHBand="0" w:firstRowFirstColumn="0" w:firstRowLastColumn="0" w:lastRowFirstColumn="0" w:lastRowLastColumn="0"/>
-              <w:rPr>
-                <w:rFonts w:ascii="Courier New" w:eastAsia="Times New Roman" w:hAnsi="Courier New" w:cs="Courier New"/>
-                <w:color w:val="000000"/>
-                <w:kern w:val="0"/>
-                <w14:ligatures w14:val="none"/>
-              </w:rPr>
-            </w:pPr>
-            <w:r>
-              <w:rPr>
-                <w:rFonts w:ascii="Courier New" w:eastAsia="Times New Roman" w:hAnsi="Courier New" w:cs="Courier New"/>
+          </w:tcPr>
+          <w:p>
+            <w:pPr>
+              <w:jc w:val="center"/>
+              <w:cnfStyle w:val="000000100000" w:firstRow="0" w:lastRow="0" w:firstColumn="0" w:lastColumn="0" w:oddVBand="0" w:evenVBand="0" w:oddHBand="1" w:evenHBand="0" w:firstRowFirstColumn="0" w:firstRowLastColumn="0" w:lastRowFirstColumn="0" w:lastRowLastColumn="0"/>
+              <w:rPr>
+                <w:rFonts w:ascii="Courier New" w:eastAsia="Times New Roman" w:hAnsi="Courier New" w:cs="Courier New"/>
+                <w:b/>
+                <w:bCs/>
+                <w:color w:val="000000"/>
+                <w:kern w:val="0"/>
+                <w14:ligatures w14:val="none"/>
+              </w:rPr>
+            </w:pPr>
+            <w:r>
+              <w:rPr>
+                <w:rFonts w:ascii="Courier New" w:eastAsia="Times New Roman" w:hAnsi="Courier New" w:cs="Courier New"/>
+                <w:b/>
+                <w:bCs/>
                 <w:color w:val="000000"/>
                 <w:kern w:val="0"/>
                 <w14:ligatures w14:val="none"/>
@@ -5744,27 +5867,30 @@
             <w:tcW w:w="3268" w:type="dxa"/>
             <w:noWrap/>
             <w:vAlign w:val="center"/>
-            <w:hideMark/>
-          </w:tcPr>
-          <w:p>
-            <w:pPr>
-              <w:jc w:val="center"/>
-              <w:cnfStyle w:val="000000100000" w:firstRow="0" w:lastRow="0" w:firstColumn="0" w:lastColumn="0" w:oddVBand="0" w:evenVBand="0" w:oddHBand="1" w:evenHBand="0" w:firstRowFirstColumn="0" w:firstRowLastColumn="0" w:lastRowFirstColumn="0" w:lastRowLastColumn="0"/>
-              <w:rPr>
-                <w:rFonts w:ascii="Courier New" w:eastAsia="Times New Roman" w:hAnsi="Courier New" w:cs="Courier New"/>
-                <w:color w:val="000000"/>
-                <w:kern w:val="0"/>
-                <w14:ligatures w14:val="none"/>
-              </w:rPr>
-            </w:pPr>
-            <w:r>
-              <w:rPr>
-                <w:rFonts w:ascii="Courier New" w:eastAsia="Times New Roman" w:hAnsi="Courier New" w:cs="Courier New"/>
-                <w:color w:val="000000"/>
-                <w:kern w:val="0"/>
-                <w14:ligatures w14:val="none"/>
-              </w:rPr>
-              <w:t>19</w:t>
+          </w:tcPr>
+          <w:p>
+            <w:pPr>
+              <w:jc w:val="center"/>
+              <w:cnfStyle w:val="000000100000" w:firstRow="0" w:lastRow="0" w:firstColumn="0" w:lastColumn="0" w:oddVBand="0" w:evenVBand="0" w:oddHBand="1" w:evenHBand="0" w:firstRowFirstColumn="0" w:firstRowLastColumn="0" w:lastRowFirstColumn="0" w:lastRowLastColumn="0"/>
+              <w:rPr>
+                <w:rFonts w:ascii="Courier New" w:eastAsia="Times New Roman" w:hAnsi="Courier New" w:cs="Courier New"/>
+                <w:b/>
+                <w:bCs/>
+                <w:color w:val="000000"/>
+                <w:kern w:val="0"/>
+                <w14:ligatures w14:val="none"/>
+              </w:rPr>
+            </w:pPr>
+            <w:r>
+              <w:rPr>
+                <w:rFonts w:ascii="Courier New" w:eastAsia="Times New Roman" w:hAnsi="Courier New" w:cs="Courier New"/>
+                <w:b/>
+                <w:bCs/>
+                <w:color w:val="000000"/>
+                <w:kern w:val="0"/>
+                <w14:ligatures w14:val="none"/>
+              </w:rPr>
+              <w:t>13</w:t>
             </w:r>
           </w:p>
         </w:tc>
@@ -5797,29 +5923,24 @@
             <w:tcW w:w="4405" w:type="dxa"/>
             <w:noWrap/>
             <w:vAlign w:val="center"/>
-            <w:hideMark/>
-          </w:tcPr>
-          <w:p>
-            <w:pPr>
-              <w:rPr>
-                <w:rFonts w:ascii="Courier New" w:eastAsia="Times New Roman" w:hAnsi="Courier New" w:cs="Courier New"/>
-                <w:b w:val="0"/>
-                <w:bCs w:val="0"/>
-                <w:color w:val="000000"/>
-                <w:kern w:val="0"/>
-                <w14:ligatures w14:val="none"/>
-              </w:rPr>
-            </w:pPr>
-            <w:r>
-              <w:rPr>
-                <w:rFonts w:ascii="Courier New" w:eastAsia="Times New Roman" w:hAnsi="Courier New" w:cs="Courier New"/>
-                <w:b w:val="0"/>
-                <w:bCs w:val="0"/>
-                <w:color w:val="000000"/>
-                <w:kern w:val="0"/>
-                <w14:ligatures w14:val="none"/>
-              </w:rPr>
-              <w:t>Kettle</w:t>
+          </w:tcPr>
+          <w:p>
+            <w:pPr>
+              <w:rPr>
+                <w:rFonts w:ascii="Courier New" w:eastAsia="Times New Roman" w:hAnsi="Courier New" w:cs="Courier New"/>
+                <w:color w:val="000000"/>
+                <w:kern w:val="0"/>
+                <w14:ligatures w14:val="none"/>
+              </w:rPr>
+            </w:pPr>
+            <w:r>
+              <w:rPr>
+                <w:rFonts w:ascii="Courier New" w:eastAsia="Times New Roman" w:hAnsi="Courier New" w:cs="Courier New"/>
+                <w:color w:val="000000"/>
+                <w:kern w:val="0"/>
+                <w14:ligatures w14:val="none"/>
+              </w:rPr>
+              <w:t>Bandage</w:t>
             </w:r>
           </w:p>
         </w:tc>
@@ -5828,22 +5949,25 @@
             <w:tcW w:w="1890" w:type="dxa"/>
             <w:noWrap/>
             <w:vAlign w:val="center"/>
-            <w:hideMark/>
-          </w:tcPr>
-          <w:p>
-            <w:pPr>
-              <w:jc w:val="center"/>
-              <w:cnfStyle w:val="000000000000" w:firstRow="0" w:lastRow="0" w:firstColumn="0" w:lastColumn="0" w:oddVBand="0" w:evenVBand="0" w:oddHBand="0" w:evenHBand="0" w:firstRowFirstColumn="0" w:firstRowLastColumn="0" w:lastRowFirstColumn="0" w:lastRowLastColumn="0"/>
-              <w:rPr>
-                <w:rFonts w:ascii="Courier New" w:eastAsia="Times New Roman" w:hAnsi="Courier New" w:cs="Courier New"/>
-                <w:color w:val="000000"/>
-                <w:kern w:val="0"/>
-                <w14:ligatures w14:val="none"/>
-              </w:rPr>
-            </w:pPr>
-            <w:r>
-              <w:rPr>
-                <w:rFonts w:ascii="Courier New" w:eastAsia="Times New Roman" w:hAnsi="Courier New" w:cs="Courier New"/>
+          </w:tcPr>
+          <w:p>
+            <w:pPr>
+              <w:jc w:val="center"/>
+              <w:cnfStyle w:val="000000000000" w:firstRow="0" w:lastRow="0" w:firstColumn="0" w:lastColumn="0" w:oddVBand="0" w:evenVBand="0" w:oddHBand="0" w:evenHBand="0" w:firstRowFirstColumn="0" w:firstRowLastColumn="0" w:lastRowFirstColumn="0" w:lastRowLastColumn="0"/>
+              <w:rPr>
+                <w:rFonts w:ascii="Courier New" w:eastAsia="Times New Roman" w:hAnsi="Courier New" w:cs="Courier New"/>
+                <w:b/>
+                <w:bCs/>
+                <w:color w:val="000000"/>
+                <w:kern w:val="0"/>
+                <w14:ligatures w14:val="none"/>
+              </w:rPr>
+            </w:pPr>
+            <w:r>
+              <w:rPr>
+                <w:rFonts w:ascii="Courier New" w:eastAsia="Times New Roman" w:hAnsi="Courier New" w:cs="Courier New"/>
+                <w:b/>
+                <w:bCs/>
                 <w:color w:val="000000"/>
                 <w:kern w:val="0"/>
                 <w14:ligatures w14:val="none"/>
@@ -5857,27 +5981,30 @@
             <w:tcW w:w="3268" w:type="dxa"/>
             <w:noWrap/>
             <w:vAlign w:val="center"/>
-            <w:hideMark/>
-          </w:tcPr>
-          <w:p>
-            <w:pPr>
-              <w:jc w:val="center"/>
-              <w:cnfStyle w:val="000000000000" w:firstRow="0" w:lastRow="0" w:firstColumn="0" w:lastColumn="0" w:oddVBand="0" w:evenVBand="0" w:oddHBand="0" w:evenHBand="0" w:firstRowFirstColumn="0" w:firstRowLastColumn="0" w:lastRowFirstColumn="0" w:lastRowLastColumn="0"/>
-              <w:rPr>
-                <w:rFonts w:ascii="Courier New" w:eastAsia="Times New Roman" w:hAnsi="Courier New" w:cs="Courier New"/>
-                <w:color w:val="000000"/>
-                <w:kern w:val="0"/>
-                <w14:ligatures w14:val="none"/>
-              </w:rPr>
-            </w:pPr>
-            <w:r>
-              <w:rPr>
-                <w:rFonts w:ascii="Courier New" w:eastAsia="Times New Roman" w:hAnsi="Courier New" w:cs="Courier New"/>
-                <w:color w:val="000000"/>
-                <w:kern w:val="0"/>
-                <w14:ligatures w14:val="none"/>
-              </w:rPr>
-              <w:t>19</w:t>
+          </w:tcPr>
+          <w:p>
+            <w:pPr>
+              <w:jc w:val="center"/>
+              <w:cnfStyle w:val="000000000000" w:firstRow="0" w:lastRow="0" w:firstColumn="0" w:lastColumn="0" w:oddVBand="0" w:evenVBand="0" w:oddHBand="0" w:evenHBand="0" w:firstRowFirstColumn="0" w:firstRowLastColumn="0" w:lastRowFirstColumn="0" w:lastRowLastColumn="0"/>
+              <w:rPr>
+                <w:rFonts w:ascii="Courier New" w:eastAsia="Times New Roman" w:hAnsi="Courier New" w:cs="Courier New"/>
+                <w:b/>
+                <w:bCs/>
+                <w:color w:val="000000"/>
+                <w:kern w:val="0"/>
+                <w14:ligatures w14:val="none"/>
+              </w:rPr>
+            </w:pPr>
+            <w:r>
+              <w:rPr>
+                <w:rFonts w:ascii="Courier New" w:eastAsia="Times New Roman" w:hAnsi="Courier New" w:cs="Courier New"/>
+                <w:b/>
+                <w:bCs/>
+                <w:color w:val="000000"/>
+                <w:kern w:val="0"/>
+                <w14:ligatures w14:val="none"/>
+              </w:rPr>
+              <w:t>14</w:t>
             </w:r>
           </w:p>
         </w:tc>
@@ -5917,23 +6044,19 @@
             <w:pPr>
               <w:rPr>
                 <w:rFonts w:ascii="Courier New" w:eastAsia="Times New Roman" w:hAnsi="Courier New" w:cs="Courier New"/>
-                <w:b w:val="0"/>
-                <w:bCs w:val="0"/>
-                <w:color w:val="000000"/>
-                <w:kern w:val="0"/>
-                <w14:ligatures w14:val="none"/>
-              </w:rPr>
-            </w:pPr>
-            <w:r>
-              <w:rPr>
-                <w:rFonts w:ascii="Courier New" w:eastAsia="Times New Roman" w:hAnsi="Courier New" w:cs="Courier New"/>
-                <w:b w:val="0"/>
-                <w:bCs w:val="0"/>
-                <w:color w:val="000000"/>
-                <w:kern w:val="0"/>
-                <w14:ligatures w14:val="none"/>
-              </w:rPr>
-              <w:t>Tea set with Ash</w:t>
+                <w:color w:val="000000"/>
+                <w:kern w:val="0"/>
+                <w14:ligatures w14:val="none"/>
+              </w:rPr>
+            </w:pPr>
+            <w:r>
+              <w:rPr>
+                <w:rFonts w:ascii="Courier New" w:eastAsia="Times New Roman" w:hAnsi="Courier New" w:cs="Courier New"/>
+                <w:color w:val="000000"/>
+                <w:kern w:val="0"/>
+                <w14:ligatures w14:val="none"/>
+              </w:rPr>
+              <w:t>Doctor Nameplate</w:t>
             </w:r>
           </w:p>
         </w:tc>
@@ -5950,14 +6073,18 @@
               <w:cnfStyle w:val="000000100000" w:firstRow="0" w:lastRow="0" w:firstColumn="0" w:lastColumn="0" w:oddVBand="0" w:evenVBand="0" w:oddHBand="1" w:evenHBand="0" w:firstRowFirstColumn="0" w:firstRowLastColumn="0" w:lastRowFirstColumn="0" w:lastRowLastColumn="0"/>
               <w:rPr>
                 <w:rFonts w:ascii="Courier New" w:eastAsia="Times New Roman" w:hAnsi="Courier New" w:cs="Courier New"/>
-                <w:color w:val="000000"/>
-                <w:kern w:val="0"/>
-                <w14:ligatures w14:val="none"/>
-              </w:rPr>
-            </w:pPr>
-            <w:r>
-              <w:rPr>
-                <w:rFonts w:ascii="Courier New" w:eastAsia="Times New Roman" w:hAnsi="Courier New" w:cs="Courier New"/>
+                <w:b/>
+                <w:bCs/>
+                <w:color w:val="000000"/>
+                <w:kern w:val="0"/>
+                <w14:ligatures w14:val="none"/>
+              </w:rPr>
+            </w:pPr>
+            <w:r>
+              <w:rPr>
+                <w:rFonts w:ascii="Courier New" w:eastAsia="Times New Roman" w:hAnsi="Courier New" w:cs="Courier New"/>
+                <w:b/>
+                <w:bCs/>
                 <w:color w:val="000000"/>
                 <w:kern w:val="0"/>
                 <w14:ligatures w14:val="none"/>
@@ -5979,19 +6106,23 @@
               <w:cnfStyle w:val="000000100000" w:firstRow="0" w:lastRow="0" w:firstColumn="0" w:lastColumn="0" w:oddVBand="0" w:evenVBand="0" w:oddHBand="1" w:evenHBand="0" w:firstRowFirstColumn="0" w:firstRowLastColumn="0" w:lastRowFirstColumn="0" w:lastRowLastColumn="0"/>
               <w:rPr>
                 <w:rFonts w:ascii="Courier New" w:eastAsia="Times New Roman" w:hAnsi="Courier New" w:cs="Courier New"/>
-                <w:color w:val="000000"/>
-                <w:kern w:val="0"/>
-                <w14:ligatures w14:val="none"/>
-              </w:rPr>
-            </w:pPr>
-            <w:r>
-              <w:rPr>
-                <w:rFonts w:ascii="Courier New" w:eastAsia="Times New Roman" w:hAnsi="Courier New" w:cs="Courier New"/>
-                <w:color w:val="000000"/>
-                <w:kern w:val="0"/>
-                <w14:ligatures w14:val="none"/>
-              </w:rPr>
-              <w:t>19</w:t>
+                <w:b/>
+                <w:bCs/>
+                <w:color w:val="000000"/>
+                <w:kern w:val="0"/>
+                <w14:ligatures w14:val="none"/>
+              </w:rPr>
+            </w:pPr>
+            <w:r>
+              <w:rPr>
+                <w:rFonts w:ascii="Courier New" w:eastAsia="Times New Roman" w:hAnsi="Courier New" w:cs="Courier New"/>
+                <w:b/>
+                <w:bCs/>
+                <w:color w:val="000000"/>
+                <w:kern w:val="0"/>
+                <w14:ligatures w14:val="none"/>
+              </w:rPr>
+              <w:t>14</w:t>
             </w:r>
           </w:p>
         </w:tc>
@@ -6024,29 +6155,24 @@
             <w:tcW w:w="4405" w:type="dxa"/>
             <w:noWrap/>
             <w:vAlign w:val="center"/>
-            <w:hideMark/>
-          </w:tcPr>
-          <w:p>
-            <w:pPr>
-              <w:rPr>
-                <w:rFonts w:ascii="Courier New" w:eastAsia="Times New Roman" w:hAnsi="Courier New" w:cs="Courier New"/>
-                <w:b w:val="0"/>
-                <w:bCs w:val="0"/>
-                <w:color w:val="000000"/>
-                <w:kern w:val="0"/>
-                <w14:ligatures w14:val="none"/>
-              </w:rPr>
-            </w:pPr>
-            <w:r>
-              <w:rPr>
-                <w:rFonts w:ascii="Courier New" w:eastAsia="Times New Roman" w:hAnsi="Courier New" w:cs="Courier New"/>
-                <w:b w:val="0"/>
-                <w:bCs w:val="0"/>
-                <w:color w:val="000000"/>
-                <w:kern w:val="0"/>
-                <w14:ligatures w14:val="none"/>
-              </w:rPr>
-              <w:t>Long glass with soda, lime slice</w:t>
+          </w:tcPr>
+          <w:p>
+            <w:pPr>
+              <w:rPr>
+                <w:rFonts w:ascii="Courier New" w:eastAsia="Times New Roman" w:hAnsi="Courier New" w:cs="Courier New"/>
+                <w:color w:val="000000"/>
+                <w:kern w:val="0"/>
+                <w14:ligatures w14:val="none"/>
+              </w:rPr>
+            </w:pPr>
+            <w:r>
+              <w:rPr>
+                <w:rFonts w:ascii="Courier New" w:eastAsia="Times New Roman" w:hAnsi="Courier New" w:cs="Courier New"/>
+                <w:color w:val="000000"/>
+                <w:kern w:val="0"/>
+                <w14:ligatures w14:val="none"/>
+              </w:rPr>
+              <w:t>Lab Coat</w:t>
             </w:r>
           </w:p>
         </w:tc>
@@ -6055,22 +6181,25 @@
             <w:tcW w:w="1890" w:type="dxa"/>
             <w:noWrap/>
             <w:vAlign w:val="center"/>
-            <w:hideMark/>
-          </w:tcPr>
-          <w:p>
-            <w:pPr>
-              <w:jc w:val="center"/>
-              <w:cnfStyle w:val="000000000000" w:firstRow="0" w:lastRow="0" w:firstColumn="0" w:lastColumn="0" w:oddVBand="0" w:evenVBand="0" w:oddHBand="0" w:evenHBand="0" w:firstRowFirstColumn="0" w:firstRowLastColumn="0" w:lastRowFirstColumn="0" w:lastRowLastColumn="0"/>
-              <w:rPr>
-                <w:rFonts w:ascii="Courier New" w:eastAsia="Times New Roman" w:hAnsi="Courier New" w:cs="Courier New"/>
-                <w:color w:val="000000"/>
-                <w:kern w:val="0"/>
-                <w14:ligatures w14:val="none"/>
-              </w:rPr>
-            </w:pPr>
-            <w:r>
-              <w:rPr>
-                <w:rFonts w:ascii="Courier New" w:eastAsia="Times New Roman" w:hAnsi="Courier New" w:cs="Courier New"/>
+          </w:tcPr>
+          <w:p>
+            <w:pPr>
+              <w:jc w:val="center"/>
+              <w:cnfStyle w:val="000000000000" w:firstRow="0" w:lastRow="0" w:firstColumn="0" w:lastColumn="0" w:oddVBand="0" w:evenVBand="0" w:oddHBand="0" w:evenHBand="0" w:firstRowFirstColumn="0" w:firstRowLastColumn="0" w:lastRowFirstColumn="0" w:lastRowLastColumn="0"/>
+              <w:rPr>
+                <w:rFonts w:ascii="Courier New" w:eastAsia="Times New Roman" w:hAnsi="Courier New" w:cs="Courier New"/>
+                <w:b/>
+                <w:bCs/>
+                <w:color w:val="000000"/>
+                <w:kern w:val="0"/>
+                <w14:ligatures w14:val="none"/>
+              </w:rPr>
+            </w:pPr>
+            <w:r>
+              <w:rPr>
+                <w:rFonts w:ascii="Courier New" w:eastAsia="Times New Roman" w:hAnsi="Courier New" w:cs="Courier New"/>
+                <w:b/>
+                <w:bCs/>
                 <w:color w:val="000000"/>
                 <w:kern w:val="0"/>
                 <w14:ligatures w14:val="none"/>
@@ -6084,27 +6213,30 @@
             <w:tcW w:w="3268" w:type="dxa"/>
             <w:noWrap/>
             <w:vAlign w:val="center"/>
-            <w:hideMark/>
-          </w:tcPr>
-          <w:p>
-            <w:pPr>
-              <w:jc w:val="center"/>
-              <w:cnfStyle w:val="000000000000" w:firstRow="0" w:lastRow="0" w:firstColumn="0" w:lastColumn="0" w:oddVBand="0" w:evenVBand="0" w:oddHBand="0" w:evenHBand="0" w:firstRowFirstColumn="0" w:firstRowLastColumn="0" w:lastRowFirstColumn="0" w:lastRowLastColumn="0"/>
-              <w:rPr>
-                <w:rFonts w:ascii="Courier New" w:eastAsia="Times New Roman" w:hAnsi="Courier New" w:cs="Courier New"/>
-                <w:color w:val="000000"/>
-                <w:kern w:val="0"/>
-                <w14:ligatures w14:val="none"/>
-              </w:rPr>
-            </w:pPr>
-            <w:r>
-              <w:rPr>
-                <w:rFonts w:ascii="Courier New" w:eastAsia="Times New Roman" w:hAnsi="Courier New" w:cs="Courier New"/>
-                <w:color w:val="000000"/>
-                <w:kern w:val="0"/>
-                <w14:ligatures w14:val="none"/>
-              </w:rPr>
-              <w:t>19</w:t>
+          </w:tcPr>
+          <w:p>
+            <w:pPr>
+              <w:jc w:val="center"/>
+              <w:cnfStyle w:val="000000000000" w:firstRow="0" w:lastRow="0" w:firstColumn="0" w:lastColumn="0" w:oddVBand="0" w:evenVBand="0" w:oddHBand="0" w:evenHBand="0" w:firstRowFirstColumn="0" w:firstRowLastColumn="0" w:lastRowFirstColumn="0" w:lastRowLastColumn="0"/>
+              <w:rPr>
+                <w:rFonts w:ascii="Courier New" w:eastAsia="Times New Roman" w:hAnsi="Courier New" w:cs="Courier New"/>
+                <w:b/>
+                <w:bCs/>
+                <w:color w:val="000000"/>
+                <w:kern w:val="0"/>
+                <w14:ligatures w14:val="none"/>
+              </w:rPr>
+            </w:pPr>
+            <w:r>
+              <w:rPr>
+                <w:rFonts w:ascii="Courier New" w:eastAsia="Times New Roman" w:hAnsi="Courier New" w:cs="Courier New"/>
+                <w:b/>
+                <w:bCs/>
+                <w:color w:val="000000"/>
+                <w:kern w:val="0"/>
+                <w14:ligatures w14:val="none"/>
+              </w:rPr>
+              <w:t>14</w:t>
             </w:r>
           </w:p>
         </w:tc>
@@ -6144,23 +6276,19 @@
             <w:pPr>
               <w:rPr>
                 <w:rFonts w:ascii="Courier New" w:eastAsia="Times New Roman" w:hAnsi="Courier New" w:cs="Courier New"/>
-                <w:b w:val="0"/>
-                <w:bCs w:val="0"/>
-                <w:color w:val="000000"/>
-                <w:kern w:val="0"/>
-                <w14:ligatures w14:val="none"/>
-              </w:rPr>
-            </w:pPr>
-            <w:r>
-              <w:rPr>
-                <w:rFonts w:ascii="Courier New" w:eastAsia="Times New Roman" w:hAnsi="Courier New" w:cs="Courier New"/>
-                <w:b w:val="0"/>
-                <w:bCs w:val="0"/>
-                <w:color w:val="000000"/>
-                <w:kern w:val="0"/>
-                <w14:ligatures w14:val="none"/>
-              </w:rPr>
-              <w:t>Sand</w:t>
+                <w:color w:val="000000"/>
+                <w:kern w:val="0"/>
+                <w14:ligatures w14:val="none"/>
+              </w:rPr>
+            </w:pPr>
+            <w:r>
+              <w:rPr>
+                <w:rFonts w:ascii="Courier New" w:eastAsia="Times New Roman" w:hAnsi="Courier New" w:cs="Courier New"/>
+                <w:color w:val="000000"/>
+                <w:kern w:val="0"/>
+                <w14:ligatures w14:val="none"/>
+              </w:rPr>
+              <w:t>Television</w:t>
             </w:r>
           </w:p>
         </w:tc>
@@ -6206,19 +6334,23 @@
               <w:cnfStyle w:val="000000100000" w:firstRow="0" w:lastRow="0" w:firstColumn="0" w:lastColumn="0" w:oddVBand="0" w:evenVBand="0" w:oddHBand="1" w:evenHBand="0" w:firstRowFirstColumn="0" w:firstRowLastColumn="0" w:lastRowFirstColumn="0" w:lastRowLastColumn="0"/>
               <w:rPr>
                 <w:rFonts w:ascii="Courier New" w:eastAsia="Times New Roman" w:hAnsi="Courier New" w:cs="Courier New"/>
-                <w:color w:val="000000"/>
-                <w:kern w:val="0"/>
-                <w14:ligatures w14:val="none"/>
-              </w:rPr>
-            </w:pPr>
-            <w:r>
-              <w:rPr>
-                <w:rFonts w:ascii="Courier New" w:eastAsia="Times New Roman" w:hAnsi="Courier New" w:cs="Courier New"/>
-                <w:color w:val="000000"/>
-                <w:kern w:val="0"/>
-                <w14:ligatures w14:val="none"/>
-              </w:rPr>
-              <w:t>19</w:t>
+                <w:b/>
+                <w:bCs/>
+                <w:color w:val="000000"/>
+                <w:kern w:val="0"/>
+                <w14:ligatures w14:val="none"/>
+              </w:rPr>
+            </w:pPr>
+            <w:r>
+              <w:rPr>
+                <w:rFonts w:ascii="Courier New" w:eastAsia="Times New Roman" w:hAnsi="Courier New" w:cs="Courier New"/>
+                <w:b/>
+                <w:bCs/>
+                <w:color w:val="000000"/>
+                <w:kern w:val="0"/>
+                <w14:ligatures w14:val="none"/>
+              </w:rPr>
+              <w:t>16</w:t>
             </w:r>
           </w:p>
         </w:tc>
@@ -6251,29 +6383,24 @@
             <w:tcW w:w="4405" w:type="dxa"/>
             <w:noWrap/>
             <w:vAlign w:val="center"/>
-            <w:hideMark/>
-          </w:tcPr>
-          <w:p>
-            <w:pPr>
-              <w:rPr>
-                <w:rFonts w:ascii="Courier New" w:eastAsia="Times New Roman" w:hAnsi="Courier New" w:cs="Courier New"/>
-                <w:b w:val="0"/>
-                <w:bCs w:val="0"/>
-                <w:color w:val="000000"/>
-                <w:kern w:val="0"/>
-                <w14:ligatures w14:val="none"/>
-              </w:rPr>
-            </w:pPr>
-            <w:r>
-              <w:rPr>
-                <w:rFonts w:ascii="Courier New" w:eastAsia="Times New Roman" w:hAnsi="Courier New" w:cs="Courier New"/>
-                <w:b w:val="0"/>
-                <w:bCs w:val="0"/>
-                <w:color w:val="000000"/>
-                <w:kern w:val="0"/>
-                <w14:ligatures w14:val="none"/>
-              </w:rPr>
-              <w:t>Vase with flower</w:t>
+          </w:tcPr>
+          <w:p>
+            <w:pPr>
+              <w:rPr>
+                <w:rFonts w:ascii="Courier New" w:eastAsia="Times New Roman" w:hAnsi="Courier New" w:cs="Courier New"/>
+                <w:color w:val="000000"/>
+                <w:kern w:val="0"/>
+                <w14:ligatures w14:val="none"/>
+              </w:rPr>
+            </w:pPr>
+            <w:r>
+              <w:rPr>
+                <w:rFonts w:ascii="Courier New" w:eastAsia="Times New Roman" w:hAnsi="Courier New" w:cs="Courier New"/>
+                <w:color w:val="000000"/>
+                <w:kern w:val="0"/>
+                <w14:ligatures w14:val="none"/>
+              </w:rPr>
+              <w:t>House/ Face Paining</w:t>
             </w:r>
           </w:p>
         </w:tc>
@@ -6282,7 +6409,6 @@
             <w:tcW w:w="1890" w:type="dxa"/>
             <w:noWrap/>
             <w:vAlign w:val="center"/>
-            <w:hideMark/>
           </w:tcPr>
           <w:p>
             <w:pPr>
@@ -6311,27 +6437,30 @@
             <w:tcW w:w="3268" w:type="dxa"/>
             <w:noWrap/>
             <w:vAlign w:val="center"/>
-            <w:hideMark/>
-          </w:tcPr>
-          <w:p>
-            <w:pPr>
-              <w:jc w:val="center"/>
-              <w:cnfStyle w:val="000000000000" w:firstRow="0" w:lastRow="0" w:firstColumn="0" w:lastColumn="0" w:oddVBand="0" w:evenVBand="0" w:oddHBand="0" w:evenHBand="0" w:firstRowFirstColumn="0" w:firstRowLastColumn="0" w:lastRowFirstColumn="0" w:lastRowLastColumn="0"/>
-              <w:rPr>
-                <w:rFonts w:ascii="Courier New" w:eastAsia="Times New Roman" w:hAnsi="Courier New" w:cs="Courier New"/>
-                <w:color w:val="000000"/>
-                <w:kern w:val="0"/>
-                <w14:ligatures w14:val="none"/>
-              </w:rPr>
-            </w:pPr>
-            <w:r>
-              <w:rPr>
-                <w:rFonts w:ascii="Courier New" w:eastAsia="Times New Roman" w:hAnsi="Courier New" w:cs="Courier New"/>
-                <w:color w:val="000000"/>
-                <w:kern w:val="0"/>
-                <w14:ligatures w14:val="none"/>
-              </w:rPr>
-              <w:t>19</w:t>
+          </w:tcPr>
+          <w:p>
+            <w:pPr>
+              <w:jc w:val="center"/>
+              <w:cnfStyle w:val="000000000000" w:firstRow="0" w:lastRow="0" w:firstColumn="0" w:lastColumn="0" w:oddVBand="0" w:evenVBand="0" w:oddHBand="0" w:evenHBand="0" w:firstRowFirstColumn="0" w:firstRowLastColumn="0" w:lastRowFirstColumn="0" w:lastRowLastColumn="0"/>
+              <w:rPr>
+                <w:rFonts w:ascii="Courier New" w:eastAsia="Times New Roman" w:hAnsi="Courier New" w:cs="Courier New"/>
+                <w:b/>
+                <w:bCs/>
+                <w:color w:val="000000"/>
+                <w:kern w:val="0"/>
+                <w14:ligatures w14:val="none"/>
+              </w:rPr>
+            </w:pPr>
+            <w:r>
+              <w:rPr>
+                <w:rFonts w:ascii="Courier New" w:eastAsia="Times New Roman" w:hAnsi="Courier New" w:cs="Courier New"/>
+                <w:b/>
+                <w:bCs/>
+                <w:color w:val="000000"/>
+                <w:kern w:val="0"/>
+                <w14:ligatures w14:val="none"/>
+              </w:rPr>
+              <w:t>16</w:t>
             </w:r>
           </w:p>
         </w:tc>
@@ -6365,29 +6494,51 @@
             <w:tcW w:w="4405" w:type="dxa"/>
             <w:noWrap/>
             <w:vAlign w:val="center"/>
-            <w:hideMark/>
-          </w:tcPr>
-          <w:p>
-            <w:pPr>
-              <w:rPr>
-                <w:rFonts w:ascii="Courier New" w:eastAsia="Times New Roman" w:hAnsi="Courier New" w:cs="Courier New"/>
-                <w:b w:val="0"/>
-                <w:bCs w:val="0"/>
-                <w:color w:val="000000"/>
-                <w:kern w:val="0"/>
-                <w14:ligatures w14:val="none"/>
-              </w:rPr>
-            </w:pPr>
-            <w:r>
-              <w:rPr>
-                <w:rFonts w:ascii="Courier New" w:eastAsia="Times New Roman" w:hAnsi="Courier New" w:cs="Courier New"/>
-                <w:b w:val="0"/>
-                <w:bCs w:val="0"/>
-                <w:color w:val="000000"/>
-                <w:kern w:val="0"/>
-                <w14:ligatures w14:val="none"/>
-              </w:rPr>
-              <w:t>Puffed Rice</w:t>
+          </w:tcPr>
+          <w:p>
+            <w:pPr>
+              <w:rPr>
+                <w:rFonts w:ascii="Courier New" w:eastAsia="Times New Roman" w:hAnsi="Courier New" w:cs="Courier New"/>
+                <w:color w:val="000000"/>
+                <w:kern w:val="0"/>
+                <w14:ligatures w14:val="none"/>
+              </w:rPr>
+            </w:pPr>
+            <w:r>
+              <w:rPr>
+                <w:rFonts w:ascii="Courier New" w:eastAsia="Times New Roman" w:hAnsi="Courier New" w:cs="Courier New"/>
+                <w:color w:val="000000"/>
+                <w:kern w:val="0"/>
+                <w14:ligatures w14:val="none"/>
+              </w:rPr>
+              <w:t>Match box</w:t>
+            </w:r>
+            <w:r>
+              <w:rPr>
+                <w:rFonts w:ascii="Courier New" w:eastAsia="Times New Roman" w:hAnsi="Courier New" w:cs="Courier New"/>
+                <w:color w:val="000000"/>
+                <w:kern w:val="0"/>
+                <w14:ligatures w14:val="none"/>
+              </w:rPr>
+              <w:t xml:space="preserve">, </w:t>
+            </w:r>
+            <w:r>
+              <w:rPr>
+                <w:rFonts w:ascii="Courier New" w:eastAsia="Times New Roman" w:hAnsi="Courier New" w:cs="Courier New"/>
+                <w:color w:val="000000"/>
+                <w:kern w:val="0"/>
+                <w14:ligatures w14:val="none"/>
+              </w:rPr>
+              <w:t>L</w:t>
+            </w:r>
+            <w:r>
+              <w:rPr>
+                <w:rFonts w:ascii="Courier New" w:eastAsia="Times New Roman" w:hAnsi="Courier New" w:cs="Courier New"/>
+                <w:color w:val="000000"/>
+                <w:kern w:val="0"/>
+                <w14:ligatures w14:val="none"/>
+              </w:rPr>
+              <w:t>amps, Kumkum</w:t>
             </w:r>
           </w:p>
         </w:tc>
@@ -6396,7 +6547,6 @@
             <w:tcW w:w="1890" w:type="dxa"/>
             <w:noWrap/>
             <w:vAlign w:val="center"/>
-            <w:hideMark/>
           </w:tcPr>
           <w:p>
             <w:pPr>
@@ -6425,27 +6575,30 @@
             <w:tcW w:w="3268" w:type="dxa"/>
             <w:noWrap/>
             <w:vAlign w:val="center"/>
-            <w:hideMark/>
-          </w:tcPr>
-          <w:p>
-            <w:pPr>
-              <w:jc w:val="center"/>
-              <w:cnfStyle w:val="000000100000" w:firstRow="0" w:lastRow="0" w:firstColumn="0" w:lastColumn="0" w:oddVBand="0" w:evenVBand="0" w:oddHBand="1" w:evenHBand="0" w:firstRowFirstColumn="0" w:firstRowLastColumn="0" w:lastRowFirstColumn="0" w:lastRowLastColumn="0"/>
-              <w:rPr>
-                <w:rFonts w:ascii="Courier New" w:eastAsia="Times New Roman" w:hAnsi="Courier New" w:cs="Courier New"/>
-                <w:color w:val="000000"/>
-                <w:kern w:val="0"/>
-                <w14:ligatures w14:val="none"/>
-              </w:rPr>
-            </w:pPr>
-            <w:r>
-              <w:rPr>
-                <w:rFonts w:ascii="Courier New" w:eastAsia="Times New Roman" w:hAnsi="Courier New" w:cs="Courier New"/>
-                <w:color w:val="000000"/>
-                <w:kern w:val="0"/>
-                <w14:ligatures w14:val="none"/>
-              </w:rPr>
-              <w:t>19</w:t>
+          </w:tcPr>
+          <w:p>
+            <w:pPr>
+              <w:jc w:val="center"/>
+              <w:cnfStyle w:val="000000100000" w:firstRow="0" w:lastRow="0" w:firstColumn="0" w:lastColumn="0" w:oddVBand="0" w:evenVBand="0" w:oddHBand="1" w:evenHBand="0" w:firstRowFirstColumn="0" w:firstRowLastColumn="0" w:lastRowFirstColumn="0" w:lastRowLastColumn="0"/>
+              <w:rPr>
+                <w:rFonts w:ascii="Courier New" w:eastAsia="Times New Roman" w:hAnsi="Courier New" w:cs="Courier New"/>
+                <w:b/>
+                <w:bCs/>
+                <w:color w:val="000000"/>
+                <w:kern w:val="0"/>
+                <w14:ligatures w14:val="none"/>
+              </w:rPr>
+            </w:pPr>
+            <w:r>
+              <w:rPr>
+                <w:rFonts w:ascii="Courier New" w:eastAsia="Times New Roman" w:hAnsi="Courier New" w:cs="Courier New"/>
+                <w:b/>
+                <w:bCs/>
+                <w:color w:val="000000"/>
+                <w:kern w:val="0"/>
+                <w14:ligatures w14:val="none"/>
+              </w:rPr>
+              <w:t>18</w:t>
             </w:r>
           </w:p>
         </w:tc>
@@ -6484,23 +6637,28 @@
             <w:pPr>
               <w:rPr>
                 <w:rFonts w:ascii="Courier New" w:eastAsia="Times New Roman" w:hAnsi="Courier New" w:cs="Courier New"/>
-                <w:b w:val="0"/>
-                <w:bCs w:val="0"/>
-                <w:color w:val="000000"/>
-                <w:kern w:val="0"/>
-                <w14:ligatures w14:val="none"/>
-              </w:rPr>
-            </w:pPr>
-            <w:r>
-              <w:rPr>
-                <w:rFonts w:ascii="Courier New" w:eastAsia="Times New Roman" w:hAnsi="Courier New" w:cs="Courier New"/>
-                <w:b w:val="0"/>
-                <w:bCs w:val="0"/>
-                <w:color w:val="000000"/>
-                <w:kern w:val="0"/>
-                <w14:ligatures w14:val="none"/>
-              </w:rPr>
-              <w:t>Black Pebbles</w:t>
+                <w:color w:val="000000"/>
+                <w:kern w:val="0"/>
+                <w14:ligatures w14:val="none"/>
+              </w:rPr>
+            </w:pPr>
+            <w:r>
+              <w:rPr>
+                <w:rFonts w:ascii="Courier New" w:eastAsia="Times New Roman" w:hAnsi="Courier New" w:cs="Courier New"/>
+                <w:color w:val="000000"/>
+                <w:kern w:val="0"/>
+                <w14:ligatures w14:val="none"/>
+              </w:rPr>
+              <w:t>Book</w:t>
+            </w:r>
+            <w:r>
+              <w:rPr>
+                <w:rFonts w:ascii="Courier New" w:eastAsia="Times New Roman" w:hAnsi="Courier New" w:cs="Courier New"/>
+                <w:color w:val="000000"/>
+                <w:kern w:val="0"/>
+                <w14:ligatures w14:val="none"/>
+              </w:rPr>
+              <w:t xml:space="preserve"> on shelf</w:t>
             </w:r>
           </w:p>
         </w:tc>
@@ -6546,19 +6704,23 @@
               <w:cnfStyle w:val="000000000000" w:firstRow="0" w:lastRow="0" w:firstColumn="0" w:lastColumn="0" w:oddVBand="0" w:evenVBand="0" w:oddHBand="0" w:evenHBand="0" w:firstRowFirstColumn="0" w:firstRowLastColumn="0" w:lastRowFirstColumn="0" w:lastRowLastColumn="0"/>
               <w:rPr>
                 <w:rFonts w:ascii="Courier New" w:eastAsia="Times New Roman" w:hAnsi="Courier New" w:cs="Courier New"/>
-                <w:color w:val="000000"/>
-                <w:kern w:val="0"/>
-                <w14:ligatures w14:val="none"/>
-              </w:rPr>
-            </w:pPr>
-            <w:r>
-              <w:rPr>
-                <w:rFonts w:ascii="Courier New" w:eastAsia="Times New Roman" w:hAnsi="Courier New" w:cs="Courier New"/>
-                <w:color w:val="000000"/>
-                <w:kern w:val="0"/>
-                <w14:ligatures w14:val="none"/>
-              </w:rPr>
-              <w:t>20</w:t>
+                <w:b/>
+                <w:bCs/>
+                <w:color w:val="000000"/>
+                <w:kern w:val="0"/>
+                <w14:ligatures w14:val="none"/>
+              </w:rPr>
+            </w:pPr>
+            <w:r>
+              <w:rPr>
+                <w:rFonts w:ascii="Courier New" w:eastAsia="Times New Roman" w:hAnsi="Courier New" w:cs="Courier New"/>
+                <w:b/>
+                <w:bCs/>
+                <w:color w:val="000000"/>
+                <w:kern w:val="0"/>
+                <w14:ligatures w14:val="none"/>
+              </w:rPr>
+              <w:t>18</w:t>
             </w:r>
           </w:p>
         </w:tc>
@@ -6592,29 +6754,24 @@
             <w:tcW w:w="4405" w:type="dxa"/>
             <w:noWrap/>
             <w:vAlign w:val="center"/>
-            <w:hideMark/>
-          </w:tcPr>
-          <w:p>
-            <w:pPr>
-              <w:rPr>
-                <w:rFonts w:ascii="Courier New" w:eastAsia="Times New Roman" w:hAnsi="Courier New" w:cs="Courier New"/>
-                <w:b w:val="0"/>
-                <w:bCs w:val="0"/>
-                <w:color w:val="000000"/>
-                <w:kern w:val="0"/>
-                <w14:ligatures w14:val="none"/>
-              </w:rPr>
-            </w:pPr>
-            <w:r>
-              <w:rPr>
-                <w:rFonts w:ascii="Courier New" w:eastAsia="Times New Roman" w:hAnsi="Courier New" w:cs="Courier New"/>
-                <w:b w:val="0"/>
-                <w:bCs w:val="0"/>
-                <w:color w:val="000000"/>
-                <w:kern w:val="0"/>
-                <w14:ligatures w14:val="none"/>
-              </w:rPr>
-              <w:t>Tender Coconut</w:t>
+          </w:tcPr>
+          <w:p>
+            <w:pPr>
+              <w:rPr>
+                <w:rFonts w:ascii="Courier New" w:eastAsia="Times New Roman" w:hAnsi="Courier New" w:cs="Courier New"/>
+                <w:color w:val="000000"/>
+                <w:kern w:val="0"/>
+                <w14:ligatures w14:val="none"/>
+              </w:rPr>
+            </w:pPr>
+            <w:r>
+              <w:rPr>
+                <w:rFonts w:ascii="Courier New" w:eastAsia="Times New Roman" w:hAnsi="Courier New" w:cs="Courier New"/>
+                <w:color w:val="000000"/>
+                <w:kern w:val="0"/>
+                <w14:ligatures w14:val="none"/>
+              </w:rPr>
+              <w:t>Flashlight</w:t>
             </w:r>
           </w:p>
         </w:tc>
@@ -6623,7 +6780,6 @@
             <w:tcW w:w="1890" w:type="dxa"/>
             <w:noWrap/>
             <w:vAlign w:val="center"/>
-            <w:hideMark/>
           </w:tcPr>
           <w:p>
             <w:pPr>
@@ -6652,22 +6808,25 @@
             <w:tcW w:w="3268" w:type="dxa"/>
             <w:noWrap/>
             <w:vAlign w:val="center"/>
-            <w:hideMark/>
-          </w:tcPr>
-          <w:p>
-            <w:pPr>
-              <w:jc w:val="center"/>
-              <w:cnfStyle w:val="000000100000" w:firstRow="0" w:lastRow="0" w:firstColumn="0" w:lastColumn="0" w:oddVBand="0" w:evenVBand="0" w:oddHBand="1" w:evenHBand="0" w:firstRowFirstColumn="0" w:firstRowLastColumn="0" w:lastRowFirstColumn="0" w:lastRowLastColumn="0"/>
-              <w:rPr>
-                <w:rFonts w:ascii="Courier New" w:eastAsia="Times New Roman" w:hAnsi="Courier New" w:cs="Courier New"/>
-                <w:color w:val="000000"/>
-                <w:kern w:val="0"/>
-                <w14:ligatures w14:val="none"/>
-              </w:rPr>
-            </w:pPr>
-            <w:r>
-              <w:rPr>
-                <w:rFonts w:ascii="Courier New" w:eastAsia="Times New Roman" w:hAnsi="Courier New" w:cs="Courier New"/>
+          </w:tcPr>
+          <w:p>
+            <w:pPr>
+              <w:jc w:val="center"/>
+              <w:cnfStyle w:val="000000100000" w:firstRow="0" w:lastRow="0" w:firstColumn="0" w:lastColumn="0" w:oddVBand="0" w:evenVBand="0" w:oddHBand="1" w:evenHBand="0" w:firstRowFirstColumn="0" w:firstRowLastColumn="0" w:lastRowFirstColumn="0" w:lastRowLastColumn="0"/>
+              <w:rPr>
+                <w:rFonts w:ascii="Courier New" w:eastAsia="Times New Roman" w:hAnsi="Courier New" w:cs="Courier New"/>
+                <w:b/>
+                <w:bCs/>
+                <w:color w:val="000000"/>
+                <w:kern w:val="0"/>
+                <w14:ligatures w14:val="none"/>
+              </w:rPr>
+            </w:pPr>
+            <w:r>
+              <w:rPr>
+                <w:rFonts w:ascii="Courier New" w:eastAsia="Times New Roman" w:hAnsi="Courier New" w:cs="Courier New"/>
+                <w:b/>
+                <w:bCs/>
                 <w:color w:val="000000"/>
                 <w:kern w:val="0"/>
                 <w14:ligatures w14:val="none"/>
@@ -6727,7 +6886,7 @@
                 <w:kern w:val="0"/>
                 <w14:ligatures w14:val="none"/>
               </w:rPr>
-              <w:t>Whiskey Bottle</w:t>
+              <w:t>Kettle</w:t>
             </w:r>
           </w:p>
         </w:tc>
@@ -6785,7 +6944,7 @@
                 <w:kern w:val="0"/>
                 <w14:ligatures w14:val="none"/>
               </w:rPr>
-              <w:t>20</w:t>
+              <w:t>19</w:t>
             </w:r>
           </w:p>
         </w:tc>
@@ -6841,7 +7000,7 @@
                 <w:kern w:val="0"/>
                 <w14:ligatures w14:val="none"/>
               </w:rPr>
-              <w:t>Smoke creator</w:t>
+              <w:t>Tea set with Ash</w:t>
             </w:r>
           </w:p>
         </w:tc>
@@ -6899,7 +7058,7 @@
                 <w:kern w:val="0"/>
                 <w14:ligatures w14:val="none"/>
               </w:rPr>
-              <w:t>20</w:t>
+              <w:t>19</w:t>
             </w:r>
           </w:p>
         </w:tc>
@@ -6954,7 +7113,7 @@
                 <w:kern w:val="0"/>
                 <w14:ligatures w14:val="none"/>
               </w:rPr>
-              <w:t>An old TV</w:t>
+              <w:t>Long glass with soda, lime slice</w:t>
             </w:r>
           </w:p>
         </w:tc>
@@ -7012,7 +7171,7 @@
                 <w:kern w:val="0"/>
                 <w14:ligatures w14:val="none"/>
               </w:rPr>
-              <w:t>22</w:t>
+              <w:t>19</w:t>
             </w:r>
           </w:p>
         </w:tc>
@@ -7068,7 +7227,7 @@
                 <w:kern w:val="0"/>
                 <w14:ligatures w14:val="none"/>
               </w:rPr>
-              <w:t>Half-burnt doobie</w:t>
+              <w:t>Sand</w:t>
             </w:r>
           </w:p>
         </w:tc>
@@ -7126,7 +7285,7 @@
                 <w:kern w:val="0"/>
                 <w14:ligatures w14:val="none"/>
               </w:rPr>
-              <w:t>22</w:t>
+              <w:t>19</w:t>
             </w:r>
           </w:p>
         </w:tc>
@@ -7181,7 +7340,7 @@
                 <w:kern w:val="0"/>
                 <w14:ligatures w14:val="none"/>
               </w:rPr>
-              <w:t>TV remote</w:t>
+              <w:t>Vase with flower</w:t>
             </w:r>
           </w:p>
         </w:tc>
@@ -7239,7 +7398,7 @@
                 <w:kern w:val="0"/>
                 <w14:ligatures w14:val="none"/>
               </w:rPr>
-              <w:t>22</w:t>
+              <w:t>19</w:t>
             </w:r>
           </w:p>
         </w:tc>
@@ -7295,7 +7454,7 @@
                 <w:kern w:val="0"/>
                 <w14:ligatures w14:val="none"/>
               </w:rPr>
-              <w:t>TV Plug on the wall to pull out</w:t>
+              <w:t>Puffed Rice</w:t>
             </w:r>
           </w:p>
         </w:tc>
@@ -7353,7 +7512,7 @@
                 <w:kern w:val="0"/>
                 <w14:ligatures w14:val="none"/>
               </w:rPr>
-              <w:t>22</w:t>
+              <w:t>19</w:t>
             </w:r>
           </w:p>
         </w:tc>
@@ -7408,7 +7567,7 @@
                 <w:kern w:val="0"/>
                 <w14:ligatures w14:val="none"/>
               </w:rPr>
-              <w:t>2 Red Balloon with thread</w:t>
+              <w:t>Black Pebbles</w:t>
             </w:r>
           </w:p>
         </w:tc>
@@ -7437,7 +7596,7 @@
                 <w:kern w:val="0"/>
                 <w14:ligatures w14:val="none"/>
               </w:rPr>
-              <w:t>3</w:t>
+              <w:t>1</w:t>
             </w:r>
           </w:p>
         </w:tc>
@@ -7466,7 +7625,7 @@
                 <w:kern w:val="0"/>
                 <w14:ligatures w14:val="none"/>
               </w:rPr>
-              <w:t>22</w:t>
+              <w:t>20</w:t>
             </w:r>
           </w:p>
         </w:tc>
@@ -7523,7 +7682,7 @@
                 <w14:ligatures w14:val="none"/>
               </w:rPr>
               <w:lastRenderedPageBreak/>
-              <w:t>Wheelchair</w:t>
+              <w:t>Tender Coconut</w:t>
             </w:r>
           </w:p>
         </w:tc>
@@ -7581,7 +7740,7 @@
                 <w:kern w:val="0"/>
                 <w14:ligatures w14:val="none"/>
               </w:rPr>
-              <w:t>23</w:t>
+              <w:t>20</w:t>
             </w:r>
           </w:p>
         </w:tc>
@@ -7636,7 +7795,7 @@
                 <w:kern w:val="0"/>
                 <w14:ligatures w14:val="none"/>
               </w:rPr>
-              <w:t>Blue spotlight</w:t>
+              <w:t>Whiskey Bottle</w:t>
             </w:r>
           </w:p>
         </w:tc>
@@ -7694,7 +7853,7 @@
                 <w:kern w:val="0"/>
                 <w14:ligatures w14:val="none"/>
               </w:rPr>
-              <w:t>24</w:t>
+              <w:t>20</w:t>
             </w:r>
           </w:p>
         </w:tc>
@@ -7750,7 +7909,7 @@
                 <w:kern w:val="0"/>
                 <w14:ligatures w14:val="none"/>
               </w:rPr>
-              <w:t>Fog machine</w:t>
+              <w:t>Smoke creator</w:t>
             </w:r>
           </w:p>
         </w:tc>
@@ -7808,7 +7967,7 @@
                 <w:kern w:val="0"/>
                 <w14:ligatures w14:val="none"/>
               </w:rPr>
-              <w:t>24</w:t>
+              <w:t>20</w:t>
             </w:r>
           </w:p>
         </w:tc>
@@ -7863,7 +8022,7 @@
                 <w:kern w:val="0"/>
                 <w14:ligatures w14:val="none"/>
               </w:rPr>
-              <w:t>Envelope with funeral card</w:t>
+              <w:t>An old TV</w:t>
             </w:r>
           </w:p>
         </w:tc>
@@ -7921,7 +8080,7 @@
                 <w:kern w:val="0"/>
                 <w14:ligatures w14:val="none"/>
               </w:rPr>
-              <w:t>24</w:t>
+              <w:t>22</w:t>
             </w:r>
           </w:p>
         </w:tc>
@@ -7977,7 +8136,7 @@
                 <w:kern w:val="0"/>
                 <w14:ligatures w14:val="none"/>
               </w:rPr>
-              <w:t>Pyre</w:t>
+              <w:t>Half-burnt doobie</w:t>
             </w:r>
           </w:p>
         </w:tc>
@@ -8035,7 +8194,7 @@
                 <w:kern w:val="0"/>
                 <w14:ligatures w14:val="none"/>
               </w:rPr>
-              <w:t>24</w:t>
+              <w:t>22</w:t>
             </w:r>
           </w:p>
         </w:tc>
@@ -8090,7 +8249,7 @@
                 <w:kern w:val="0"/>
                 <w14:ligatures w14:val="none"/>
               </w:rPr>
-              <w:t>Bhasma</w:t>
+              <w:t>TV remote</w:t>
             </w:r>
           </w:p>
         </w:tc>
@@ -8148,7 +8307,7 @@
                 <w:kern w:val="0"/>
                 <w14:ligatures w14:val="none"/>
               </w:rPr>
-              <w:t>24</w:t>
+              <w:t>22</w:t>
             </w:r>
           </w:p>
         </w:tc>
@@ -8204,7 +8363,7 @@
                 <w:kern w:val="0"/>
                 <w14:ligatures w14:val="none"/>
               </w:rPr>
-              <w:t>Mailbox</w:t>
+              <w:t>TV Plug on the wall to pull out</w:t>
             </w:r>
           </w:p>
         </w:tc>
@@ -8262,7 +8421,7 @@
                 <w:kern w:val="0"/>
                 <w14:ligatures w14:val="none"/>
               </w:rPr>
-              <w:t>24</w:t>
+              <w:t>22</w:t>
             </w:r>
           </w:p>
         </w:tc>
@@ -8317,7 +8476,7 @@
                 <w:kern w:val="0"/>
                 <w14:ligatures w14:val="none"/>
               </w:rPr>
-              <w:t>Black Sesame Seeds</w:t>
+              <w:t>2 Red Balloon with thread</w:t>
             </w:r>
           </w:p>
         </w:tc>
@@ -8346,7 +8505,7 @@
                 <w:kern w:val="0"/>
                 <w14:ligatures w14:val="none"/>
               </w:rPr>
-              <w:t>1</w:t>
+              <w:t>3</w:t>
             </w:r>
           </w:p>
         </w:tc>
@@ -8375,7 +8534,7 @@
                 <w:kern w:val="0"/>
                 <w14:ligatures w14:val="none"/>
               </w:rPr>
-              <w:t>25</w:t>
+              <w:t>22</w:t>
             </w:r>
           </w:p>
         </w:tc>
@@ -8431,7 +8590,7 @@
                 <w:kern w:val="0"/>
                 <w14:ligatures w14:val="none"/>
               </w:rPr>
-              <w:t>Pinda</w:t>
+              <w:t>Wheelchair</w:t>
             </w:r>
           </w:p>
         </w:tc>
@@ -8489,7 +8648,7 @@
                 <w:kern w:val="0"/>
                 <w14:ligatures w14:val="none"/>
               </w:rPr>
-              <w:t>25</w:t>
+              <w:t>23</w:t>
             </w:r>
           </w:p>
         </w:tc>
@@ -8544,7 +8703,7 @@
                 <w:kern w:val="0"/>
                 <w14:ligatures w14:val="none"/>
               </w:rPr>
-              <w:t>Long Mirror</w:t>
+              <w:t>Blue spotlight</w:t>
             </w:r>
           </w:p>
         </w:tc>
@@ -8602,7 +8761,7 @@
                 <w:kern w:val="0"/>
                 <w14:ligatures w14:val="none"/>
               </w:rPr>
-              <w:t>25</w:t>
+              <w:t>24</w:t>
             </w:r>
           </w:p>
         </w:tc>
@@ -8658,7 +8817,7 @@
                 <w:kern w:val="0"/>
                 <w14:ligatures w14:val="none"/>
               </w:rPr>
-              <w:t>Long curly hair</w:t>
+              <w:t>Fog machine</w:t>
             </w:r>
           </w:p>
         </w:tc>
@@ -8716,7 +8875,7 @@
                 <w:kern w:val="0"/>
                 <w14:ligatures w14:val="none"/>
               </w:rPr>
-              <w:t>28</w:t>
+              <w:t>24</w:t>
             </w:r>
           </w:p>
         </w:tc>
@@ -8771,7 +8930,7 @@
                 <w:kern w:val="0"/>
                 <w14:ligatures w14:val="none"/>
               </w:rPr>
-              <w:t>Silver Earrings</w:t>
+              <w:t>Envelope with funeral card</w:t>
             </w:r>
           </w:p>
         </w:tc>
@@ -8800,7 +8959,7 @@
                 <w:kern w:val="0"/>
                 <w14:ligatures w14:val="none"/>
               </w:rPr>
-              <w:t>2</w:t>
+              <w:t>1</w:t>
             </w:r>
           </w:p>
         </w:tc>
@@ -8829,7 +8988,7 @@
                 <w:kern w:val="0"/>
                 <w14:ligatures w14:val="none"/>
               </w:rPr>
-              <w:t>28</w:t>
+              <w:t>24</w:t>
             </w:r>
           </w:p>
         </w:tc>
@@ -8885,7 +9044,7 @@
                 <w:kern w:val="0"/>
                 <w14:ligatures w14:val="none"/>
               </w:rPr>
-              <w:t>Silver Nose Ring</w:t>
+              <w:t>Pyre</w:t>
             </w:r>
           </w:p>
         </w:tc>
@@ -8943,7 +9102,7 @@
                 <w:kern w:val="0"/>
                 <w14:ligatures w14:val="none"/>
               </w:rPr>
-              <w:t>28</w:t>
+              <w:t>24</w:t>
             </w:r>
           </w:p>
         </w:tc>
@@ -8998,7 +9157,7 @@
                 <w:kern w:val="0"/>
                 <w14:ligatures w14:val="none"/>
               </w:rPr>
-              <w:t>Silver Armbands</w:t>
+              <w:t>Bhasma</w:t>
             </w:r>
           </w:p>
         </w:tc>
@@ -9027,7 +9186,7 @@
                 <w:kern w:val="0"/>
                 <w14:ligatures w14:val="none"/>
               </w:rPr>
-              <w:t>2</w:t>
+              <w:t>1</w:t>
             </w:r>
           </w:p>
         </w:tc>
@@ -9056,7 +9215,7 @@
                 <w:kern w:val="0"/>
                 <w14:ligatures w14:val="none"/>
               </w:rPr>
-              <w:t>28</w:t>
+              <w:t>24</w:t>
             </w:r>
           </w:p>
         </w:tc>
@@ -9112,7 +9271,7 @@
                 <w:kern w:val="0"/>
                 <w14:ligatures w14:val="none"/>
               </w:rPr>
-              <w:t>Flower decorated photo of Adi</w:t>
+              <w:t>Mailbox</w:t>
             </w:r>
           </w:p>
         </w:tc>
@@ -9170,7 +9329,7 @@
                 <w:kern w:val="0"/>
                 <w14:ligatures w14:val="none"/>
               </w:rPr>
-              <w:t>28</w:t>
+              <w:t>24</w:t>
             </w:r>
           </w:p>
         </w:tc>
@@ -9225,7 +9384,7 @@
                 <w:kern w:val="0"/>
                 <w14:ligatures w14:val="none"/>
               </w:rPr>
-              <w:t>Brass Lamp</w:t>
+              <w:t>Black Sesame Seeds</w:t>
             </w:r>
           </w:p>
         </w:tc>
@@ -9283,7 +9442,7 @@
                 <w:kern w:val="0"/>
                 <w14:ligatures w14:val="none"/>
               </w:rPr>
-              <w:t>28</w:t>
+              <w:t>25</w:t>
             </w:r>
           </w:p>
         </w:tc>
@@ -9339,7 +9498,7 @@
                 <w:kern w:val="0"/>
                 <w14:ligatures w14:val="none"/>
               </w:rPr>
-              <w:t>Thick Metallic Chain</w:t>
+              <w:t>Pinda</w:t>
             </w:r>
           </w:p>
         </w:tc>
@@ -9397,7 +9556,7 @@
                 <w:kern w:val="0"/>
                 <w14:ligatures w14:val="none"/>
               </w:rPr>
-              <w:t>28</w:t>
+              <w:t>25</w:t>
             </w:r>
           </w:p>
         </w:tc>
@@ -9452,7 +9611,7 @@
                 <w:kern w:val="0"/>
                 <w14:ligatures w14:val="none"/>
               </w:rPr>
-              <w:t>-----------------------------</w:t>
+              <w:t>Long Mirror</w:t>
             </w:r>
           </w:p>
         </w:tc>
@@ -9481,7 +9640,7 @@
                 <w:kern w:val="0"/>
                 <w14:ligatures w14:val="none"/>
               </w:rPr>
-              <w:t>-----------</w:t>
+              <w:t>1</w:t>
             </w:r>
           </w:p>
         </w:tc>
@@ -9497,21 +9656,20 @@
               <w:jc w:val="center"/>
               <w:cnfStyle w:val="000000000000" w:firstRow="0" w:lastRow="0" w:firstColumn="0" w:lastColumn="0" w:oddVBand="0" w:evenVBand="0" w:oddHBand="0" w:evenHBand="0" w:firstRowFirstColumn="0" w:firstRowLastColumn="0" w:lastRowFirstColumn="0" w:lastRowLastColumn="0"/>
               <w:rPr>
-                <w:rFonts w:ascii="Times New Roman" w:eastAsia="Times New Roman" w:hAnsi="Times New Roman" w:cs="Times New Roman"/>
-                <w:kern w:val="0"/>
-                <w:sz w:val="20"/>
-                <w:szCs w:val="20"/>
-                <w14:ligatures w14:val="none"/>
-              </w:rPr>
-            </w:pPr>
-            <w:r>
-              <w:rPr>
-                <w:rFonts w:ascii="Courier New" w:eastAsia="Times New Roman" w:hAnsi="Courier New" w:cs="Courier New"/>
-                <w:color w:val="000000"/>
-                <w:kern w:val="0"/>
-                <w14:ligatures w14:val="none"/>
-              </w:rPr>
-              <w:t>---------------------</w:t>
+                <w:rFonts w:ascii="Courier New" w:eastAsia="Times New Roman" w:hAnsi="Courier New" w:cs="Courier New"/>
+                <w:color w:val="000000"/>
+                <w:kern w:val="0"/>
+                <w14:ligatures w14:val="none"/>
+              </w:rPr>
+            </w:pPr>
+            <w:r>
+              <w:rPr>
+                <w:rFonts w:ascii="Courier New" w:eastAsia="Times New Roman" w:hAnsi="Courier New" w:cs="Courier New"/>
+                <w:color w:val="000000"/>
+                <w:kern w:val="0"/>
+                <w14:ligatures w14:val="none"/>
+              </w:rPr>
+              <w:t>25</w:t>
             </w:r>
           </w:p>
         </w:tc>
@@ -9524,22 +9682,12 @@
             <w:pPr>
               <w:cnfStyle w:val="000000000000" w:firstRow="0" w:lastRow="0" w:firstColumn="0" w:lastColumn="0" w:oddVBand="0" w:evenVBand="0" w:oddHBand="0" w:evenHBand="0" w:firstRowFirstColumn="0" w:firstRowLastColumn="0" w:lastRowFirstColumn="0" w:lastRowLastColumn="0"/>
               <w:rPr>
-                <w:rFonts w:ascii="Times New Roman" w:eastAsia="Times New Roman" w:hAnsi="Times New Roman" w:cs="Times New Roman"/>
-                <w:kern w:val="0"/>
-                <w:sz w:val="20"/>
-                <w:szCs w:val="20"/>
-                <w14:ligatures w14:val="none"/>
-              </w:rPr>
-            </w:pPr>
-            <w:r>
-              <w:rPr>
-                <w:rFonts w:ascii="Courier New" w:eastAsia="Times New Roman" w:hAnsi="Courier New" w:cs="Courier New"/>
-                <w:color w:val="000000"/>
-                <w:kern w:val="0"/>
-                <w14:ligatures w14:val="none"/>
-              </w:rPr>
-              <w:t>-----------</w:t>
-            </w:r>
+                <w:rFonts w:ascii="Courier New" w:eastAsia="Times New Roman" w:hAnsi="Courier New" w:cs="Courier New"/>
+                <w:color w:val="000000"/>
+                <w:kern w:val="0"/>
+                <w14:ligatures w14:val="none"/>
+              </w:rPr>
+            </w:pPr>
           </w:p>
         </w:tc>
       </w:tr>
@@ -9577,7 +9725,7 @@
                 <w:kern w:val="0"/>
                 <w14:ligatures w14:val="none"/>
               </w:rPr>
-              <w:t>Crib with Cot Mobile</w:t>
+              <w:t>Long curly hair</w:t>
             </w:r>
           </w:p>
         </w:tc>
@@ -9599,6 +9747,15 @@
                 <w14:ligatures w14:val="none"/>
               </w:rPr>
             </w:pPr>
+            <w:r>
+              <w:rPr>
+                <w:rFonts w:ascii="Courier New" w:eastAsia="Times New Roman" w:hAnsi="Courier New" w:cs="Courier New"/>
+                <w:color w:val="000000"/>
+                <w:kern w:val="0"/>
+                <w14:ligatures w14:val="none"/>
+              </w:rPr>
+              <w:t>1</w:t>
+            </w:r>
           </w:p>
         </w:tc>
         <w:tc>
@@ -9613,21 +9770,20 @@
               <w:jc w:val="center"/>
               <w:cnfStyle w:val="000000100000" w:firstRow="0" w:lastRow="0" w:firstColumn="0" w:lastColumn="0" w:oddVBand="0" w:evenVBand="0" w:oddHBand="1" w:evenHBand="0" w:firstRowFirstColumn="0" w:firstRowLastColumn="0" w:lastRowFirstColumn="0" w:lastRowLastColumn="0"/>
               <w:rPr>
-                <w:rFonts w:ascii="Times New Roman" w:eastAsia="Times New Roman" w:hAnsi="Times New Roman" w:cs="Times New Roman"/>
-                <w:kern w:val="0"/>
-                <w:sz w:val="20"/>
-                <w:szCs w:val="20"/>
-                <w14:ligatures w14:val="none"/>
-              </w:rPr>
-            </w:pPr>
-            <w:r>
-              <w:rPr>
-                <w:rFonts w:ascii="Courier New" w:eastAsia="Times New Roman" w:hAnsi="Courier New" w:cs="Courier New"/>
-                <w:color w:val="000000"/>
-                <w:kern w:val="0"/>
-                <w14:ligatures w14:val="none"/>
-              </w:rPr>
-              <w:t>27</w:t>
+                <w:rFonts w:ascii="Courier New" w:eastAsia="Times New Roman" w:hAnsi="Courier New" w:cs="Courier New"/>
+                <w:color w:val="000000"/>
+                <w:kern w:val="0"/>
+                <w14:ligatures w14:val="none"/>
+              </w:rPr>
+            </w:pPr>
+            <w:r>
+              <w:rPr>
+                <w:rFonts w:ascii="Courier New" w:eastAsia="Times New Roman" w:hAnsi="Courier New" w:cs="Courier New"/>
+                <w:color w:val="000000"/>
+                <w:kern w:val="0"/>
+                <w14:ligatures w14:val="none"/>
+              </w:rPr>
+              <w:t>28</w:t>
             </w:r>
           </w:p>
         </w:tc>
@@ -9640,10 +9796,9 @@
             <w:pPr>
               <w:cnfStyle w:val="000000100000" w:firstRow="0" w:lastRow="0" w:firstColumn="0" w:lastColumn="0" w:oddVBand="0" w:evenVBand="0" w:oddHBand="1" w:evenHBand="0" w:firstRowFirstColumn="0" w:firstRowLastColumn="0" w:lastRowFirstColumn="0" w:lastRowLastColumn="0"/>
               <w:rPr>
-                <w:rFonts w:ascii="Times New Roman" w:eastAsia="Times New Roman" w:hAnsi="Times New Roman" w:cs="Times New Roman"/>
-                <w:kern w:val="0"/>
-                <w:sz w:val="20"/>
-                <w:szCs w:val="20"/>
+                <w:rFonts w:ascii="Courier New" w:eastAsia="Times New Roman" w:hAnsi="Courier New" w:cs="Courier New"/>
+                <w:color w:val="000000"/>
+                <w:kern w:val="0"/>
                 <w14:ligatures w14:val="none"/>
               </w:rPr>
             </w:pPr>
@@ -9683,7 +9838,7 @@
                 <w:kern w:val="0"/>
                 <w14:ligatures w14:val="none"/>
               </w:rPr>
-              <w:t>Cycle</w:t>
+              <w:t>Silver Earrings</w:t>
             </w:r>
           </w:p>
         </w:tc>
@@ -9705,6 +9860,15 @@
                 <w14:ligatures w14:val="none"/>
               </w:rPr>
             </w:pPr>
+            <w:r>
+              <w:rPr>
+                <w:rFonts w:ascii="Courier New" w:eastAsia="Times New Roman" w:hAnsi="Courier New" w:cs="Courier New"/>
+                <w:color w:val="000000"/>
+                <w:kern w:val="0"/>
+                <w14:ligatures w14:val="none"/>
+              </w:rPr>
+              <w:t>2</w:t>
+            </w:r>
           </w:p>
         </w:tc>
         <w:tc>
@@ -9719,21 +9883,20 @@
               <w:jc w:val="center"/>
               <w:cnfStyle w:val="000000000000" w:firstRow="0" w:lastRow="0" w:firstColumn="0" w:lastColumn="0" w:oddVBand="0" w:evenVBand="0" w:oddHBand="0" w:evenHBand="0" w:firstRowFirstColumn="0" w:firstRowLastColumn="0" w:lastRowFirstColumn="0" w:lastRowLastColumn="0"/>
               <w:rPr>
-                <w:rFonts w:ascii="Times New Roman" w:eastAsia="Times New Roman" w:hAnsi="Times New Roman" w:cs="Times New Roman"/>
-                <w:kern w:val="0"/>
-                <w:sz w:val="20"/>
-                <w:szCs w:val="20"/>
-                <w14:ligatures w14:val="none"/>
-              </w:rPr>
-            </w:pPr>
-            <w:r>
-              <w:rPr>
-                <w:rFonts w:ascii="Courier New" w:eastAsia="Times New Roman" w:hAnsi="Courier New" w:cs="Courier New"/>
-                <w:color w:val="000000"/>
-                <w:kern w:val="0"/>
-                <w14:ligatures w14:val="none"/>
-              </w:rPr>
-              <w:t>27</w:t>
+                <w:rFonts w:ascii="Courier New" w:eastAsia="Times New Roman" w:hAnsi="Courier New" w:cs="Courier New"/>
+                <w:color w:val="000000"/>
+                <w:kern w:val="0"/>
+                <w14:ligatures w14:val="none"/>
+              </w:rPr>
+            </w:pPr>
+            <w:r>
+              <w:rPr>
+                <w:rFonts w:ascii="Courier New" w:eastAsia="Times New Roman" w:hAnsi="Courier New" w:cs="Courier New"/>
+                <w:color w:val="000000"/>
+                <w:kern w:val="0"/>
+                <w14:ligatures w14:val="none"/>
+              </w:rPr>
+              <w:t>28</w:t>
             </w:r>
           </w:p>
         </w:tc>
@@ -9746,10 +9909,9 @@
             <w:pPr>
               <w:cnfStyle w:val="000000000000" w:firstRow="0" w:lastRow="0" w:firstColumn="0" w:lastColumn="0" w:oddVBand="0" w:evenVBand="0" w:oddHBand="0" w:evenHBand="0" w:firstRowFirstColumn="0" w:firstRowLastColumn="0" w:lastRowFirstColumn="0" w:lastRowLastColumn="0"/>
               <w:rPr>
-                <w:rFonts w:ascii="Times New Roman" w:eastAsia="Times New Roman" w:hAnsi="Times New Roman" w:cs="Times New Roman"/>
-                <w:kern w:val="0"/>
-                <w:sz w:val="20"/>
-                <w:szCs w:val="20"/>
+                <w:rFonts w:ascii="Courier New" w:eastAsia="Times New Roman" w:hAnsi="Courier New" w:cs="Courier New"/>
+                <w:color w:val="000000"/>
+                <w:kern w:val="0"/>
                 <w14:ligatures w14:val="none"/>
               </w:rPr>
             </w:pPr>
@@ -9790,7 +9952,7 @@
                 <w:kern w:val="0"/>
                 <w14:ligatures w14:val="none"/>
               </w:rPr>
-              <w:t>Band-aid</w:t>
+              <w:t>Silver Nose Ring</w:t>
             </w:r>
           </w:p>
         </w:tc>
@@ -9812,6 +9974,15 @@
                 <w14:ligatures w14:val="none"/>
               </w:rPr>
             </w:pPr>
+            <w:r>
+              <w:rPr>
+                <w:rFonts w:ascii="Courier New" w:eastAsia="Times New Roman" w:hAnsi="Courier New" w:cs="Courier New"/>
+                <w:color w:val="000000"/>
+                <w:kern w:val="0"/>
+                <w14:ligatures w14:val="none"/>
+              </w:rPr>
+              <w:t>1</w:t>
+            </w:r>
           </w:p>
         </w:tc>
         <w:tc>
@@ -9826,21 +9997,20 @@
               <w:jc w:val="center"/>
               <w:cnfStyle w:val="000000100000" w:firstRow="0" w:lastRow="0" w:firstColumn="0" w:lastColumn="0" w:oddVBand="0" w:evenVBand="0" w:oddHBand="1" w:evenHBand="0" w:firstRowFirstColumn="0" w:firstRowLastColumn="0" w:lastRowFirstColumn="0" w:lastRowLastColumn="0"/>
               <w:rPr>
-                <w:rFonts w:ascii="Times New Roman" w:eastAsia="Times New Roman" w:hAnsi="Times New Roman" w:cs="Times New Roman"/>
-                <w:kern w:val="0"/>
-                <w:sz w:val="20"/>
-                <w:szCs w:val="20"/>
-                <w14:ligatures w14:val="none"/>
-              </w:rPr>
-            </w:pPr>
-            <w:r>
-              <w:rPr>
-                <w:rFonts w:ascii="Courier New" w:eastAsia="Times New Roman" w:hAnsi="Courier New" w:cs="Courier New"/>
-                <w:color w:val="000000"/>
-                <w:kern w:val="0"/>
-                <w14:ligatures w14:val="none"/>
-              </w:rPr>
-              <w:t>27</w:t>
+                <w:rFonts w:ascii="Courier New" w:eastAsia="Times New Roman" w:hAnsi="Courier New" w:cs="Courier New"/>
+                <w:color w:val="000000"/>
+                <w:kern w:val="0"/>
+                <w14:ligatures w14:val="none"/>
+              </w:rPr>
+            </w:pPr>
+            <w:r>
+              <w:rPr>
+                <w:rFonts w:ascii="Courier New" w:eastAsia="Times New Roman" w:hAnsi="Courier New" w:cs="Courier New"/>
+                <w:color w:val="000000"/>
+                <w:kern w:val="0"/>
+                <w14:ligatures w14:val="none"/>
+              </w:rPr>
+              <w:t>28</w:t>
             </w:r>
           </w:p>
         </w:tc>
@@ -9853,10 +10023,9 @@
             <w:pPr>
               <w:cnfStyle w:val="000000100000" w:firstRow="0" w:lastRow="0" w:firstColumn="0" w:lastColumn="0" w:oddVBand="0" w:evenVBand="0" w:oddHBand="1" w:evenHBand="0" w:firstRowFirstColumn="0" w:firstRowLastColumn="0" w:lastRowFirstColumn="0" w:lastRowLastColumn="0"/>
               <w:rPr>
-                <w:rFonts w:ascii="Times New Roman" w:eastAsia="Times New Roman" w:hAnsi="Times New Roman" w:cs="Times New Roman"/>
-                <w:kern w:val="0"/>
-                <w:sz w:val="20"/>
-                <w:szCs w:val="20"/>
+                <w:rFonts w:ascii="Courier New" w:eastAsia="Times New Roman" w:hAnsi="Courier New" w:cs="Courier New"/>
+                <w:color w:val="000000"/>
+                <w:kern w:val="0"/>
                 <w14:ligatures w14:val="none"/>
               </w:rPr>
             </w:pPr>
@@ -9896,7 +10065,7 @@
                 <w:kern w:val="0"/>
                 <w14:ligatures w14:val="none"/>
               </w:rPr>
-              <w:t>Puppy</w:t>
+              <w:t>Silver Armbands</w:t>
             </w:r>
           </w:p>
         </w:tc>
@@ -9918,6 +10087,15 @@
                 <w14:ligatures w14:val="none"/>
               </w:rPr>
             </w:pPr>
+            <w:r>
+              <w:rPr>
+                <w:rFonts w:ascii="Courier New" w:eastAsia="Times New Roman" w:hAnsi="Courier New" w:cs="Courier New"/>
+                <w:color w:val="000000"/>
+                <w:kern w:val="0"/>
+                <w14:ligatures w14:val="none"/>
+              </w:rPr>
+              <w:t>2</w:t>
+            </w:r>
           </w:p>
         </w:tc>
         <w:tc>
@@ -9932,21 +10110,20 @@
               <w:jc w:val="center"/>
               <w:cnfStyle w:val="000000000000" w:firstRow="0" w:lastRow="0" w:firstColumn="0" w:lastColumn="0" w:oddVBand="0" w:evenVBand="0" w:oddHBand="0" w:evenHBand="0" w:firstRowFirstColumn="0" w:firstRowLastColumn="0" w:lastRowFirstColumn="0" w:lastRowLastColumn="0"/>
               <w:rPr>
-                <w:rFonts w:ascii="Times New Roman" w:eastAsia="Times New Roman" w:hAnsi="Times New Roman" w:cs="Times New Roman"/>
-                <w:kern w:val="0"/>
-                <w:sz w:val="20"/>
-                <w:szCs w:val="20"/>
-                <w14:ligatures w14:val="none"/>
-              </w:rPr>
-            </w:pPr>
-            <w:r>
-              <w:rPr>
-                <w:rFonts w:ascii="Courier New" w:eastAsia="Times New Roman" w:hAnsi="Courier New" w:cs="Courier New"/>
-                <w:color w:val="000000"/>
-                <w:kern w:val="0"/>
-                <w14:ligatures w14:val="none"/>
-              </w:rPr>
-              <w:t>27</w:t>
+                <w:rFonts w:ascii="Courier New" w:eastAsia="Times New Roman" w:hAnsi="Courier New" w:cs="Courier New"/>
+                <w:color w:val="000000"/>
+                <w:kern w:val="0"/>
+                <w14:ligatures w14:val="none"/>
+              </w:rPr>
+            </w:pPr>
+            <w:r>
+              <w:rPr>
+                <w:rFonts w:ascii="Courier New" w:eastAsia="Times New Roman" w:hAnsi="Courier New" w:cs="Courier New"/>
+                <w:color w:val="000000"/>
+                <w:kern w:val="0"/>
+                <w14:ligatures w14:val="none"/>
+              </w:rPr>
+              <w:t>28</w:t>
             </w:r>
           </w:p>
         </w:tc>
@@ -9959,10 +10136,9 @@
             <w:pPr>
               <w:cnfStyle w:val="000000000000" w:firstRow="0" w:lastRow="0" w:firstColumn="0" w:lastColumn="0" w:oddVBand="0" w:evenVBand="0" w:oddHBand="0" w:evenHBand="0" w:firstRowFirstColumn="0" w:firstRowLastColumn="0" w:lastRowFirstColumn="0" w:lastRowLastColumn="0"/>
               <w:rPr>
-                <w:rFonts w:ascii="Times New Roman" w:eastAsia="Times New Roman" w:hAnsi="Times New Roman" w:cs="Times New Roman"/>
-                <w:kern w:val="0"/>
-                <w:sz w:val="20"/>
-                <w:szCs w:val="20"/>
+                <w:rFonts w:ascii="Courier New" w:eastAsia="Times New Roman" w:hAnsi="Courier New" w:cs="Courier New"/>
+                <w:color w:val="000000"/>
+                <w:kern w:val="0"/>
                 <w14:ligatures w14:val="none"/>
               </w:rPr>
             </w:pPr>
@@ -10003,7 +10179,7 @@
                 <w:kern w:val="0"/>
                 <w14:ligatures w14:val="none"/>
               </w:rPr>
-              <w:t>Bat and ball</w:t>
+              <w:t>Flower decorated photo of Adi</w:t>
             </w:r>
           </w:p>
         </w:tc>
@@ -10025,6 +10201,15 @@
                 <w14:ligatures w14:val="none"/>
               </w:rPr>
             </w:pPr>
+            <w:r>
+              <w:rPr>
+                <w:rFonts w:ascii="Courier New" w:eastAsia="Times New Roman" w:hAnsi="Courier New" w:cs="Courier New"/>
+                <w:color w:val="000000"/>
+                <w:kern w:val="0"/>
+                <w14:ligatures w14:val="none"/>
+              </w:rPr>
+              <w:t>1</w:t>
+            </w:r>
           </w:p>
         </w:tc>
         <w:tc>
@@ -10039,21 +10224,20 @@
               <w:jc w:val="center"/>
               <w:cnfStyle w:val="000000100000" w:firstRow="0" w:lastRow="0" w:firstColumn="0" w:lastColumn="0" w:oddVBand="0" w:evenVBand="0" w:oddHBand="1" w:evenHBand="0" w:firstRowFirstColumn="0" w:firstRowLastColumn="0" w:lastRowFirstColumn="0" w:lastRowLastColumn="0"/>
               <w:rPr>
-                <w:rFonts w:ascii="Times New Roman" w:eastAsia="Times New Roman" w:hAnsi="Times New Roman" w:cs="Times New Roman"/>
-                <w:kern w:val="0"/>
-                <w:sz w:val="20"/>
-                <w:szCs w:val="20"/>
-                <w14:ligatures w14:val="none"/>
-              </w:rPr>
-            </w:pPr>
-            <w:r>
-              <w:rPr>
-                <w:rFonts w:ascii="Courier New" w:eastAsia="Times New Roman" w:hAnsi="Courier New" w:cs="Courier New"/>
-                <w:color w:val="000000"/>
-                <w:kern w:val="0"/>
-                <w14:ligatures w14:val="none"/>
-              </w:rPr>
-              <w:t>27</w:t>
+                <w:rFonts w:ascii="Courier New" w:eastAsia="Times New Roman" w:hAnsi="Courier New" w:cs="Courier New"/>
+                <w:color w:val="000000"/>
+                <w:kern w:val="0"/>
+                <w14:ligatures w14:val="none"/>
+              </w:rPr>
+            </w:pPr>
+            <w:r>
+              <w:rPr>
+                <w:rFonts w:ascii="Courier New" w:eastAsia="Times New Roman" w:hAnsi="Courier New" w:cs="Courier New"/>
+                <w:color w:val="000000"/>
+                <w:kern w:val="0"/>
+                <w14:ligatures w14:val="none"/>
+              </w:rPr>
+              <w:t>28</w:t>
             </w:r>
           </w:p>
         </w:tc>
@@ -10066,10 +10250,9 @@
             <w:pPr>
               <w:cnfStyle w:val="000000100000" w:firstRow="0" w:lastRow="0" w:firstColumn="0" w:lastColumn="0" w:oddVBand="0" w:evenVBand="0" w:oddHBand="1" w:evenHBand="0" w:firstRowFirstColumn="0" w:firstRowLastColumn="0" w:lastRowFirstColumn="0" w:lastRowLastColumn="0"/>
               <w:rPr>
-                <w:rFonts w:ascii="Times New Roman" w:eastAsia="Times New Roman" w:hAnsi="Times New Roman" w:cs="Times New Roman"/>
-                <w:kern w:val="0"/>
-                <w:sz w:val="20"/>
-                <w:szCs w:val="20"/>
+                <w:rFonts w:ascii="Courier New" w:eastAsia="Times New Roman" w:hAnsi="Courier New" w:cs="Courier New"/>
+                <w:color w:val="000000"/>
+                <w:kern w:val="0"/>
                 <w14:ligatures w14:val="none"/>
               </w:rPr>
             </w:pPr>
@@ -10109,7 +10292,7 @@
                 <w:kern w:val="0"/>
                 <w14:ligatures w14:val="none"/>
               </w:rPr>
-              <w:t>Ice-lollies</w:t>
+              <w:t>Brass Lamp</w:t>
             </w:r>
           </w:p>
         </w:tc>
@@ -10131,6 +10314,15 @@
                 <w14:ligatures w14:val="none"/>
               </w:rPr>
             </w:pPr>
+            <w:r>
+              <w:rPr>
+                <w:rFonts w:ascii="Courier New" w:eastAsia="Times New Roman" w:hAnsi="Courier New" w:cs="Courier New"/>
+                <w:color w:val="000000"/>
+                <w:kern w:val="0"/>
+                <w14:ligatures w14:val="none"/>
+              </w:rPr>
+              <w:t>1</w:t>
+            </w:r>
           </w:p>
         </w:tc>
         <w:tc>
@@ -10145,21 +10337,20 @@
               <w:jc w:val="center"/>
               <w:cnfStyle w:val="000000000000" w:firstRow="0" w:lastRow="0" w:firstColumn="0" w:lastColumn="0" w:oddVBand="0" w:evenVBand="0" w:oddHBand="0" w:evenHBand="0" w:firstRowFirstColumn="0" w:firstRowLastColumn="0" w:lastRowFirstColumn="0" w:lastRowLastColumn="0"/>
               <w:rPr>
-                <w:rFonts w:ascii="Times New Roman" w:eastAsia="Times New Roman" w:hAnsi="Times New Roman" w:cs="Times New Roman"/>
-                <w:kern w:val="0"/>
-                <w:sz w:val="20"/>
-                <w:szCs w:val="20"/>
-                <w14:ligatures w14:val="none"/>
-              </w:rPr>
-            </w:pPr>
-            <w:r>
-              <w:rPr>
-                <w:rFonts w:ascii="Courier New" w:eastAsia="Times New Roman" w:hAnsi="Courier New" w:cs="Courier New"/>
-                <w:color w:val="000000"/>
-                <w:kern w:val="0"/>
-                <w14:ligatures w14:val="none"/>
-              </w:rPr>
-              <w:t>27</w:t>
+                <w:rFonts w:ascii="Courier New" w:eastAsia="Times New Roman" w:hAnsi="Courier New" w:cs="Courier New"/>
+                <w:color w:val="000000"/>
+                <w:kern w:val="0"/>
+                <w14:ligatures w14:val="none"/>
+              </w:rPr>
+            </w:pPr>
+            <w:r>
+              <w:rPr>
+                <w:rFonts w:ascii="Courier New" w:eastAsia="Times New Roman" w:hAnsi="Courier New" w:cs="Courier New"/>
+                <w:color w:val="000000"/>
+                <w:kern w:val="0"/>
+                <w14:ligatures w14:val="none"/>
+              </w:rPr>
+              <w:t>28</w:t>
             </w:r>
           </w:p>
         </w:tc>
@@ -10172,10 +10363,9 @@
             <w:pPr>
               <w:cnfStyle w:val="000000000000" w:firstRow="0" w:lastRow="0" w:firstColumn="0" w:lastColumn="0" w:oddVBand="0" w:evenVBand="0" w:oddHBand="0" w:evenHBand="0" w:firstRowFirstColumn="0" w:firstRowLastColumn="0" w:lastRowFirstColumn="0" w:lastRowLastColumn="0"/>
               <w:rPr>
-                <w:rFonts w:ascii="Times New Roman" w:eastAsia="Times New Roman" w:hAnsi="Times New Roman" w:cs="Times New Roman"/>
-                <w:kern w:val="0"/>
-                <w:sz w:val="20"/>
-                <w:szCs w:val="20"/>
+                <w:rFonts w:ascii="Courier New" w:eastAsia="Times New Roman" w:hAnsi="Courier New" w:cs="Courier New"/>
+                <w:color w:val="000000"/>
+                <w:kern w:val="0"/>
                 <w14:ligatures w14:val="none"/>
               </w:rPr>
             </w:pPr>
@@ -10216,6 +10406,884 @@
                 <w:kern w:val="0"/>
                 <w14:ligatures w14:val="none"/>
               </w:rPr>
+              <w:t>Thick Metallic Chain</w:t>
+            </w:r>
+          </w:p>
+        </w:tc>
+        <w:tc>
+          <w:tcPr>
+            <w:tcW w:w="1890" w:type="dxa"/>
+            <w:noWrap/>
+            <w:vAlign w:val="center"/>
+            <w:hideMark/>
+          </w:tcPr>
+          <w:p>
+            <w:pPr>
+              <w:jc w:val="center"/>
+              <w:cnfStyle w:val="000000100000" w:firstRow="0" w:lastRow="0" w:firstColumn="0" w:lastColumn="0" w:oddVBand="0" w:evenVBand="0" w:oddHBand="1" w:evenHBand="0" w:firstRowFirstColumn="0" w:firstRowLastColumn="0" w:lastRowFirstColumn="0" w:lastRowLastColumn="0"/>
+              <w:rPr>
+                <w:rFonts w:ascii="Courier New" w:eastAsia="Times New Roman" w:hAnsi="Courier New" w:cs="Courier New"/>
+                <w:color w:val="000000"/>
+                <w:kern w:val="0"/>
+                <w14:ligatures w14:val="none"/>
+              </w:rPr>
+            </w:pPr>
+            <w:r>
+              <w:rPr>
+                <w:rFonts w:ascii="Courier New" w:eastAsia="Times New Roman" w:hAnsi="Courier New" w:cs="Courier New"/>
+                <w:color w:val="000000"/>
+                <w:kern w:val="0"/>
+                <w14:ligatures w14:val="none"/>
+              </w:rPr>
+              <w:t>1</w:t>
+            </w:r>
+          </w:p>
+        </w:tc>
+        <w:tc>
+          <w:tcPr>
+            <w:tcW w:w="3268" w:type="dxa"/>
+            <w:noWrap/>
+            <w:vAlign w:val="center"/>
+            <w:hideMark/>
+          </w:tcPr>
+          <w:p>
+            <w:pPr>
+              <w:jc w:val="center"/>
+              <w:cnfStyle w:val="000000100000" w:firstRow="0" w:lastRow="0" w:firstColumn="0" w:lastColumn="0" w:oddVBand="0" w:evenVBand="0" w:oddHBand="1" w:evenHBand="0" w:firstRowFirstColumn="0" w:firstRowLastColumn="0" w:lastRowFirstColumn="0" w:lastRowLastColumn="0"/>
+              <w:rPr>
+                <w:rFonts w:ascii="Courier New" w:eastAsia="Times New Roman" w:hAnsi="Courier New" w:cs="Courier New"/>
+                <w:color w:val="000000"/>
+                <w:kern w:val="0"/>
+                <w14:ligatures w14:val="none"/>
+              </w:rPr>
+            </w:pPr>
+            <w:r>
+              <w:rPr>
+                <w:rFonts w:ascii="Courier New" w:eastAsia="Times New Roman" w:hAnsi="Courier New" w:cs="Courier New"/>
+                <w:color w:val="000000"/>
+                <w:kern w:val="0"/>
+                <w14:ligatures w14:val="none"/>
+              </w:rPr>
+              <w:t>28</w:t>
+            </w:r>
+          </w:p>
+        </w:tc>
+        <w:tc>
+          <w:tcPr>
+            <w:tcW w:w="1804" w:type="dxa"/>
+            <w:vAlign w:val="center"/>
+          </w:tcPr>
+          <w:p>
+            <w:pPr>
+              <w:cnfStyle w:val="000000100000" w:firstRow="0" w:lastRow="0" w:firstColumn="0" w:lastColumn="0" w:oddVBand="0" w:evenVBand="0" w:oddHBand="1" w:evenHBand="0" w:firstRowFirstColumn="0" w:firstRowLastColumn="0" w:lastRowFirstColumn="0" w:lastRowLastColumn="0"/>
+              <w:rPr>
+                <w:rFonts w:ascii="Courier New" w:eastAsia="Times New Roman" w:hAnsi="Courier New" w:cs="Courier New"/>
+                <w:color w:val="000000"/>
+                <w:kern w:val="0"/>
+                <w14:ligatures w14:val="none"/>
+              </w:rPr>
+            </w:pPr>
+          </w:p>
+        </w:tc>
+      </w:tr>
+      <w:tr>
+        <w:trPr>
+          <w:trHeight w:val="432"/>
+          <w:jc w:val="center"/>
+        </w:trPr>
+        <w:tc>
+          <w:tcPr>
+            <w:cnfStyle w:val="001000000000" w:firstRow="0" w:lastRow="0" w:firstColumn="1" w:lastColumn="0" w:oddVBand="0" w:evenVBand="0" w:oddHBand="0" w:evenHBand="0" w:firstRowFirstColumn="0" w:firstRowLastColumn="0" w:lastRowFirstColumn="0" w:lastRowLastColumn="0"/>
+            <w:tcW w:w="4405" w:type="dxa"/>
+            <w:noWrap/>
+            <w:vAlign w:val="center"/>
+            <w:hideMark/>
+          </w:tcPr>
+          <w:p>
+            <w:pPr>
+              <w:rPr>
+                <w:rFonts w:ascii="Courier New" w:eastAsia="Times New Roman" w:hAnsi="Courier New" w:cs="Courier New"/>
+                <w:b w:val="0"/>
+                <w:bCs w:val="0"/>
+                <w:color w:val="000000"/>
+                <w:kern w:val="0"/>
+                <w14:ligatures w14:val="none"/>
+              </w:rPr>
+            </w:pPr>
+            <w:r>
+              <w:rPr>
+                <w:rFonts w:ascii="Courier New" w:eastAsia="Times New Roman" w:hAnsi="Courier New" w:cs="Courier New"/>
+                <w:b w:val="0"/>
+                <w:bCs w:val="0"/>
+                <w:color w:val="000000"/>
+                <w:kern w:val="0"/>
+                <w14:ligatures w14:val="none"/>
+              </w:rPr>
+              <w:t>-----------------------------</w:t>
+            </w:r>
+          </w:p>
+        </w:tc>
+        <w:tc>
+          <w:tcPr>
+            <w:tcW w:w="1890" w:type="dxa"/>
+            <w:noWrap/>
+            <w:vAlign w:val="center"/>
+            <w:hideMark/>
+          </w:tcPr>
+          <w:p>
+            <w:pPr>
+              <w:jc w:val="center"/>
+              <w:cnfStyle w:val="000000000000" w:firstRow="0" w:lastRow="0" w:firstColumn="0" w:lastColumn="0" w:oddVBand="0" w:evenVBand="0" w:oddHBand="0" w:evenHBand="0" w:firstRowFirstColumn="0" w:firstRowLastColumn="0" w:lastRowFirstColumn="0" w:lastRowLastColumn="0"/>
+              <w:rPr>
+                <w:rFonts w:ascii="Courier New" w:eastAsia="Times New Roman" w:hAnsi="Courier New" w:cs="Courier New"/>
+                <w:color w:val="000000"/>
+                <w:kern w:val="0"/>
+                <w14:ligatures w14:val="none"/>
+              </w:rPr>
+            </w:pPr>
+            <w:r>
+              <w:rPr>
+                <w:rFonts w:ascii="Courier New" w:eastAsia="Times New Roman" w:hAnsi="Courier New" w:cs="Courier New"/>
+                <w:color w:val="000000"/>
+                <w:kern w:val="0"/>
+                <w14:ligatures w14:val="none"/>
+              </w:rPr>
+              <w:t>-----------</w:t>
+            </w:r>
+          </w:p>
+        </w:tc>
+        <w:tc>
+          <w:tcPr>
+            <w:tcW w:w="3268" w:type="dxa"/>
+            <w:noWrap/>
+            <w:vAlign w:val="center"/>
+            <w:hideMark/>
+          </w:tcPr>
+          <w:p>
+            <w:pPr>
+              <w:jc w:val="center"/>
+              <w:cnfStyle w:val="000000000000" w:firstRow="0" w:lastRow="0" w:firstColumn="0" w:lastColumn="0" w:oddVBand="0" w:evenVBand="0" w:oddHBand="0" w:evenHBand="0" w:firstRowFirstColumn="0" w:firstRowLastColumn="0" w:lastRowFirstColumn="0" w:lastRowLastColumn="0"/>
+              <w:rPr>
+                <w:rFonts w:ascii="Times New Roman" w:eastAsia="Times New Roman" w:hAnsi="Times New Roman" w:cs="Times New Roman"/>
+                <w:kern w:val="0"/>
+                <w:sz w:val="20"/>
+                <w:szCs w:val="20"/>
+                <w14:ligatures w14:val="none"/>
+              </w:rPr>
+            </w:pPr>
+            <w:r>
+              <w:rPr>
+                <w:rFonts w:ascii="Courier New" w:eastAsia="Times New Roman" w:hAnsi="Courier New" w:cs="Courier New"/>
+                <w:color w:val="000000"/>
+                <w:kern w:val="0"/>
+                <w14:ligatures w14:val="none"/>
+              </w:rPr>
+              <w:t>---------------------</w:t>
+            </w:r>
+          </w:p>
+        </w:tc>
+        <w:tc>
+          <w:tcPr>
+            <w:tcW w:w="1804" w:type="dxa"/>
+            <w:vAlign w:val="center"/>
+          </w:tcPr>
+          <w:p>
+            <w:pPr>
+              <w:cnfStyle w:val="000000000000" w:firstRow="0" w:lastRow="0" w:firstColumn="0" w:lastColumn="0" w:oddVBand="0" w:evenVBand="0" w:oddHBand="0" w:evenHBand="0" w:firstRowFirstColumn="0" w:firstRowLastColumn="0" w:lastRowFirstColumn="0" w:lastRowLastColumn="0"/>
+              <w:rPr>
+                <w:rFonts w:ascii="Times New Roman" w:eastAsia="Times New Roman" w:hAnsi="Times New Roman" w:cs="Times New Roman"/>
+                <w:kern w:val="0"/>
+                <w:sz w:val="20"/>
+                <w:szCs w:val="20"/>
+                <w14:ligatures w14:val="none"/>
+              </w:rPr>
+            </w:pPr>
+            <w:r>
+              <w:rPr>
+                <w:rFonts w:ascii="Courier New" w:eastAsia="Times New Roman" w:hAnsi="Courier New" w:cs="Courier New"/>
+                <w:color w:val="000000"/>
+                <w:kern w:val="0"/>
+                <w14:ligatures w14:val="none"/>
+              </w:rPr>
+              <w:t>-----------</w:t>
+            </w:r>
+          </w:p>
+        </w:tc>
+      </w:tr>
+      <w:tr>
+        <w:trPr>
+          <w:cnfStyle w:val="000000100000" w:firstRow="0" w:lastRow="0" w:firstColumn="0" w:lastColumn="0" w:oddVBand="0" w:evenVBand="0" w:oddHBand="1" w:evenHBand="0" w:firstRowFirstColumn="0" w:firstRowLastColumn="0" w:lastRowFirstColumn="0" w:lastRowLastColumn="0"/>
+          <w:trHeight w:val="432"/>
+          <w:jc w:val="center"/>
+        </w:trPr>
+        <w:tc>
+          <w:tcPr>
+            <w:cnfStyle w:val="001000000000" w:firstRow="0" w:lastRow="0" w:firstColumn="1" w:lastColumn="0" w:oddVBand="0" w:evenVBand="0" w:oddHBand="0" w:evenHBand="0" w:firstRowFirstColumn="0" w:firstRowLastColumn="0" w:lastRowFirstColumn="0" w:lastRowLastColumn="0"/>
+            <w:tcW w:w="4405" w:type="dxa"/>
+            <w:noWrap/>
+            <w:vAlign w:val="center"/>
+            <w:hideMark/>
+          </w:tcPr>
+          <w:p>
+            <w:pPr>
+              <w:rPr>
+                <w:rFonts w:ascii="Courier New" w:eastAsia="Times New Roman" w:hAnsi="Courier New" w:cs="Courier New"/>
+                <w:b w:val="0"/>
+                <w:bCs w:val="0"/>
+                <w:color w:val="000000"/>
+                <w:kern w:val="0"/>
+                <w14:ligatures w14:val="none"/>
+              </w:rPr>
+            </w:pPr>
+            <w:r>
+              <w:rPr>
+                <w:rFonts w:ascii="Courier New" w:eastAsia="Times New Roman" w:hAnsi="Courier New" w:cs="Courier New"/>
+                <w:b w:val="0"/>
+                <w:bCs w:val="0"/>
+                <w:color w:val="000000"/>
+                <w:kern w:val="0"/>
+                <w14:ligatures w14:val="none"/>
+              </w:rPr>
+              <w:t>Crib with Cot Mobile</w:t>
+            </w:r>
+          </w:p>
+        </w:tc>
+        <w:tc>
+          <w:tcPr>
+            <w:tcW w:w="1890" w:type="dxa"/>
+            <w:noWrap/>
+            <w:vAlign w:val="center"/>
+            <w:hideMark/>
+          </w:tcPr>
+          <w:p>
+            <w:pPr>
+              <w:jc w:val="center"/>
+              <w:cnfStyle w:val="000000100000" w:firstRow="0" w:lastRow="0" w:firstColumn="0" w:lastColumn="0" w:oddVBand="0" w:evenVBand="0" w:oddHBand="1" w:evenHBand="0" w:firstRowFirstColumn="0" w:firstRowLastColumn="0" w:lastRowFirstColumn="0" w:lastRowLastColumn="0"/>
+              <w:rPr>
+                <w:rFonts w:ascii="Courier New" w:eastAsia="Times New Roman" w:hAnsi="Courier New" w:cs="Courier New"/>
+                <w:color w:val="000000"/>
+                <w:kern w:val="0"/>
+                <w14:ligatures w14:val="none"/>
+              </w:rPr>
+            </w:pPr>
+          </w:p>
+        </w:tc>
+        <w:tc>
+          <w:tcPr>
+            <w:tcW w:w="3268" w:type="dxa"/>
+            <w:noWrap/>
+            <w:vAlign w:val="center"/>
+            <w:hideMark/>
+          </w:tcPr>
+          <w:p>
+            <w:pPr>
+              <w:jc w:val="center"/>
+              <w:cnfStyle w:val="000000100000" w:firstRow="0" w:lastRow="0" w:firstColumn="0" w:lastColumn="0" w:oddVBand="0" w:evenVBand="0" w:oddHBand="1" w:evenHBand="0" w:firstRowFirstColumn="0" w:firstRowLastColumn="0" w:lastRowFirstColumn="0" w:lastRowLastColumn="0"/>
+              <w:rPr>
+                <w:rFonts w:ascii="Times New Roman" w:eastAsia="Times New Roman" w:hAnsi="Times New Roman" w:cs="Times New Roman"/>
+                <w:kern w:val="0"/>
+                <w:sz w:val="20"/>
+                <w:szCs w:val="20"/>
+                <w14:ligatures w14:val="none"/>
+              </w:rPr>
+            </w:pPr>
+            <w:r>
+              <w:rPr>
+                <w:rFonts w:ascii="Courier New" w:eastAsia="Times New Roman" w:hAnsi="Courier New" w:cs="Courier New"/>
+                <w:color w:val="000000"/>
+                <w:kern w:val="0"/>
+                <w14:ligatures w14:val="none"/>
+              </w:rPr>
+              <w:t>27</w:t>
+            </w:r>
+          </w:p>
+        </w:tc>
+        <w:tc>
+          <w:tcPr>
+            <w:tcW w:w="1804" w:type="dxa"/>
+            <w:vAlign w:val="center"/>
+          </w:tcPr>
+          <w:p>
+            <w:pPr>
+              <w:cnfStyle w:val="000000100000" w:firstRow="0" w:lastRow="0" w:firstColumn="0" w:lastColumn="0" w:oddVBand="0" w:evenVBand="0" w:oddHBand="1" w:evenHBand="0" w:firstRowFirstColumn="0" w:firstRowLastColumn="0" w:lastRowFirstColumn="0" w:lastRowLastColumn="0"/>
+              <w:rPr>
+                <w:rFonts w:ascii="Times New Roman" w:eastAsia="Times New Roman" w:hAnsi="Times New Roman" w:cs="Times New Roman"/>
+                <w:kern w:val="0"/>
+                <w:sz w:val="20"/>
+                <w:szCs w:val="20"/>
+                <w14:ligatures w14:val="none"/>
+              </w:rPr>
+            </w:pPr>
+          </w:p>
+        </w:tc>
+      </w:tr>
+      <w:tr>
+        <w:trPr>
+          <w:trHeight w:val="432"/>
+          <w:jc w:val="center"/>
+        </w:trPr>
+        <w:tc>
+          <w:tcPr>
+            <w:cnfStyle w:val="001000000000" w:firstRow="0" w:lastRow="0" w:firstColumn="1" w:lastColumn="0" w:oddVBand="0" w:evenVBand="0" w:oddHBand="0" w:evenHBand="0" w:firstRowFirstColumn="0" w:firstRowLastColumn="0" w:lastRowFirstColumn="0" w:lastRowLastColumn="0"/>
+            <w:tcW w:w="4405" w:type="dxa"/>
+            <w:noWrap/>
+            <w:vAlign w:val="center"/>
+            <w:hideMark/>
+          </w:tcPr>
+          <w:p>
+            <w:pPr>
+              <w:rPr>
+                <w:rFonts w:ascii="Courier New" w:eastAsia="Times New Roman" w:hAnsi="Courier New" w:cs="Courier New"/>
+                <w:b w:val="0"/>
+                <w:bCs w:val="0"/>
+                <w:color w:val="000000"/>
+                <w:kern w:val="0"/>
+                <w14:ligatures w14:val="none"/>
+              </w:rPr>
+            </w:pPr>
+            <w:r>
+              <w:rPr>
+                <w:rFonts w:ascii="Courier New" w:eastAsia="Times New Roman" w:hAnsi="Courier New" w:cs="Courier New"/>
+                <w:b w:val="0"/>
+                <w:bCs w:val="0"/>
+                <w:color w:val="000000"/>
+                <w:kern w:val="0"/>
+                <w14:ligatures w14:val="none"/>
+              </w:rPr>
+              <w:t>Cycle</w:t>
+            </w:r>
+          </w:p>
+        </w:tc>
+        <w:tc>
+          <w:tcPr>
+            <w:tcW w:w="1890" w:type="dxa"/>
+            <w:noWrap/>
+            <w:vAlign w:val="center"/>
+            <w:hideMark/>
+          </w:tcPr>
+          <w:p>
+            <w:pPr>
+              <w:jc w:val="center"/>
+              <w:cnfStyle w:val="000000000000" w:firstRow="0" w:lastRow="0" w:firstColumn="0" w:lastColumn="0" w:oddVBand="0" w:evenVBand="0" w:oddHBand="0" w:evenHBand="0" w:firstRowFirstColumn="0" w:firstRowLastColumn="0" w:lastRowFirstColumn="0" w:lastRowLastColumn="0"/>
+              <w:rPr>
+                <w:rFonts w:ascii="Courier New" w:eastAsia="Times New Roman" w:hAnsi="Courier New" w:cs="Courier New"/>
+                <w:color w:val="000000"/>
+                <w:kern w:val="0"/>
+                <w14:ligatures w14:val="none"/>
+              </w:rPr>
+            </w:pPr>
+          </w:p>
+        </w:tc>
+        <w:tc>
+          <w:tcPr>
+            <w:tcW w:w="3268" w:type="dxa"/>
+            <w:noWrap/>
+            <w:vAlign w:val="center"/>
+            <w:hideMark/>
+          </w:tcPr>
+          <w:p>
+            <w:pPr>
+              <w:jc w:val="center"/>
+              <w:cnfStyle w:val="000000000000" w:firstRow="0" w:lastRow="0" w:firstColumn="0" w:lastColumn="0" w:oddVBand="0" w:evenVBand="0" w:oddHBand="0" w:evenHBand="0" w:firstRowFirstColumn="0" w:firstRowLastColumn="0" w:lastRowFirstColumn="0" w:lastRowLastColumn="0"/>
+              <w:rPr>
+                <w:rFonts w:ascii="Times New Roman" w:eastAsia="Times New Roman" w:hAnsi="Times New Roman" w:cs="Times New Roman"/>
+                <w:kern w:val="0"/>
+                <w:sz w:val="20"/>
+                <w:szCs w:val="20"/>
+                <w14:ligatures w14:val="none"/>
+              </w:rPr>
+            </w:pPr>
+            <w:r>
+              <w:rPr>
+                <w:rFonts w:ascii="Courier New" w:eastAsia="Times New Roman" w:hAnsi="Courier New" w:cs="Courier New"/>
+                <w:color w:val="000000"/>
+                <w:kern w:val="0"/>
+                <w14:ligatures w14:val="none"/>
+              </w:rPr>
+              <w:t>27</w:t>
+            </w:r>
+          </w:p>
+        </w:tc>
+        <w:tc>
+          <w:tcPr>
+            <w:tcW w:w="1804" w:type="dxa"/>
+            <w:vAlign w:val="center"/>
+          </w:tcPr>
+          <w:p>
+            <w:pPr>
+              <w:cnfStyle w:val="000000000000" w:firstRow="0" w:lastRow="0" w:firstColumn="0" w:lastColumn="0" w:oddVBand="0" w:evenVBand="0" w:oddHBand="0" w:evenHBand="0" w:firstRowFirstColumn="0" w:firstRowLastColumn="0" w:lastRowFirstColumn="0" w:lastRowLastColumn="0"/>
+              <w:rPr>
+                <w:rFonts w:ascii="Times New Roman" w:eastAsia="Times New Roman" w:hAnsi="Times New Roman" w:cs="Times New Roman"/>
+                <w:kern w:val="0"/>
+                <w:sz w:val="20"/>
+                <w:szCs w:val="20"/>
+                <w14:ligatures w14:val="none"/>
+              </w:rPr>
+            </w:pPr>
+          </w:p>
+        </w:tc>
+      </w:tr>
+      <w:tr>
+        <w:trPr>
+          <w:cnfStyle w:val="000000100000" w:firstRow="0" w:lastRow="0" w:firstColumn="0" w:lastColumn="0" w:oddVBand="0" w:evenVBand="0" w:oddHBand="1" w:evenHBand="0" w:firstRowFirstColumn="0" w:firstRowLastColumn="0" w:lastRowFirstColumn="0" w:lastRowLastColumn="0"/>
+          <w:trHeight w:val="432"/>
+          <w:jc w:val="center"/>
+        </w:trPr>
+        <w:tc>
+          <w:tcPr>
+            <w:cnfStyle w:val="001000000000" w:firstRow="0" w:lastRow="0" w:firstColumn="1" w:lastColumn="0" w:oddVBand="0" w:evenVBand="0" w:oddHBand="0" w:evenHBand="0" w:firstRowFirstColumn="0" w:firstRowLastColumn="0" w:lastRowFirstColumn="0" w:lastRowLastColumn="0"/>
+            <w:tcW w:w="4405" w:type="dxa"/>
+            <w:noWrap/>
+            <w:vAlign w:val="center"/>
+            <w:hideMark/>
+          </w:tcPr>
+          <w:p>
+            <w:pPr>
+              <w:rPr>
+                <w:rFonts w:ascii="Courier New" w:eastAsia="Times New Roman" w:hAnsi="Courier New" w:cs="Courier New"/>
+                <w:b w:val="0"/>
+                <w:bCs w:val="0"/>
+                <w:color w:val="000000"/>
+                <w:kern w:val="0"/>
+                <w14:ligatures w14:val="none"/>
+              </w:rPr>
+            </w:pPr>
+            <w:r>
+              <w:rPr>
+                <w:rFonts w:ascii="Courier New" w:eastAsia="Times New Roman" w:hAnsi="Courier New" w:cs="Courier New"/>
+                <w:b w:val="0"/>
+                <w:bCs w:val="0"/>
+                <w:color w:val="000000"/>
+                <w:kern w:val="0"/>
+                <w14:ligatures w14:val="none"/>
+              </w:rPr>
+              <w:t>Band-aid</w:t>
+            </w:r>
+          </w:p>
+        </w:tc>
+        <w:tc>
+          <w:tcPr>
+            <w:tcW w:w="1890" w:type="dxa"/>
+            <w:noWrap/>
+            <w:vAlign w:val="center"/>
+            <w:hideMark/>
+          </w:tcPr>
+          <w:p>
+            <w:pPr>
+              <w:jc w:val="center"/>
+              <w:cnfStyle w:val="000000100000" w:firstRow="0" w:lastRow="0" w:firstColumn="0" w:lastColumn="0" w:oddVBand="0" w:evenVBand="0" w:oddHBand="1" w:evenHBand="0" w:firstRowFirstColumn="0" w:firstRowLastColumn="0" w:lastRowFirstColumn="0" w:lastRowLastColumn="0"/>
+              <w:rPr>
+                <w:rFonts w:ascii="Courier New" w:eastAsia="Times New Roman" w:hAnsi="Courier New" w:cs="Courier New"/>
+                <w:color w:val="000000"/>
+                <w:kern w:val="0"/>
+                <w14:ligatures w14:val="none"/>
+              </w:rPr>
+            </w:pPr>
+          </w:p>
+        </w:tc>
+        <w:tc>
+          <w:tcPr>
+            <w:tcW w:w="3268" w:type="dxa"/>
+            <w:noWrap/>
+            <w:vAlign w:val="center"/>
+            <w:hideMark/>
+          </w:tcPr>
+          <w:p>
+            <w:pPr>
+              <w:jc w:val="center"/>
+              <w:cnfStyle w:val="000000100000" w:firstRow="0" w:lastRow="0" w:firstColumn="0" w:lastColumn="0" w:oddVBand="0" w:evenVBand="0" w:oddHBand="1" w:evenHBand="0" w:firstRowFirstColumn="0" w:firstRowLastColumn="0" w:lastRowFirstColumn="0" w:lastRowLastColumn="0"/>
+              <w:rPr>
+                <w:rFonts w:ascii="Times New Roman" w:eastAsia="Times New Roman" w:hAnsi="Times New Roman" w:cs="Times New Roman"/>
+                <w:kern w:val="0"/>
+                <w:sz w:val="20"/>
+                <w:szCs w:val="20"/>
+                <w14:ligatures w14:val="none"/>
+              </w:rPr>
+            </w:pPr>
+            <w:r>
+              <w:rPr>
+                <w:rFonts w:ascii="Courier New" w:eastAsia="Times New Roman" w:hAnsi="Courier New" w:cs="Courier New"/>
+                <w:color w:val="000000"/>
+                <w:kern w:val="0"/>
+                <w14:ligatures w14:val="none"/>
+              </w:rPr>
+              <w:t>27</w:t>
+            </w:r>
+          </w:p>
+        </w:tc>
+        <w:tc>
+          <w:tcPr>
+            <w:tcW w:w="1804" w:type="dxa"/>
+            <w:vAlign w:val="center"/>
+          </w:tcPr>
+          <w:p>
+            <w:pPr>
+              <w:cnfStyle w:val="000000100000" w:firstRow="0" w:lastRow="0" w:firstColumn="0" w:lastColumn="0" w:oddVBand="0" w:evenVBand="0" w:oddHBand="1" w:evenHBand="0" w:firstRowFirstColumn="0" w:firstRowLastColumn="0" w:lastRowFirstColumn="0" w:lastRowLastColumn="0"/>
+              <w:rPr>
+                <w:rFonts w:ascii="Times New Roman" w:eastAsia="Times New Roman" w:hAnsi="Times New Roman" w:cs="Times New Roman"/>
+                <w:kern w:val="0"/>
+                <w:sz w:val="20"/>
+                <w:szCs w:val="20"/>
+                <w14:ligatures w14:val="none"/>
+              </w:rPr>
+            </w:pPr>
+          </w:p>
+        </w:tc>
+      </w:tr>
+      <w:tr>
+        <w:trPr>
+          <w:trHeight w:val="432"/>
+          <w:jc w:val="center"/>
+        </w:trPr>
+        <w:tc>
+          <w:tcPr>
+            <w:cnfStyle w:val="001000000000" w:firstRow="0" w:lastRow="0" w:firstColumn="1" w:lastColumn="0" w:oddVBand="0" w:evenVBand="0" w:oddHBand="0" w:evenHBand="0" w:firstRowFirstColumn="0" w:firstRowLastColumn="0" w:lastRowFirstColumn="0" w:lastRowLastColumn="0"/>
+            <w:tcW w:w="4405" w:type="dxa"/>
+            <w:noWrap/>
+            <w:vAlign w:val="center"/>
+            <w:hideMark/>
+          </w:tcPr>
+          <w:p>
+            <w:pPr>
+              <w:rPr>
+                <w:rFonts w:ascii="Courier New" w:eastAsia="Times New Roman" w:hAnsi="Courier New" w:cs="Courier New"/>
+                <w:b w:val="0"/>
+                <w:bCs w:val="0"/>
+                <w:color w:val="000000"/>
+                <w:kern w:val="0"/>
+                <w14:ligatures w14:val="none"/>
+              </w:rPr>
+            </w:pPr>
+            <w:r>
+              <w:rPr>
+                <w:rFonts w:ascii="Courier New" w:eastAsia="Times New Roman" w:hAnsi="Courier New" w:cs="Courier New"/>
+                <w:b w:val="0"/>
+                <w:bCs w:val="0"/>
+                <w:color w:val="000000"/>
+                <w:kern w:val="0"/>
+                <w14:ligatures w14:val="none"/>
+              </w:rPr>
+              <w:t>Puppy</w:t>
+            </w:r>
+          </w:p>
+        </w:tc>
+        <w:tc>
+          <w:tcPr>
+            <w:tcW w:w="1890" w:type="dxa"/>
+            <w:noWrap/>
+            <w:vAlign w:val="center"/>
+            <w:hideMark/>
+          </w:tcPr>
+          <w:p>
+            <w:pPr>
+              <w:jc w:val="center"/>
+              <w:cnfStyle w:val="000000000000" w:firstRow="0" w:lastRow="0" w:firstColumn="0" w:lastColumn="0" w:oddVBand="0" w:evenVBand="0" w:oddHBand="0" w:evenHBand="0" w:firstRowFirstColumn="0" w:firstRowLastColumn="0" w:lastRowFirstColumn="0" w:lastRowLastColumn="0"/>
+              <w:rPr>
+                <w:rFonts w:ascii="Courier New" w:eastAsia="Times New Roman" w:hAnsi="Courier New" w:cs="Courier New"/>
+                <w:color w:val="000000"/>
+                <w:kern w:val="0"/>
+                <w14:ligatures w14:val="none"/>
+              </w:rPr>
+            </w:pPr>
+          </w:p>
+        </w:tc>
+        <w:tc>
+          <w:tcPr>
+            <w:tcW w:w="3268" w:type="dxa"/>
+            <w:noWrap/>
+            <w:vAlign w:val="center"/>
+            <w:hideMark/>
+          </w:tcPr>
+          <w:p>
+            <w:pPr>
+              <w:jc w:val="center"/>
+              <w:cnfStyle w:val="000000000000" w:firstRow="0" w:lastRow="0" w:firstColumn="0" w:lastColumn="0" w:oddVBand="0" w:evenVBand="0" w:oddHBand="0" w:evenHBand="0" w:firstRowFirstColumn="0" w:firstRowLastColumn="0" w:lastRowFirstColumn="0" w:lastRowLastColumn="0"/>
+              <w:rPr>
+                <w:rFonts w:ascii="Times New Roman" w:eastAsia="Times New Roman" w:hAnsi="Times New Roman" w:cs="Times New Roman"/>
+                <w:kern w:val="0"/>
+                <w:sz w:val="20"/>
+                <w:szCs w:val="20"/>
+                <w14:ligatures w14:val="none"/>
+              </w:rPr>
+            </w:pPr>
+            <w:r>
+              <w:rPr>
+                <w:rFonts w:ascii="Courier New" w:eastAsia="Times New Roman" w:hAnsi="Courier New" w:cs="Courier New"/>
+                <w:color w:val="000000"/>
+                <w:kern w:val="0"/>
+                <w14:ligatures w14:val="none"/>
+              </w:rPr>
+              <w:t>27</w:t>
+            </w:r>
+          </w:p>
+        </w:tc>
+        <w:tc>
+          <w:tcPr>
+            <w:tcW w:w="1804" w:type="dxa"/>
+            <w:vAlign w:val="center"/>
+          </w:tcPr>
+          <w:p>
+            <w:pPr>
+              <w:cnfStyle w:val="000000000000" w:firstRow="0" w:lastRow="0" w:firstColumn="0" w:lastColumn="0" w:oddVBand="0" w:evenVBand="0" w:oddHBand="0" w:evenHBand="0" w:firstRowFirstColumn="0" w:firstRowLastColumn="0" w:lastRowFirstColumn="0" w:lastRowLastColumn="0"/>
+              <w:rPr>
+                <w:rFonts w:ascii="Times New Roman" w:eastAsia="Times New Roman" w:hAnsi="Times New Roman" w:cs="Times New Roman"/>
+                <w:kern w:val="0"/>
+                <w:sz w:val="20"/>
+                <w:szCs w:val="20"/>
+                <w14:ligatures w14:val="none"/>
+              </w:rPr>
+            </w:pPr>
+          </w:p>
+        </w:tc>
+      </w:tr>
+      <w:tr>
+        <w:trPr>
+          <w:cnfStyle w:val="000000100000" w:firstRow="0" w:lastRow="0" w:firstColumn="0" w:lastColumn="0" w:oddVBand="0" w:evenVBand="0" w:oddHBand="1" w:evenHBand="0" w:firstRowFirstColumn="0" w:firstRowLastColumn="0" w:lastRowFirstColumn="0" w:lastRowLastColumn="0"/>
+          <w:trHeight w:val="432"/>
+          <w:jc w:val="center"/>
+        </w:trPr>
+        <w:tc>
+          <w:tcPr>
+            <w:cnfStyle w:val="001000000000" w:firstRow="0" w:lastRow="0" w:firstColumn="1" w:lastColumn="0" w:oddVBand="0" w:evenVBand="0" w:oddHBand="0" w:evenHBand="0" w:firstRowFirstColumn="0" w:firstRowLastColumn="0" w:lastRowFirstColumn="0" w:lastRowLastColumn="0"/>
+            <w:tcW w:w="4405" w:type="dxa"/>
+            <w:noWrap/>
+            <w:vAlign w:val="center"/>
+            <w:hideMark/>
+          </w:tcPr>
+          <w:p>
+            <w:pPr>
+              <w:rPr>
+                <w:rFonts w:ascii="Courier New" w:eastAsia="Times New Roman" w:hAnsi="Courier New" w:cs="Courier New"/>
+                <w:b w:val="0"/>
+                <w:bCs w:val="0"/>
+                <w:color w:val="000000"/>
+                <w:kern w:val="0"/>
+                <w14:ligatures w14:val="none"/>
+              </w:rPr>
+            </w:pPr>
+            <w:r>
+              <w:rPr>
+                <w:rFonts w:ascii="Courier New" w:eastAsia="Times New Roman" w:hAnsi="Courier New" w:cs="Courier New"/>
+                <w:b w:val="0"/>
+                <w:bCs w:val="0"/>
+                <w:color w:val="000000"/>
+                <w:kern w:val="0"/>
+                <w14:ligatures w14:val="none"/>
+              </w:rPr>
+              <w:t>Bat and ball</w:t>
+            </w:r>
+          </w:p>
+        </w:tc>
+        <w:tc>
+          <w:tcPr>
+            <w:tcW w:w="1890" w:type="dxa"/>
+            <w:noWrap/>
+            <w:vAlign w:val="center"/>
+            <w:hideMark/>
+          </w:tcPr>
+          <w:p>
+            <w:pPr>
+              <w:jc w:val="center"/>
+              <w:cnfStyle w:val="000000100000" w:firstRow="0" w:lastRow="0" w:firstColumn="0" w:lastColumn="0" w:oddVBand="0" w:evenVBand="0" w:oddHBand="1" w:evenHBand="0" w:firstRowFirstColumn="0" w:firstRowLastColumn="0" w:lastRowFirstColumn="0" w:lastRowLastColumn="0"/>
+              <w:rPr>
+                <w:rFonts w:ascii="Courier New" w:eastAsia="Times New Roman" w:hAnsi="Courier New" w:cs="Courier New"/>
+                <w:color w:val="000000"/>
+                <w:kern w:val="0"/>
+                <w14:ligatures w14:val="none"/>
+              </w:rPr>
+            </w:pPr>
+          </w:p>
+        </w:tc>
+        <w:tc>
+          <w:tcPr>
+            <w:tcW w:w="3268" w:type="dxa"/>
+            <w:noWrap/>
+            <w:vAlign w:val="center"/>
+            <w:hideMark/>
+          </w:tcPr>
+          <w:p>
+            <w:pPr>
+              <w:jc w:val="center"/>
+              <w:cnfStyle w:val="000000100000" w:firstRow="0" w:lastRow="0" w:firstColumn="0" w:lastColumn="0" w:oddVBand="0" w:evenVBand="0" w:oddHBand="1" w:evenHBand="0" w:firstRowFirstColumn="0" w:firstRowLastColumn="0" w:lastRowFirstColumn="0" w:lastRowLastColumn="0"/>
+              <w:rPr>
+                <w:rFonts w:ascii="Times New Roman" w:eastAsia="Times New Roman" w:hAnsi="Times New Roman" w:cs="Times New Roman"/>
+                <w:kern w:val="0"/>
+                <w:sz w:val="20"/>
+                <w:szCs w:val="20"/>
+                <w14:ligatures w14:val="none"/>
+              </w:rPr>
+            </w:pPr>
+            <w:r>
+              <w:rPr>
+                <w:rFonts w:ascii="Courier New" w:eastAsia="Times New Roman" w:hAnsi="Courier New" w:cs="Courier New"/>
+                <w:color w:val="000000"/>
+                <w:kern w:val="0"/>
+                <w14:ligatures w14:val="none"/>
+              </w:rPr>
+              <w:t>27</w:t>
+            </w:r>
+          </w:p>
+        </w:tc>
+        <w:tc>
+          <w:tcPr>
+            <w:tcW w:w="1804" w:type="dxa"/>
+            <w:vAlign w:val="center"/>
+          </w:tcPr>
+          <w:p>
+            <w:pPr>
+              <w:cnfStyle w:val="000000100000" w:firstRow="0" w:lastRow="0" w:firstColumn="0" w:lastColumn="0" w:oddVBand="0" w:evenVBand="0" w:oddHBand="1" w:evenHBand="0" w:firstRowFirstColumn="0" w:firstRowLastColumn="0" w:lastRowFirstColumn="0" w:lastRowLastColumn="0"/>
+              <w:rPr>
+                <w:rFonts w:ascii="Times New Roman" w:eastAsia="Times New Roman" w:hAnsi="Times New Roman" w:cs="Times New Roman"/>
+                <w:kern w:val="0"/>
+                <w:sz w:val="20"/>
+                <w:szCs w:val="20"/>
+                <w14:ligatures w14:val="none"/>
+              </w:rPr>
+            </w:pPr>
+          </w:p>
+        </w:tc>
+      </w:tr>
+      <w:tr>
+        <w:trPr>
+          <w:trHeight w:val="432"/>
+          <w:jc w:val="center"/>
+        </w:trPr>
+        <w:tc>
+          <w:tcPr>
+            <w:cnfStyle w:val="001000000000" w:firstRow="0" w:lastRow="0" w:firstColumn="1" w:lastColumn="0" w:oddVBand="0" w:evenVBand="0" w:oddHBand="0" w:evenHBand="0" w:firstRowFirstColumn="0" w:firstRowLastColumn="0" w:lastRowFirstColumn="0" w:lastRowLastColumn="0"/>
+            <w:tcW w:w="4405" w:type="dxa"/>
+            <w:noWrap/>
+            <w:vAlign w:val="center"/>
+            <w:hideMark/>
+          </w:tcPr>
+          <w:p>
+            <w:pPr>
+              <w:rPr>
+                <w:rFonts w:ascii="Courier New" w:eastAsia="Times New Roman" w:hAnsi="Courier New" w:cs="Courier New"/>
+                <w:b w:val="0"/>
+                <w:bCs w:val="0"/>
+                <w:color w:val="000000"/>
+                <w:kern w:val="0"/>
+                <w14:ligatures w14:val="none"/>
+              </w:rPr>
+            </w:pPr>
+            <w:r>
+              <w:rPr>
+                <w:rFonts w:ascii="Courier New" w:eastAsia="Times New Roman" w:hAnsi="Courier New" w:cs="Courier New"/>
+                <w:b w:val="0"/>
+                <w:bCs w:val="0"/>
+                <w:color w:val="000000"/>
+                <w:kern w:val="0"/>
+                <w14:ligatures w14:val="none"/>
+              </w:rPr>
+              <w:t>Ice-lollies</w:t>
+            </w:r>
+          </w:p>
+        </w:tc>
+        <w:tc>
+          <w:tcPr>
+            <w:tcW w:w="1890" w:type="dxa"/>
+            <w:noWrap/>
+            <w:vAlign w:val="center"/>
+            <w:hideMark/>
+          </w:tcPr>
+          <w:p>
+            <w:pPr>
+              <w:jc w:val="center"/>
+              <w:cnfStyle w:val="000000000000" w:firstRow="0" w:lastRow="0" w:firstColumn="0" w:lastColumn="0" w:oddVBand="0" w:evenVBand="0" w:oddHBand="0" w:evenHBand="0" w:firstRowFirstColumn="0" w:firstRowLastColumn="0" w:lastRowFirstColumn="0" w:lastRowLastColumn="0"/>
+              <w:rPr>
+                <w:rFonts w:ascii="Courier New" w:eastAsia="Times New Roman" w:hAnsi="Courier New" w:cs="Courier New"/>
+                <w:color w:val="000000"/>
+                <w:kern w:val="0"/>
+                <w14:ligatures w14:val="none"/>
+              </w:rPr>
+            </w:pPr>
+          </w:p>
+        </w:tc>
+        <w:tc>
+          <w:tcPr>
+            <w:tcW w:w="3268" w:type="dxa"/>
+            <w:noWrap/>
+            <w:vAlign w:val="center"/>
+            <w:hideMark/>
+          </w:tcPr>
+          <w:p>
+            <w:pPr>
+              <w:jc w:val="center"/>
+              <w:cnfStyle w:val="000000000000" w:firstRow="0" w:lastRow="0" w:firstColumn="0" w:lastColumn="0" w:oddVBand="0" w:evenVBand="0" w:oddHBand="0" w:evenHBand="0" w:firstRowFirstColumn="0" w:firstRowLastColumn="0" w:lastRowFirstColumn="0" w:lastRowLastColumn="0"/>
+              <w:rPr>
+                <w:rFonts w:ascii="Times New Roman" w:eastAsia="Times New Roman" w:hAnsi="Times New Roman" w:cs="Times New Roman"/>
+                <w:kern w:val="0"/>
+                <w:sz w:val="20"/>
+                <w:szCs w:val="20"/>
+                <w14:ligatures w14:val="none"/>
+              </w:rPr>
+            </w:pPr>
+            <w:r>
+              <w:rPr>
+                <w:rFonts w:ascii="Courier New" w:eastAsia="Times New Roman" w:hAnsi="Courier New" w:cs="Courier New"/>
+                <w:color w:val="000000"/>
+                <w:kern w:val="0"/>
+                <w14:ligatures w14:val="none"/>
+              </w:rPr>
+              <w:t>27</w:t>
+            </w:r>
+          </w:p>
+        </w:tc>
+        <w:tc>
+          <w:tcPr>
+            <w:tcW w:w="1804" w:type="dxa"/>
+            <w:vAlign w:val="center"/>
+          </w:tcPr>
+          <w:p>
+            <w:pPr>
+              <w:cnfStyle w:val="000000000000" w:firstRow="0" w:lastRow="0" w:firstColumn="0" w:lastColumn="0" w:oddVBand="0" w:evenVBand="0" w:oddHBand="0" w:evenHBand="0" w:firstRowFirstColumn="0" w:firstRowLastColumn="0" w:lastRowFirstColumn="0" w:lastRowLastColumn="0"/>
+              <w:rPr>
+                <w:rFonts w:ascii="Times New Roman" w:eastAsia="Times New Roman" w:hAnsi="Times New Roman" w:cs="Times New Roman"/>
+                <w:kern w:val="0"/>
+                <w:sz w:val="20"/>
+                <w:szCs w:val="20"/>
+                <w14:ligatures w14:val="none"/>
+              </w:rPr>
+            </w:pPr>
+          </w:p>
+        </w:tc>
+      </w:tr>
+      <w:tr>
+        <w:trPr>
+          <w:cnfStyle w:val="000000100000" w:firstRow="0" w:lastRow="0" w:firstColumn="0" w:lastColumn="0" w:oddVBand="0" w:evenVBand="0" w:oddHBand="1" w:evenHBand="0" w:firstRowFirstColumn="0" w:firstRowLastColumn="0" w:lastRowFirstColumn="0" w:lastRowLastColumn="0"/>
+          <w:trHeight w:val="432"/>
+          <w:jc w:val="center"/>
+        </w:trPr>
+        <w:tc>
+          <w:tcPr>
+            <w:cnfStyle w:val="001000000000" w:firstRow="0" w:lastRow="0" w:firstColumn="1" w:lastColumn="0" w:oddVBand="0" w:evenVBand="0" w:oddHBand="0" w:evenHBand="0" w:firstRowFirstColumn="0" w:firstRowLastColumn="0" w:lastRowFirstColumn="0" w:lastRowLastColumn="0"/>
+            <w:tcW w:w="4405" w:type="dxa"/>
+            <w:noWrap/>
+            <w:vAlign w:val="center"/>
+            <w:hideMark/>
+          </w:tcPr>
+          <w:p>
+            <w:pPr>
+              <w:rPr>
+                <w:rFonts w:ascii="Courier New" w:eastAsia="Times New Roman" w:hAnsi="Courier New" w:cs="Courier New"/>
+                <w:b w:val="0"/>
+                <w:bCs w:val="0"/>
+                <w:color w:val="000000"/>
+                <w:kern w:val="0"/>
+                <w14:ligatures w14:val="none"/>
+              </w:rPr>
+            </w:pPr>
+            <w:r>
+              <w:rPr>
+                <w:rFonts w:ascii="Courier New" w:eastAsia="Times New Roman" w:hAnsi="Courier New" w:cs="Courier New"/>
+                <w:b w:val="0"/>
+                <w:bCs w:val="0"/>
+                <w:color w:val="000000"/>
+                <w:kern w:val="0"/>
+                <w14:ligatures w14:val="none"/>
+              </w:rPr>
+              <w:lastRenderedPageBreak/>
               <w:t>Beer bottles to cheer</w:t>
             </w:r>
           </w:p>

</xml_diff>

<commit_message>
Final Draft till Scene-25
</commit_message>
<xml_diff>
--- a/The_A_Shorts/2. Vyuthi/Vyuthi - The Lists/Vyuthi - The Props List.docx
+++ b/The_A_Shorts/2. Vyuthi/Vyuthi - The Lists/Vyuthi - The Props List.docx
@@ -825,16 +825,7 @@
                 <w:kern w:val="0"/>
                 <w14:ligatures w14:val="none"/>
               </w:rPr>
-              <w:t xml:space="preserve">3, </w:t>
-            </w:r>
-            <w:r>
-              <w:rPr>
-                <w:rFonts w:ascii="Courier New" w:eastAsia="Times New Roman" w:hAnsi="Courier New" w:cs="Courier New"/>
-                <w:color w:val="000000"/>
-                <w:kern w:val="0"/>
-                <w14:ligatures w14:val="none"/>
-              </w:rPr>
-              <w:t>19</w:t>
+              <w:t>Multiple</w:t>
             </w:r>
           </w:p>
         </w:tc>
@@ -1382,7 +1373,7 @@
                 <w:kern w:val="0"/>
                 <w14:ligatures w14:val="none"/>
               </w:rPr>
-              <w:t>2</w:t>
+              <w:t>3</w:t>
             </w:r>
           </w:p>
         </w:tc>
@@ -1425,6 +1416,28 @@
                 <w14:ligatures w14:val="none"/>
               </w:rPr>
               <w:t>, 8</w:t>
+            </w:r>
+            <w:r>
+              <w:rPr>
+                <w:rFonts w:ascii="Courier New" w:eastAsia="Times New Roman" w:hAnsi="Courier New" w:cs="Courier New"/>
+                <w:b/>
+                <w:bCs/>
+                <w:color w:val="000000"/>
+                <w:kern w:val="0"/>
+                <w14:ligatures w14:val="none"/>
+              </w:rPr>
+              <w:t>, 22</w:t>
+            </w:r>
+            <w:r>
+              <w:rPr>
+                <w:rFonts w:ascii="Courier New" w:eastAsia="Times New Roman" w:hAnsi="Courier New" w:cs="Courier New"/>
+                <w:b/>
+                <w:bCs/>
+                <w:color w:val="000000"/>
+                <w:kern w:val="0"/>
+                <w14:ligatures w14:val="none"/>
+              </w:rPr>
+              <w:t>, 23</w:t>
             </w:r>
           </w:p>
         </w:tc>
@@ -1859,6 +1872,8 @@
               <w:cnfStyle w:val="000000100000" w:firstRow="0" w:lastRow="0" w:firstColumn="0" w:lastColumn="0" w:oddVBand="0" w:evenVBand="0" w:oddHBand="1" w:evenHBand="0" w:firstRowFirstColumn="0" w:firstRowLastColumn="0" w:lastRowFirstColumn="0" w:lastRowLastColumn="0"/>
               <w:rPr>
                 <w:rFonts w:ascii="Courier New" w:eastAsia="Times New Roman" w:hAnsi="Courier New" w:cs="Courier New"/>
+                <w:b/>
+                <w:bCs/>
                 <w:color w:val="000000"/>
                 <w:kern w:val="0"/>
                 <w14:ligatures w14:val="none"/>
@@ -1882,16 +1897,18 @@
                 <w:kern w:val="0"/>
                 <w14:ligatures w14:val="none"/>
               </w:rPr>
-              <w:t>, 1</w:t>
-            </w:r>
-            <w:r>
-              <w:rPr>
-                <w:rFonts w:ascii="Courier New" w:eastAsia="Times New Roman" w:hAnsi="Courier New" w:cs="Courier New"/>
-                <w:color w:val="000000"/>
-                <w:kern w:val="0"/>
-                <w14:ligatures w14:val="none"/>
-              </w:rPr>
-              <w:t>7</w:t>
+              <w:t xml:space="preserve">, </w:t>
+            </w:r>
+            <w:r>
+              <w:rPr>
+                <w:rFonts w:ascii="Courier New" w:eastAsia="Times New Roman" w:hAnsi="Courier New" w:cs="Courier New"/>
+                <w:b/>
+                <w:bCs/>
+                <w:color w:val="000000"/>
+                <w:kern w:val="0"/>
+                <w14:ligatures w14:val="none"/>
+              </w:rPr>
+              <w:t>10, 17</w:t>
             </w:r>
           </w:p>
         </w:tc>
@@ -2215,6 +2232,17 @@
               </w:rPr>
               <w:t xml:space="preserve"> 10</w:t>
             </w:r>
+            <w:r>
+              <w:rPr>
+                <w:rFonts w:ascii="Courier New" w:eastAsia="Times New Roman" w:hAnsi="Courier New" w:cs="Courier New"/>
+                <w:b/>
+                <w:bCs/>
+                <w:color w:val="000000"/>
+                <w:kern w:val="0"/>
+                <w14:ligatures w14:val="none"/>
+              </w:rPr>
+              <w:t>, 22</w:t>
+            </w:r>
           </w:p>
         </w:tc>
         <w:tc>
@@ -2385,6 +2413,17 @@
                 <w14:ligatures w14:val="none"/>
               </w:rPr>
               <w:t>15</w:t>
+            </w:r>
+            <w:r>
+              <w:rPr>
+                <w:rFonts w:ascii="Courier New" w:eastAsia="Times New Roman" w:hAnsi="Courier New" w:cs="Courier New"/>
+                <w:b/>
+                <w:bCs/>
+                <w:color w:val="000000"/>
+                <w:kern w:val="0"/>
+                <w14:ligatures w14:val="none"/>
+              </w:rPr>
+              <w:t>, 22</w:t>
             </w:r>
           </w:p>
         </w:tc>
@@ -2678,6 +2717,8 @@
             <w:r>
               <w:rPr>
                 <w:rFonts w:ascii="Courier New" w:eastAsia="Times New Roman" w:hAnsi="Courier New" w:cs="Courier New"/>
+                <w:b/>
+                <w:bCs/>
                 <w:color w:val="000000"/>
                 <w:kern w:val="0"/>
                 <w14:ligatures w14:val="none"/>
@@ -2687,6 +2728,8 @@
             <w:r>
               <w:rPr>
                 <w:rFonts w:ascii="Courier New" w:eastAsia="Times New Roman" w:hAnsi="Courier New" w:cs="Courier New"/>
+                <w:b/>
+                <w:bCs/>
                 <w:color w:val="000000"/>
                 <w:kern w:val="0"/>
                 <w14:ligatures w14:val="none"/>
@@ -3168,7 +3211,25 @@
                 <w:kern w:val="0"/>
                 <w14:ligatures w14:val="none"/>
               </w:rPr>
-              <w:t>, 21, 22</w:t>
+              <w:t>,</w:t>
+            </w:r>
+            <w:r>
+              <w:rPr>
+                <w:rFonts w:ascii="Courier New" w:eastAsia="Times New Roman" w:hAnsi="Courier New" w:cs="Courier New"/>
+                <w:color w:val="000000"/>
+                <w:kern w:val="0"/>
+                <w14:ligatures w14:val="none"/>
+              </w:rPr>
+              <w:t xml:space="preserve"> </w:t>
+            </w:r>
+            <w:r>
+              <w:rPr>
+                <w:rFonts w:ascii="Courier New" w:eastAsia="Times New Roman" w:hAnsi="Courier New" w:cs="Courier New"/>
+                <w:color w:val="000000"/>
+                <w:kern w:val="0"/>
+                <w14:ligatures w14:val="none"/>
+              </w:rPr>
+              <w:t>22</w:t>
             </w:r>
           </w:p>
         </w:tc>
@@ -3277,16 +3338,7 @@
                 <w:kern w:val="0"/>
                 <w14:ligatures w14:val="none"/>
               </w:rPr>
-              <w:t>7,</w:t>
-            </w:r>
-            <w:r>
-              <w:rPr>
-                <w:rFonts w:ascii="Courier New" w:eastAsia="Times New Roman" w:hAnsi="Courier New" w:cs="Courier New"/>
-                <w:color w:val="000000"/>
-                <w:kern w:val="0"/>
-                <w14:ligatures w14:val="none"/>
-              </w:rPr>
-              <w:t xml:space="preserve"> 9</w:t>
+              <w:t>7</w:t>
             </w:r>
           </w:p>
         </w:tc>
@@ -3394,16 +3446,7 @@
                 <w:kern w:val="0"/>
                 <w14:ligatures w14:val="none"/>
               </w:rPr>
-              <w:t>7,</w:t>
-            </w:r>
-            <w:r>
-              <w:rPr>
-                <w:rFonts w:ascii="Courier New" w:eastAsia="Times New Roman" w:hAnsi="Courier New" w:cs="Courier New"/>
-                <w:color w:val="000000"/>
-                <w:kern w:val="0"/>
-                <w14:ligatures w14:val="none"/>
-              </w:rPr>
-              <w:t xml:space="preserve"> 9</w:t>
+              <w:t>7</w:t>
             </w:r>
           </w:p>
         </w:tc>
@@ -3515,16 +3558,7 @@
                 <w:kern w:val="0"/>
                 <w14:ligatures w14:val="none"/>
               </w:rPr>
-              <w:t xml:space="preserve">8, </w:t>
-            </w:r>
-            <w:r>
-              <w:rPr>
-                <w:rFonts w:ascii="Courier New" w:eastAsia="Times New Roman" w:hAnsi="Courier New" w:cs="Courier New"/>
-                <w:color w:val="000000"/>
-                <w:kern w:val="0"/>
-                <w14:ligatures w14:val="none"/>
-              </w:rPr>
-              <w:t>20</w:t>
+              <w:t>8</w:t>
             </w:r>
           </w:p>
         </w:tc>
@@ -3639,16 +3673,7 @@
                 <w:kern w:val="0"/>
                 <w14:ligatures w14:val="none"/>
               </w:rPr>
-              <w:t>8,</w:t>
-            </w:r>
-            <w:r>
-              <w:rPr>
-                <w:rFonts w:ascii="Courier New" w:eastAsia="Times New Roman" w:hAnsi="Courier New" w:cs="Courier New"/>
-                <w:color w:val="000000"/>
-                <w:kern w:val="0"/>
-                <w14:ligatures w14:val="none"/>
-              </w:rPr>
-              <w:t xml:space="preserve"> 9</w:t>
+              <w:t>8</w:t>
             </w:r>
           </w:p>
         </w:tc>
@@ -5073,16 +5098,18 @@
                 <w:kern w:val="0"/>
                 <w14:ligatures w14:val="none"/>
               </w:rPr>
-              <w:t>12,</w:t>
-            </w:r>
-            <w:r>
-              <w:rPr>
-                <w:rFonts w:ascii="Courier New" w:eastAsia="Times New Roman" w:hAnsi="Courier New" w:cs="Courier New"/>
-                <w:color w:val="000000"/>
-                <w:kern w:val="0"/>
-                <w14:ligatures w14:val="none"/>
-              </w:rPr>
-              <w:t xml:space="preserve"> 17, 27</w:t>
+              <w:t>12</w:t>
+            </w:r>
+            <w:r>
+              <w:rPr>
+                <w:rFonts w:ascii="Courier New" w:eastAsia="Times New Roman" w:hAnsi="Courier New" w:cs="Courier New"/>
+                <w:b/>
+                <w:bCs/>
+                <w:color w:val="000000"/>
+                <w:kern w:val="0"/>
+                <w14:ligatures w14:val="none"/>
+              </w:rPr>
+              <w:t xml:space="preserve"> 18</w:t>
             </w:r>
           </w:p>
         </w:tc>
@@ -6290,6 +6317,33 @@
               </w:rPr>
               <w:t>Television</w:t>
             </w:r>
+            <w:r>
+              <w:rPr>
+                <w:rFonts w:ascii="Courier New" w:eastAsia="Times New Roman" w:hAnsi="Courier New" w:cs="Courier New"/>
+                <w:color w:val="000000"/>
+                <w:kern w:val="0"/>
+                <w14:ligatures w14:val="none"/>
+              </w:rPr>
+              <w:t xml:space="preserve"> </w:t>
+            </w:r>
+            <w:r>
+              <w:rPr>
+                <w:rFonts w:ascii="Courier New" w:eastAsia="Times New Roman" w:hAnsi="Courier New" w:cs="Courier New"/>
+                <w:color w:val="000000"/>
+                <w:kern w:val="0"/>
+                <w14:ligatures w14:val="none"/>
+              </w:rPr>
+              <w:t xml:space="preserve">with plug &amp; </w:t>
+            </w:r>
+            <w:r>
+              <w:rPr>
+                <w:rFonts w:ascii="Courier New" w:eastAsia="Times New Roman" w:hAnsi="Courier New" w:cs="Courier New"/>
+                <w:color w:val="000000"/>
+                <w:kern w:val="0"/>
+                <w14:ligatures w14:val="none"/>
+              </w:rPr>
+              <w:t>remote</w:t>
+            </w:r>
           </w:p>
         </w:tc>
         <w:tc>
@@ -6351,6 +6405,17 @@
                 <w14:ligatures w14:val="none"/>
               </w:rPr>
               <w:t>16</w:t>
+            </w:r>
+            <w:r>
+              <w:rPr>
+                <w:rFonts w:ascii="Courier New" w:eastAsia="Times New Roman" w:hAnsi="Courier New" w:cs="Courier New"/>
+                <w:b/>
+                <w:bCs/>
+                <w:color w:val="000000"/>
+                <w:kern w:val="0"/>
+                <w14:ligatures w14:val="none"/>
+              </w:rPr>
+              <w:t>, 25</w:t>
             </w:r>
           </w:p>
         </w:tc>
@@ -6870,23 +6935,19 @@
             <w:pPr>
               <w:rPr>
                 <w:rFonts w:ascii="Courier New" w:eastAsia="Times New Roman" w:hAnsi="Courier New" w:cs="Courier New"/>
-                <w:b w:val="0"/>
-                <w:bCs w:val="0"/>
-                <w:color w:val="000000"/>
-                <w:kern w:val="0"/>
-                <w14:ligatures w14:val="none"/>
-              </w:rPr>
-            </w:pPr>
-            <w:r>
-              <w:rPr>
-                <w:rFonts w:ascii="Courier New" w:eastAsia="Times New Roman" w:hAnsi="Courier New" w:cs="Courier New"/>
-                <w:b w:val="0"/>
-                <w:bCs w:val="0"/>
-                <w:color w:val="000000"/>
-                <w:kern w:val="0"/>
-                <w14:ligatures w14:val="none"/>
-              </w:rPr>
-              <w:t>Kettle</w:t>
+                <w:color w:val="000000"/>
+                <w:kern w:val="0"/>
+                <w14:ligatures w14:val="none"/>
+              </w:rPr>
+            </w:pPr>
+            <w:r>
+              <w:rPr>
+                <w:rFonts w:ascii="Courier New" w:eastAsia="Times New Roman" w:hAnsi="Courier New" w:cs="Courier New"/>
+                <w:color w:val="000000"/>
+                <w:kern w:val="0"/>
+                <w14:ligatures w14:val="none"/>
+              </w:rPr>
+              <w:t>Jug</w:t>
             </w:r>
           </w:p>
         </w:tc>
@@ -6903,14 +6964,18 @@
               <w:cnfStyle w:val="000000000000" w:firstRow="0" w:lastRow="0" w:firstColumn="0" w:lastColumn="0" w:oddVBand="0" w:evenVBand="0" w:oddHBand="0" w:evenHBand="0" w:firstRowFirstColumn="0" w:firstRowLastColumn="0" w:lastRowFirstColumn="0" w:lastRowLastColumn="0"/>
               <w:rPr>
                 <w:rFonts w:ascii="Courier New" w:eastAsia="Times New Roman" w:hAnsi="Courier New" w:cs="Courier New"/>
-                <w:color w:val="000000"/>
-                <w:kern w:val="0"/>
-                <w14:ligatures w14:val="none"/>
-              </w:rPr>
-            </w:pPr>
-            <w:r>
-              <w:rPr>
-                <w:rFonts w:ascii="Courier New" w:eastAsia="Times New Roman" w:hAnsi="Courier New" w:cs="Courier New"/>
+                <w:b/>
+                <w:bCs/>
+                <w:color w:val="000000"/>
+                <w:kern w:val="0"/>
+                <w14:ligatures w14:val="none"/>
+              </w:rPr>
+            </w:pPr>
+            <w:r>
+              <w:rPr>
+                <w:rFonts w:ascii="Courier New" w:eastAsia="Times New Roman" w:hAnsi="Courier New" w:cs="Courier New"/>
+                <w:b/>
+                <w:bCs/>
                 <w:color w:val="000000"/>
                 <w:kern w:val="0"/>
                 <w14:ligatures w14:val="none"/>
@@ -6932,19 +6997,23 @@
               <w:cnfStyle w:val="000000000000" w:firstRow="0" w:lastRow="0" w:firstColumn="0" w:lastColumn="0" w:oddVBand="0" w:evenVBand="0" w:oddHBand="0" w:evenHBand="0" w:firstRowFirstColumn="0" w:firstRowLastColumn="0" w:lastRowFirstColumn="0" w:lastRowLastColumn="0"/>
               <w:rPr>
                 <w:rFonts w:ascii="Courier New" w:eastAsia="Times New Roman" w:hAnsi="Courier New" w:cs="Courier New"/>
-                <w:color w:val="000000"/>
-                <w:kern w:val="0"/>
-                <w14:ligatures w14:val="none"/>
-              </w:rPr>
-            </w:pPr>
-            <w:r>
-              <w:rPr>
-                <w:rFonts w:ascii="Courier New" w:eastAsia="Times New Roman" w:hAnsi="Courier New" w:cs="Courier New"/>
-                <w:color w:val="000000"/>
-                <w:kern w:val="0"/>
-                <w14:ligatures w14:val="none"/>
-              </w:rPr>
-              <w:t>19</w:t>
+                <w:b/>
+                <w:bCs/>
+                <w:color w:val="000000"/>
+                <w:kern w:val="0"/>
+                <w14:ligatures w14:val="none"/>
+              </w:rPr>
+            </w:pPr>
+            <w:r>
+              <w:rPr>
+                <w:rFonts w:ascii="Courier New" w:eastAsia="Times New Roman" w:hAnsi="Courier New" w:cs="Courier New"/>
+                <w:b/>
+                <w:bCs/>
+                <w:color w:val="000000"/>
+                <w:kern w:val="0"/>
+                <w14:ligatures w14:val="none"/>
+              </w:rPr>
+              <w:t>22</w:t>
             </w:r>
           </w:p>
         </w:tc>
@@ -6958,6 +7027,8 @@
               <w:cnfStyle w:val="000000000000" w:firstRow="0" w:lastRow="0" w:firstColumn="0" w:lastColumn="0" w:oddVBand="0" w:evenVBand="0" w:oddHBand="0" w:evenHBand="0" w:firstRowFirstColumn="0" w:firstRowLastColumn="0" w:lastRowFirstColumn="0" w:lastRowLastColumn="0"/>
               <w:rPr>
                 <w:rFonts w:ascii="Courier New" w:eastAsia="Times New Roman" w:hAnsi="Courier New" w:cs="Courier New"/>
+                <w:b/>
+                <w:bCs/>
                 <w:color w:val="000000"/>
                 <w:kern w:val="0"/>
                 <w14:ligatures w14:val="none"/>
@@ -6984,23 +7055,28 @@
             <w:pPr>
               <w:rPr>
                 <w:rFonts w:ascii="Courier New" w:eastAsia="Times New Roman" w:hAnsi="Courier New" w:cs="Courier New"/>
-                <w:b w:val="0"/>
-                <w:bCs w:val="0"/>
-                <w:color w:val="000000"/>
-                <w:kern w:val="0"/>
-                <w14:ligatures w14:val="none"/>
-              </w:rPr>
-            </w:pPr>
-            <w:r>
-              <w:rPr>
-                <w:rFonts w:ascii="Courier New" w:eastAsia="Times New Roman" w:hAnsi="Courier New" w:cs="Courier New"/>
-                <w:b w:val="0"/>
-                <w:bCs w:val="0"/>
-                <w:color w:val="000000"/>
-                <w:kern w:val="0"/>
-                <w14:ligatures w14:val="none"/>
-              </w:rPr>
-              <w:t>Tea set with Ash</w:t>
+                <w:color w:val="000000"/>
+                <w:kern w:val="0"/>
+                <w14:ligatures w14:val="none"/>
+              </w:rPr>
+            </w:pPr>
+            <w:r>
+              <w:rPr>
+                <w:rFonts w:ascii="Courier New" w:eastAsia="Times New Roman" w:hAnsi="Courier New" w:cs="Courier New"/>
+                <w:color w:val="000000"/>
+                <w:kern w:val="0"/>
+                <w14:ligatures w14:val="none"/>
+              </w:rPr>
+              <w:t xml:space="preserve">Tea set with </w:t>
+            </w:r>
+            <w:r>
+              <w:rPr>
+                <w:rFonts w:ascii="Courier New" w:eastAsia="Times New Roman" w:hAnsi="Courier New" w:cs="Courier New"/>
+                <w:color w:val="000000"/>
+                <w:kern w:val="0"/>
+                <w14:ligatures w14:val="none"/>
+              </w:rPr>
+              <w:t>black sesame</w:t>
             </w:r>
           </w:p>
         </w:tc>
@@ -7017,14 +7093,18 @@
               <w:cnfStyle w:val="000000100000" w:firstRow="0" w:lastRow="0" w:firstColumn="0" w:lastColumn="0" w:oddVBand="0" w:evenVBand="0" w:oddHBand="1" w:evenHBand="0" w:firstRowFirstColumn="0" w:firstRowLastColumn="0" w:lastRowFirstColumn="0" w:lastRowLastColumn="0"/>
               <w:rPr>
                 <w:rFonts w:ascii="Courier New" w:eastAsia="Times New Roman" w:hAnsi="Courier New" w:cs="Courier New"/>
-                <w:color w:val="000000"/>
-                <w:kern w:val="0"/>
-                <w14:ligatures w14:val="none"/>
-              </w:rPr>
-            </w:pPr>
-            <w:r>
-              <w:rPr>
-                <w:rFonts w:ascii="Courier New" w:eastAsia="Times New Roman" w:hAnsi="Courier New" w:cs="Courier New"/>
+                <w:b/>
+                <w:bCs/>
+                <w:color w:val="000000"/>
+                <w:kern w:val="0"/>
+                <w14:ligatures w14:val="none"/>
+              </w:rPr>
+            </w:pPr>
+            <w:r>
+              <w:rPr>
+                <w:rFonts w:ascii="Courier New" w:eastAsia="Times New Roman" w:hAnsi="Courier New" w:cs="Courier New"/>
+                <w:b/>
+                <w:bCs/>
                 <w:color w:val="000000"/>
                 <w:kern w:val="0"/>
                 <w14:ligatures w14:val="none"/>
@@ -7046,19 +7126,23 @@
               <w:cnfStyle w:val="000000100000" w:firstRow="0" w:lastRow="0" w:firstColumn="0" w:lastColumn="0" w:oddVBand="0" w:evenVBand="0" w:oddHBand="1" w:evenHBand="0" w:firstRowFirstColumn="0" w:firstRowLastColumn="0" w:lastRowFirstColumn="0" w:lastRowLastColumn="0"/>
               <w:rPr>
                 <w:rFonts w:ascii="Courier New" w:eastAsia="Times New Roman" w:hAnsi="Courier New" w:cs="Courier New"/>
-                <w:color w:val="000000"/>
-                <w:kern w:val="0"/>
-                <w14:ligatures w14:val="none"/>
-              </w:rPr>
-            </w:pPr>
-            <w:r>
-              <w:rPr>
-                <w:rFonts w:ascii="Courier New" w:eastAsia="Times New Roman" w:hAnsi="Courier New" w:cs="Courier New"/>
-                <w:color w:val="000000"/>
-                <w:kern w:val="0"/>
-                <w14:ligatures w14:val="none"/>
-              </w:rPr>
-              <w:t>19</w:t>
+                <w:b/>
+                <w:bCs/>
+                <w:color w:val="000000"/>
+                <w:kern w:val="0"/>
+                <w14:ligatures w14:val="none"/>
+              </w:rPr>
+            </w:pPr>
+            <w:r>
+              <w:rPr>
+                <w:rFonts w:ascii="Courier New" w:eastAsia="Times New Roman" w:hAnsi="Courier New" w:cs="Courier New"/>
+                <w:b/>
+                <w:bCs/>
+                <w:color w:val="000000"/>
+                <w:kern w:val="0"/>
+                <w14:ligatures w14:val="none"/>
+              </w:rPr>
+              <w:t>22</w:t>
             </w:r>
           </w:p>
         </w:tc>
@@ -7072,6 +7156,8 @@
               <w:cnfStyle w:val="000000100000" w:firstRow="0" w:lastRow="0" w:firstColumn="0" w:lastColumn="0" w:oddVBand="0" w:evenVBand="0" w:oddHBand="1" w:evenHBand="0" w:firstRowFirstColumn="0" w:firstRowLastColumn="0" w:lastRowFirstColumn="0" w:lastRowLastColumn="0"/>
               <w:rPr>
                 <w:rFonts w:ascii="Courier New" w:eastAsia="Times New Roman" w:hAnsi="Courier New" w:cs="Courier New"/>
+                <w:b/>
+                <w:bCs/>
                 <w:color w:val="000000"/>
                 <w:kern w:val="0"/>
                 <w14:ligatures w14:val="none"/>
@@ -7097,23 +7183,19 @@
             <w:pPr>
               <w:rPr>
                 <w:rFonts w:ascii="Courier New" w:eastAsia="Times New Roman" w:hAnsi="Courier New" w:cs="Courier New"/>
-                <w:b w:val="0"/>
-                <w:bCs w:val="0"/>
-                <w:color w:val="000000"/>
-                <w:kern w:val="0"/>
-                <w14:ligatures w14:val="none"/>
-              </w:rPr>
-            </w:pPr>
-            <w:r>
-              <w:rPr>
-                <w:rFonts w:ascii="Courier New" w:eastAsia="Times New Roman" w:hAnsi="Courier New" w:cs="Courier New"/>
-                <w:b w:val="0"/>
-                <w:bCs w:val="0"/>
-                <w:color w:val="000000"/>
-                <w:kern w:val="0"/>
-                <w14:ligatures w14:val="none"/>
-              </w:rPr>
-              <w:t>Long glass with soda, lime slice</w:t>
+                <w:color w:val="000000"/>
+                <w:kern w:val="0"/>
+                <w14:ligatures w14:val="none"/>
+              </w:rPr>
+            </w:pPr>
+            <w:r>
+              <w:rPr>
+                <w:rFonts w:ascii="Courier New" w:eastAsia="Times New Roman" w:hAnsi="Courier New" w:cs="Courier New"/>
+                <w:color w:val="000000"/>
+                <w:kern w:val="0"/>
+                <w14:ligatures w14:val="none"/>
+              </w:rPr>
+              <w:t>Black Pebbles</w:t>
             </w:r>
           </w:p>
         </w:tc>
@@ -7130,14 +7212,18 @@
               <w:cnfStyle w:val="000000000000" w:firstRow="0" w:lastRow="0" w:firstColumn="0" w:lastColumn="0" w:oddVBand="0" w:evenVBand="0" w:oddHBand="0" w:evenHBand="0" w:firstRowFirstColumn="0" w:firstRowLastColumn="0" w:lastRowFirstColumn="0" w:lastRowLastColumn="0"/>
               <w:rPr>
                 <w:rFonts w:ascii="Courier New" w:eastAsia="Times New Roman" w:hAnsi="Courier New" w:cs="Courier New"/>
-                <w:color w:val="000000"/>
-                <w:kern w:val="0"/>
-                <w14:ligatures w14:val="none"/>
-              </w:rPr>
-            </w:pPr>
-            <w:r>
-              <w:rPr>
-                <w:rFonts w:ascii="Courier New" w:eastAsia="Times New Roman" w:hAnsi="Courier New" w:cs="Courier New"/>
+                <w:b/>
+                <w:bCs/>
+                <w:color w:val="000000"/>
+                <w:kern w:val="0"/>
+                <w14:ligatures w14:val="none"/>
+              </w:rPr>
+            </w:pPr>
+            <w:r>
+              <w:rPr>
+                <w:rFonts w:ascii="Courier New" w:eastAsia="Times New Roman" w:hAnsi="Courier New" w:cs="Courier New"/>
+                <w:b/>
+                <w:bCs/>
                 <w:color w:val="000000"/>
                 <w:kern w:val="0"/>
                 <w14:ligatures w14:val="none"/>
@@ -7159,19 +7245,23 @@
               <w:cnfStyle w:val="000000000000" w:firstRow="0" w:lastRow="0" w:firstColumn="0" w:lastColumn="0" w:oddVBand="0" w:evenVBand="0" w:oddHBand="0" w:evenHBand="0" w:firstRowFirstColumn="0" w:firstRowLastColumn="0" w:lastRowFirstColumn="0" w:lastRowLastColumn="0"/>
               <w:rPr>
                 <w:rFonts w:ascii="Courier New" w:eastAsia="Times New Roman" w:hAnsi="Courier New" w:cs="Courier New"/>
-                <w:color w:val="000000"/>
-                <w:kern w:val="0"/>
-                <w14:ligatures w14:val="none"/>
-              </w:rPr>
-            </w:pPr>
-            <w:r>
-              <w:rPr>
-                <w:rFonts w:ascii="Courier New" w:eastAsia="Times New Roman" w:hAnsi="Courier New" w:cs="Courier New"/>
-                <w:color w:val="000000"/>
-                <w:kern w:val="0"/>
-                <w14:ligatures w14:val="none"/>
-              </w:rPr>
-              <w:t>19</w:t>
+                <w:b/>
+                <w:bCs/>
+                <w:color w:val="000000"/>
+                <w:kern w:val="0"/>
+                <w14:ligatures w14:val="none"/>
+              </w:rPr>
+            </w:pPr>
+            <w:r>
+              <w:rPr>
+                <w:rFonts w:ascii="Courier New" w:eastAsia="Times New Roman" w:hAnsi="Courier New" w:cs="Courier New"/>
+                <w:b/>
+                <w:bCs/>
+                <w:color w:val="000000"/>
+                <w:kern w:val="0"/>
+                <w14:ligatures w14:val="none"/>
+              </w:rPr>
+              <w:t>22</w:t>
             </w:r>
           </w:p>
         </w:tc>
@@ -7185,6 +7275,8 @@
               <w:cnfStyle w:val="000000000000" w:firstRow="0" w:lastRow="0" w:firstColumn="0" w:lastColumn="0" w:oddVBand="0" w:evenVBand="0" w:oddHBand="0" w:evenHBand="0" w:firstRowFirstColumn="0" w:firstRowLastColumn="0" w:lastRowFirstColumn="0" w:lastRowLastColumn="0"/>
               <w:rPr>
                 <w:rFonts w:ascii="Courier New" w:eastAsia="Times New Roman" w:hAnsi="Courier New" w:cs="Courier New"/>
+                <w:b/>
+                <w:bCs/>
                 <w:color w:val="000000"/>
                 <w:kern w:val="0"/>
                 <w14:ligatures w14:val="none"/>
@@ -7205,29 +7297,24 @@
             <w:tcW w:w="4405" w:type="dxa"/>
             <w:noWrap/>
             <w:vAlign w:val="center"/>
-            <w:hideMark/>
-          </w:tcPr>
-          <w:p>
-            <w:pPr>
-              <w:rPr>
-                <w:rFonts w:ascii="Courier New" w:eastAsia="Times New Roman" w:hAnsi="Courier New" w:cs="Courier New"/>
-                <w:b w:val="0"/>
-                <w:bCs w:val="0"/>
-                <w:color w:val="000000"/>
-                <w:kern w:val="0"/>
-                <w14:ligatures w14:val="none"/>
-              </w:rPr>
-            </w:pPr>
-            <w:r>
-              <w:rPr>
-                <w:rFonts w:ascii="Courier New" w:eastAsia="Times New Roman" w:hAnsi="Courier New" w:cs="Courier New"/>
-                <w:b w:val="0"/>
-                <w:bCs w:val="0"/>
-                <w:color w:val="000000"/>
-                <w:kern w:val="0"/>
-                <w14:ligatures w14:val="none"/>
-              </w:rPr>
-              <w:t>Sand</w:t>
+          </w:tcPr>
+          <w:p>
+            <w:pPr>
+              <w:rPr>
+                <w:rFonts w:ascii="Courier New" w:eastAsia="Times New Roman" w:hAnsi="Courier New" w:cs="Courier New"/>
+                <w:color w:val="000000"/>
+                <w:kern w:val="0"/>
+                <w14:ligatures w14:val="none"/>
+              </w:rPr>
+            </w:pPr>
+            <w:r>
+              <w:rPr>
+                <w:rFonts w:ascii="Courier New" w:eastAsia="Times New Roman" w:hAnsi="Courier New" w:cs="Courier New"/>
+                <w:color w:val="000000"/>
+                <w:kern w:val="0"/>
+                <w14:ligatures w14:val="none"/>
+              </w:rPr>
+              <w:t>Juice Box with Oil</w:t>
             </w:r>
           </w:p>
         </w:tc>
@@ -7236,22 +7323,25 @@
             <w:tcW w:w="1890" w:type="dxa"/>
             <w:noWrap/>
             <w:vAlign w:val="center"/>
-            <w:hideMark/>
-          </w:tcPr>
-          <w:p>
-            <w:pPr>
-              <w:jc w:val="center"/>
-              <w:cnfStyle w:val="000000100000" w:firstRow="0" w:lastRow="0" w:firstColumn="0" w:lastColumn="0" w:oddVBand="0" w:evenVBand="0" w:oddHBand="1" w:evenHBand="0" w:firstRowFirstColumn="0" w:firstRowLastColumn="0" w:lastRowFirstColumn="0" w:lastRowLastColumn="0"/>
-              <w:rPr>
-                <w:rFonts w:ascii="Courier New" w:eastAsia="Times New Roman" w:hAnsi="Courier New" w:cs="Courier New"/>
-                <w:color w:val="000000"/>
-                <w:kern w:val="0"/>
-                <w14:ligatures w14:val="none"/>
-              </w:rPr>
-            </w:pPr>
-            <w:r>
-              <w:rPr>
-                <w:rFonts w:ascii="Courier New" w:eastAsia="Times New Roman" w:hAnsi="Courier New" w:cs="Courier New"/>
+          </w:tcPr>
+          <w:p>
+            <w:pPr>
+              <w:jc w:val="center"/>
+              <w:cnfStyle w:val="000000100000" w:firstRow="0" w:lastRow="0" w:firstColumn="0" w:lastColumn="0" w:oddVBand="0" w:evenVBand="0" w:oddHBand="1" w:evenHBand="0" w:firstRowFirstColumn="0" w:firstRowLastColumn="0" w:lastRowFirstColumn="0" w:lastRowLastColumn="0"/>
+              <w:rPr>
+                <w:rFonts w:ascii="Courier New" w:eastAsia="Times New Roman" w:hAnsi="Courier New" w:cs="Courier New"/>
+                <w:b/>
+                <w:bCs/>
+                <w:color w:val="000000"/>
+                <w:kern w:val="0"/>
+                <w14:ligatures w14:val="none"/>
+              </w:rPr>
+            </w:pPr>
+            <w:r>
+              <w:rPr>
+                <w:rFonts w:ascii="Courier New" w:eastAsia="Times New Roman" w:hAnsi="Courier New" w:cs="Courier New"/>
+                <w:b/>
+                <w:bCs/>
                 <w:color w:val="000000"/>
                 <w:kern w:val="0"/>
                 <w14:ligatures w14:val="none"/>
@@ -7265,27 +7355,30 @@
             <w:tcW w:w="3268" w:type="dxa"/>
             <w:noWrap/>
             <w:vAlign w:val="center"/>
-            <w:hideMark/>
-          </w:tcPr>
-          <w:p>
-            <w:pPr>
-              <w:jc w:val="center"/>
-              <w:cnfStyle w:val="000000100000" w:firstRow="0" w:lastRow="0" w:firstColumn="0" w:lastColumn="0" w:oddVBand="0" w:evenVBand="0" w:oddHBand="1" w:evenHBand="0" w:firstRowFirstColumn="0" w:firstRowLastColumn="0" w:lastRowFirstColumn="0" w:lastRowLastColumn="0"/>
-              <w:rPr>
-                <w:rFonts w:ascii="Courier New" w:eastAsia="Times New Roman" w:hAnsi="Courier New" w:cs="Courier New"/>
-                <w:color w:val="000000"/>
-                <w:kern w:val="0"/>
-                <w14:ligatures w14:val="none"/>
-              </w:rPr>
-            </w:pPr>
-            <w:r>
-              <w:rPr>
-                <w:rFonts w:ascii="Courier New" w:eastAsia="Times New Roman" w:hAnsi="Courier New" w:cs="Courier New"/>
-                <w:color w:val="000000"/>
-                <w:kern w:val="0"/>
-                <w14:ligatures w14:val="none"/>
-              </w:rPr>
-              <w:t>19</w:t>
+          </w:tcPr>
+          <w:p>
+            <w:pPr>
+              <w:jc w:val="center"/>
+              <w:cnfStyle w:val="000000100000" w:firstRow="0" w:lastRow="0" w:firstColumn="0" w:lastColumn="0" w:oddVBand="0" w:evenVBand="0" w:oddHBand="1" w:evenHBand="0" w:firstRowFirstColumn="0" w:firstRowLastColumn="0" w:lastRowFirstColumn="0" w:lastRowLastColumn="0"/>
+              <w:rPr>
+                <w:rFonts w:ascii="Courier New" w:eastAsia="Times New Roman" w:hAnsi="Courier New" w:cs="Courier New"/>
+                <w:b/>
+                <w:bCs/>
+                <w:color w:val="000000"/>
+                <w:kern w:val="0"/>
+                <w14:ligatures w14:val="none"/>
+              </w:rPr>
+            </w:pPr>
+            <w:r>
+              <w:rPr>
+                <w:rFonts w:ascii="Courier New" w:eastAsia="Times New Roman" w:hAnsi="Courier New" w:cs="Courier New"/>
+                <w:b/>
+                <w:bCs/>
+                <w:color w:val="000000"/>
+                <w:kern w:val="0"/>
+                <w14:ligatures w14:val="none"/>
+              </w:rPr>
+              <w:t>22</w:t>
             </w:r>
           </w:p>
         </w:tc>
@@ -7299,6 +7392,8 @@
               <w:cnfStyle w:val="000000100000" w:firstRow="0" w:lastRow="0" w:firstColumn="0" w:lastColumn="0" w:oddVBand="0" w:evenVBand="0" w:oddHBand="1" w:evenHBand="0" w:firstRowFirstColumn="0" w:firstRowLastColumn="0" w:lastRowFirstColumn="0" w:lastRowLastColumn="0"/>
               <w:rPr>
                 <w:rFonts w:ascii="Courier New" w:eastAsia="Times New Roman" w:hAnsi="Courier New" w:cs="Courier New"/>
+                <w:b/>
+                <w:bCs/>
                 <w:color w:val="000000"/>
                 <w:kern w:val="0"/>
                 <w14:ligatures w14:val="none"/>
@@ -7324,23 +7419,19 @@
             <w:pPr>
               <w:rPr>
                 <w:rFonts w:ascii="Courier New" w:eastAsia="Times New Roman" w:hAnsi="Courier New" w:cs="Courier New"/>
-                <w:b w:val="0"/>
-                <w:bCs w:val="0"/>
-                <w:color w:val="000000"/>
-                <w:kern w:val="0"/>
-                <w14:ligatures w14:val="none"/>
-              </w:rPr>
-            </w:pPr>
-            <w:r>
-              <w:rPr>
-                <w:rFonts w:ascii="Courier New" w:eastAsia="Times New Roman" w:hAnsi="Courier New" w:cs="Courier New"/>
-                <w:b w:val="0"/>
-                <w:bCs w:val="0"/>
-                <w:color w:val="000000"/>
-                <w:kern w:val="0"/>
-                <w14:ligatures w14:val="none"/>
-              </w:rPr>
-              <w:t>Vase with flower</w:t>
+                <w:color w:val="000000"/>
+                <w:kern w:val="0"/>
+                <w14:ligatures w14:val="none"/>
+              </w:rPr>
+            </w:pPr>
+            <w:r>
+              <w:rPr>
+                <w:rFonts w:ascii="Courier New" w:eastAsia="Times New Roman" w:hAnsi="Courier New" w:cs="Courier New"/>
+                <w:color w:val="000000"/>
+                <w:kern w:val="0"/>
+                <w14:ligatures w14:val="none"/>
+              </w:rPr>
+              <w:t>Whiskey Bottle</w:t>
             </w:r>
           </w:p>
         </w:tc>
@@ -7357,14 +7448,18 @@
               <w:cnfStyle w:val="000000000000" w:firstRow="0" w:lastRow="0" w:firstColumn="0" w:lastColumn="0" w:oddVBand="0" w:evenVBand="0" w:oddHBand="0" w:evenHBand="0" w:firstRowFirstColumn="0" w:firstRowLastColumn="0" w:lastRowFirstColumn="0" w:lastRowLastColumn="0"/>
               <w:rPr>
                 <w:rFonts w:ascii="Courier New" w:eastAsia="Times New Roman" w:hAnsi="Courier New" w:cs="Courier New"/>
-                <w:color w:val="000000"/>
-                <w:kern w:val="0"/>
-                <w14:ligatures w14:val="none"/>
-              </w:rPr>
-            </w:pPr>
-            <w:r>
-              <w:rPr>
-                <w:rFonts w:ascii="Courier New" w:eastAsia="Times New Roman" w:hAnsi="Courier New" w:cs="Courier New"/>
+                <w:b/>
+                <w:bCs/>
+                <w:color w:val="000000"/>
+                <w:kern w:val="0"/>
+                <w14:ligatures w14:val="none"/>
+              </w:rPr>
+            </w:pPr>
+            <w:r>
+              <w:rPr>
+                <w:rFonts w:ascii="Courier New" w:eastAsia="Times New Roman" w:hAnsi="Courier New" w:cs="Courier New"/>
+                <w:b/>
+                <w:bCs/>
                 <w:color w:val="000000"/>
                 <w:kern w:val="0"/>
                 <w14:ligatures w14:val="none"/>
@@ -7386,19 +7481,23 @@
               <w:cnfStyle w:val="000000000000" w:firstRow="0" w:lastRow="0" w:firstColumn="0" w:lastColumn="0" w:oddVBand="0" w:evenVBand="0" w:oddHBand="0" w:evenHBand="0" w:firstRowFirstColumn="0" w:firstRowLastColumn="0" w:lastRowFirstColumn="0" w:lastRowLastColumn="0"/>
               <w:rPr>
                 <w:rFonts w:ascii="Courier New" w:eastAsia="Times New Roman" w:hAnsi="Courier New" w:cs="Courier New"/>
-                <w:color w:val="000000"/>
-                <w:kern w:val="0"/>
-                <w14:ligatures w14:val="none"/>
-              </w:rPr>
-            </w:pPr>
-            <w:r>
-              <w:rPr>
-                <w:rFonts w:ascii="Courier New" w:eastAsia="Times New Roman" w:hAnsi="Courier New" w:cs="Courier New"/>
-                <w:color w:val="000000"/>
-                <w:kern w:val="0"/>
-                <w14:ligatures w14:val="none"/>
-              </w:rPr>
-              <w:t>19</w:t>
+                <w:b/>
+                <w:bCs/>
+                <w:color w:val="000000"/>
+                <w:kern w:val="0"/>
+                <w14:ligatures w14:val="none"/>
+              </w:rPr>
+            </w:pPr>
+            <w:r>
+              <w:rPr>
+                <w:rFonts w:ascii="Courier New" w:eastAsia="Times New Roman" w:hAnsi="Courier New" w:cs="Courier New"/>
+                <w:b/>
+                <w:bCs/>
+                <w:color w:val="000000"/>
+                <w:kern w:val="0"/>
+                <w14:ligatures w14:val="none"/>
+              </w:rPr>
+              <w:t>22</w:t>
             </w:r>
           </w:p>
         </w:tc>
@@ -7412,6 +7511,8 @@
               <w:cnfStyle w:val="000000000000" w:firstRow="0" w:lastRow="0" w:firstColumn="0" w:lastColumn="0" w:oddVBand="0" w:evenVBand="0" w:oddHBand="0" w:evenHBand="0" w:firstRowFirstColumn="0" w:firstRowLastColumn="0" w:lastRowFirstColumn="0" w:lastRowLastColumn="0"/>
               <w:rPr>
                 <w:rFonts w:ascii="Courier New" w:eastAsia="Times New Roman" w:hAnsi="Courier New" w:cs="Courier New"/>
+                <w:b/>
+                <w:bCs/>
                 <w:color w:val="000000"/>
                 <w:kern w:val="0"/>
                 <w14:ligatures w14:val="none"/>
@@ -7438,23 +7539,19 @@
             <w:pPr>
               <w:rPr>
                 <w:rFonts w:ascii="Courier New" w:eastAsia="Times New Roman" w:hAnsi="Courier New" w:cs="Courier New"/>
-                <w:b w:val="0"/>
-                <w:bCs w:val="0"/>
-                <w:color w:val="000000"/>
-                <w:kern w:val="0"/>
-                <w14:ligatures w14:val="none"/>
-              </w:rPr>
-            </w:pPr>
-            <w:r>
-              <w:rPr>
-                <w:rFonts w:ascii="Courier New" w:eastAsia="Times New Roman" w:hAnsi="Courier New" w:cs="Courier New"/>
-                <w:b w:val="0"/>
-                <w:bCs w:val="0"/>
-                <w:color w:val="000000"/>
-                <w:kern w:val="0"/>
-                <w14:ligatures w14:val="none"/>
-              </w:rPr>
-              <w:t>Puffed Rice</w:t>
+                <w:color w:val="000000"/>
+                <w:kern w:val="0"/>
+                <w14:ligatures w14:val="none"/>
+              </w:rPr>
+            </w:pPr>
+            <w:r>
+              <w:rPr>
+                <w:rFonts w:ascii="Courier New" w:eastAsia="Times New Roman" w:hAnsi="Courier New" w:cs="Courier New"/>
+                <w:color w:val="000000"/>
+                <w:kern w:val="0"/>
+                <w14:ligatures w14:val="none"/>
+              </w:rPr>
+              <w:t>Dry flower petals</w:t>
             </w:r>
           </w:p>
         </w:tc>
@@ -7471,14 +7568,18 @@
               <w:cnfStyle w:val="000000100000" w:firstRow="0" w:lastRow="0" w:firstColumn="0" w:lastColumn="0" w:oddVBand="0" w:evenVBand="0" w:oddHBand="1" w:evenHBand="0" w:firstRowFirstColumn="0" w:firstRowLastColumn="0" w:lastRowFirstColumn="0" w:lastRowLastColumn="0"/>
               <w:rPr>
                 <w:rFonts w:ascii="Courier New" w:eastAsia="Times New Roman" w:hAnsi="Courier New" w:cs="Courier New"/>
-                <w:color w:val="000000"/>
-                <w:kern w:val="0"/>
-                <w14:ligatures w14:val="none"/>
-              </w:rPr>
-            </w:pPr>
-            <w:r>
-              <w:rPr>
-                <w:rFonts w:ascii="Courier New" w:eastAsia="Times New Roman" w:hAnsi="Courier New" w:cs="Courier New"/>
+                <w:b/>
+                <w:bCs/>
+                <w:color w:val="000000"/>
+                <w:kern w:val="0"/>
+                <w14:ligatures w14:val="none"/>
+              </w:rPr>
+            </w:pPr>
+            <w:r>
+              <w:rPr>
+                <w:rFonts w:ascii="Courier New" w:eastAsia="Times New Roman" w:hAnsi="Courier New" w:cs="Courier New"/>
+                <w:b/>
+                <w:bCs/>
                 <w:color w:val="000000"/>
                 <w:kern w:val="0"/>
                 <w14:ligatures w14:val="none"/>
@@ -7500,19 +7601,23 @@
               <w:cnfStyle w:val="000000100000" w:firstRow="0" w:lastRow="0" w:firstColumn="0" w:lastColumn="0" w:oddVBand="0" w:evenVBand="0" w:oddHBand="1" w:evenHBand="0" w:firstRowFirstColumn="0" w:firstRowLastColumn="0" w:lastRowFirstColumn="0" w:lastRowLastColumn="0"/>
               <w:rPr>
                 <w:rFonts w:ascii="Courier New" w:eastAsia="Times New Roman" w:hAnsi="Courier New" w:cs="Courier New"/>
-                <w:color w:val="000000"/>
-                <w:kern w:val="0"/>
-                <w14:ligatures w14:val="none"/>
-              </w:rPr>
-            </w:pPr>
-            <w:r>
-              <w:rPr>
-                <w:rFonts w:ascii="Courier New" w:eastAsia="Times New Roman" w:hAnsi="Courier New" w:cs="Courier New"/>
-                <w:color w:val="000000"/>
-                <w:kern w:val="0"/>
-                <w14:ligatures w14:val="none"/>
-              </w:rPr>
-              <w:t>19</w:t>
+                <w:b/>
+                <w:bCs/>
+                <w:color w:val="000000"/>
+                <w:kern w:val="0"/>
+                <w14:ligatures w14:val="none"/>
+              </w:rPr>
+            </w:pPr>
+            <w:r>
+              <w:rPr>
+                <w:rFonts w:ascii="Courier New" w:eastAsia="Times New Roman" w:hAnsi="Courier New" w:cs="Courier New"/>
+                <w:b/>
+                <w:bCs/>
+                <w:color w:val="000000"/>
+                <w:kern w:val="0"/>
+                <w14:ligatures w14:val="none"/>
+              </w:rPr>
+              <w:t>22</w:t>
             </w:r>
           </w:p>
         </w:tc>
@@ -7526,6 +7631,8 @@
               <w:cnfStyle w:val="000000100000" w:firstRow="0" w:lastRow="0" w:firstColumn="0" w:lastColumn="0" w:oddVBand="0" w:evenVBand="0" w:oddHBand="1" w:evenHBand="0" w:firstRowFirstColumn="0" w:firstRowLastColumn="0" w:lastRowFirstColumn="0" w:lastRowLastColumn="0"/>
               <w:rPr>
                 <w:rFonts w:ascii="Courier New" w:eastAsia="Times New Roman" w:hAnsi="Courier New" w:cs="Courier New"/>
+                <w:b/>
+                <w:bCs/>
                 <w:color w:val="000000"/>
                 <w:kern w:val="0"/>
                 <w14:ligatures w14:val="none"/>
@@ -7545,29 +7652,24 @@
             <w:tcW w:w="4405" w:type="dxa"/>
             <w:noWrap/>
             <w:vAlign w:val="center"/>
-            <w:hideMark/>
-          </w:tcPr>
-          <w:p>
-            <w:pPr>
-              <w:rPr>
-                <w:rFonts w:ascii="Courier New" w:eastAsia="Times New Roman" w:hAnsi="Courier New" w:cs="Courier New"/>
-                <w:b w:val="0"/>
-                <w:bCs w:val="0"/>
-                <w:color w:val="000000"/>
-                <w:kern w:val="0"/>
-                <w14:ligatures w14:val="none"/>
-              </w:rPr>
-            </w:pPr>
-            <w:r>
-              <w:rPr>
-                <w:rFonts w:ascii="Courier New" w:eastAsia="Times New Roman" w:hAnsi="Courier New" w:cs="Courier New"/>
-                <w:b w:val="0"/>
-                <w:bCs w:val="0"/>
-                <w:color w:val="000000"/>
-                <w:kern w:val="0"/>
-                <w14:ligatures w14:val="none"/>
-              </w:rPr>
-              <w:t>Black Pebbles</w:t>
+          </w:tcPr>
+          <w:p>
+            <w:pPr>
+              <w:rPr>
+                <w:rFonts w:ascii="Courier New" w:eastAsia="Times New Roman" w:hAnsi="Courier New" w:cs="Courier New"/>
+                <w:color w:val="000000"/>
+                <w:kern w:val="0"/>
+                <w14:ligatures w14:val="none"/>
+              </w:rPr>
+            </w:pPr>
+            <w:r>
+              <w:rPr>
+                <w:rFonts w:ascii="Courier New" w:eastAsia="Times New Roman" w:hAnsi="Courier New" w:cs="Courier New"/>
+                <w:color w:val="000000"/>
+                <w:kern w:val="0"/>
+                <w14:ligatures w14:val="none"/>
+              </w:rPr>
+              <w:t>Soda with lime in a glass</w:t>
             </w:r>
           </w:p>
         </w:tc>
@@ -7584,14 +7686,18 @@
               <w:cnfStyle w:val="000000000000" w:firstRow="0" w:lastRow="0" w:firstColumn="0" w:lastColumn="0" w:oddVBand="0" w:evenVBand="0" w:oddHBand="0" w:evenHBand="0" w:firstRowFirstColumn="0" w:firstRowLastColumn="0" w:lastRowFirstColumn="0" w:lastRowLastColumn="0"/>
               <w:rPr>
                 <w:rFonts w:ascii="Courier New" w:eastAsia="Times New Roman" w:hAnsi="Courier New" w:cs="Courier New"/>
-                <w:color w:val="000000"/>
-                <w:kern w:val="0"/>
-                <w14:ligatures w14:val="none"/>
-              </w:rPr>
-            </w:pPr>
-            <w:r>
-              <w:rPr>
-                <w:rFonts w:ascii="Courier New" w:eastAsia="Times New Roman" w:hAnsi="Courier New" w:cs="Courier New"/>
+                <w:b/>
+                <w:bCs/>
+                <w:color w:val="000000"/>
+                <w:kern w:val="0"/>
+                <w14:ligatures w14:val="none"/>
+              </w:rPr>
+            </w:pPr>
+            <w:r>
+              <w:rPr>
+                <w:rFonts w:ascii="Courier New" w:eastAsia="Times New Roman" w:hAnsi="Courier New" w:cs="Courier New"/>
+                <w:b/>
+                <w:bCs/>
                 <w:color w:val="000000"/>
                 <w:kern w:val="0"/>
                 <w14:ligatures w14:val="none"/>
@@ -7613,19 +7719,23 @@
               <w:cnfStyle w:val="000000000000" w:firstRow="0" w:lastRow="0" w:firstColumn="0" w:lastColumn="0" w:oddVBand="0" w:evenVBand="0" w:oddHBand="0" w:evenHBand="0" w:firstRowFirstColumn="0" w:firstRowLastColumn="0" w:lastRowFirstColumn="0" w:lastRowLastColumn="0"/>
               <w:rPr>
                 <w:rFonts w:ascii="Courier New" w:eastAsia="Times New Roman" w:hAnsi="Courier New" w:cs="Courier New"/>
-                <w:color w:val="000000"/>
-                <w:kern w:val="0"/>
-                <w14:ligatures w14:val="none"/>
-              </w:rPr>
-            </w:pPr>
-            <w:r>
-              <w:rPr>
-                <w:rFonts w:ascii="Courier New" w:eastAsia="Times New Roman" w:hAnsi="Courier New" w:cs="Courier New"/>
-                <w:color w:val="000000"/>
-                <w:kern w:val="0"/>
-                <w14:ligatures w14:val="none"/>
-              </w:rPr>
-              <w:t>20</w:t>
+                <w:b/>
+                <w:bCs/>
+                <w:color w:val="000000"/>
+                <w:kern w:val="0"/>
+                <w14:ligatures w14:val="none"/>
+              </w:rPr>
+            </w:pPr>
+            <w:r>
+              <w:rPr>
+                <w:rFonts w:ascii="Courier New" w:eastAsia="Times New Roman" w:hAnsi="Courier New" w:cs="Courier New"/>
+                <w:b/>
+                <w:bCs/>
+                <w:color w:val="000000"/>
+                <w:kern w:val="0"/>
+                <w14:ligatures w14:val="none"/>
+              </w:rPr>
+              <w:t>22</w:t>
             </w:r>
           </w:p>
         </w:tc>
@@ -7639,6 +7749,8 @@
               <w:cnfStyle w:val="000000000000" w:firstRow="0" w:lastRow="0" w:firstColumn="0" w:lastColumn="0" w:oddVBand="0" w:evenVBand="0" w:oddHBand="0" w:evenHBand="0" w:firstRowFirstColumn="0" w:firstRowLastColumn="0" w:lastRowFirstColumn="0" w:lastRowLastColumn="0"/>
               <w:rPr>
                 <w:rFonts w:ascii="Courier New" w:eastAsia="Times New Roman" w:hAnsi="Courier New" w:cs="Courier New"/>
+                <w:b/>
+                <w:bCs/>
                 <w:color w:val="000000"/>
                 <w:kern w:val="0"/>
                 <w14:ligatures w14:val="none"/>
@@ -7659,30 +7771,25 @@
             <w:tcW w:w="4405" w:type="dxa"/>
             <w:noWrap/>
             <w:vAlign w:val="center"/>
-            <w:hideMark/>
-          </w:tcPr>
-          <w:p>
-            <w:pPr>
-              <w:rPr>
-                <w:rFonts w:ascii="Courier New" w:eastAsia="Times New Roman" w:hAnsi="Courier New" w:cs="Courier New"/>
-                <w:b w:val="0"/>
-                <w:bCs w:val="0"/>
-                <w:color w:val="000000"/>
-                <w:kern w:val="0"/>
-                <w14:ligatures w14:val="none"/>
-              </w:rPr>
-            </w:pPr>
-            <w:r>
-              <w:rPr>
-                <w:rFonts w:ascii="Courier New" w:eastAsia="Times New Roman" w:hAnsi="Courier New" w:cs="Courier New"/>
-                <w:b w:val="0"/>
-                <w:bCs w:val="0"/>
+          </w:tcPr>
+          <w:p>
+            <w:pPr>
+              <w:rPr>
+                <w:rFonts w:ascii="Courier New" w:eastAsia="Times New Roman" w:hAnsi="Courier New" w:cs="Courier New"/>
+                <w:color w:val="000000"/>
+                <w:kern w:val="0"/>
+                <w14:ligatures w14:val="none"/>
+              </w:rPr>
+            </w:pPr>
+            <w:r>
+              <w:rPr>
+                <w:rFonts w:ascii="Courier New" w:eastAsia="Times New Roman" w:hAnsi="Courier New" w:cs="Courier New"/>
                 <w:color w:val="000000"/>
                 <w:kern w:val="0"/>
                 <w14:ligatures w14:val="none"/>
               </w:rPr>
               <w:lastRenderedPageBreak/>
-              <w:t>Tender Coconut</w:t>
+              <w:t>Sand</w:t>
             </w:r>
           </w:p>
         </w:tc>
@@ -7691,22 +7798,25 @@
             <w:tcW w:w="1890" w:type="dxa"/>
             <w:noWrap/>
             <w:vAlign w:val="center"/>
-            <w:hideMark/>
-          </w:tcPr>
-          <w:p>
-            <w:pPr>
-              <w:jc w:val="center"/>
-              <w:cnfStyle w:val="000000100000" w:firstRow="0" w:lastRow="0" w:firstColumn="0" w:lastColumn="0" w:oddVBand="0" w:evenVBand="0" w:oddHBand="1" w:evenHBand="0" w:firstRowFirstColumn="0" w:firstRowLastColumn="0" w:lastRowFirstColumn="0" w:lastRowLastColumn="0"/>
-              <w:rPr>
-                <w:rFonts w:ascii="Courier New" w:eastAsia="Times New Roman" w:hAnsi="Courier New" w:cs="Courier New"/>
-                <w:color w:val="000000"/>
-                <w:kern w:val="0"/>
-                <w14:ligatures w14:val="none"/>
-              </w:rPr>
-            </w:pPr>
-            <w:r>
-              <w:rPr>
-                <w:rFonts w:ascii="Courier New" w:eastAsia="Times New Roman" w:hAnsi="Courier New" w:cs="Courier New"/>
+          </w:tcPr>
+          <w:p>
+            <w:pPr>
+              <w:jc w:val="center"/>
+              <w:cnfStyle w:val="000000100000" w:firstRow="0" w:lastRow="0" w:firstColumn="0" w:lastColumn="0" w:oddVBand="0" w:evenVBand="0" w:oddHBand="1" w:evenHBand="0" w:firstRowFirstColumn="0" w:firstRowLastColumn="0" w:lastRowFirstColumn="0" w:lastRowLastColumn="0"/>
+              <w:rPr>
+                <w:rFonts w:ascii="Courier New" w:eastAsia="Times New Roman" w:hAnsi="Courier New" w:cs="Courier New"/>
+                <w:b/>
+                <w:bCs/>
+                <w:color w:val="000000"/>
+                <w:kern w:val="0"/>
+                <w14:ligatures w14:val="none"/>
+              </w:rPr>
+            </w:pPr>
+            <w:r>
+              <w:rPr>
+                <w:rFonts w:ascii="Courier New" w:eastAsia="Times New Roman" w:hAnsi="Courier New" w:cs="Courier New"/>
+                <w:b/>
+                <w:bCs/>
                 <w:color w:val="000000"/>
                 <w:kern w:val="0"/>
                 <w14:ligatures w14:val="none"/>
@@ -7720,27 +7830,30 @@
             <w:tcW w:w="3268" w:type="dxa"/>
             <w:noWrap/>
             <w:vAlign w:val="center"/>
-            <w:hideMark/>
-          </w:tcPr>
-          <w:p>
-            <w:pPr>
-              <w:jc w:val="center"/>
-              <w:cnfStyle w:val="000000100000" w:firstRow="0" w:lastRow="0" w:firstColumn="0" w:lastColumn="0" w:oddVBand="0" w:evenVBand="0" w:oddHBand="1" w:evenHBand="0" w:firstRowFirstColumn="0" w:firstRowLastColumn="0" w:lastRowFirstColumn="0" w:lastRowLastColumn="0"/>
-              <w:rPr>
-                <w:rFonts w:ascii="Courier New" w:eastAsia="Times New Roman" w:hAnsi="Courier New" w:cs="Courier New"/>
-                <w:color w:val="000000"/>
-                <w:kern w:val="0"/>
-                <w14:ligatures w14:val="none"/>
-              </w:rPr>
-            </w:pPr>
-            <w:r>
-              <w:rPr>
-                <w:rFonts w:ascii="Courier New" w:eastAsia="Times New Roman" w:hAnsi="Courier New" w:cs="Courier New"/>
-                <w:color w:val="000000"/>
-                <w:kern w:val="0"/>
-                <w14:ligatures w14:val="none"/>
-              </w:rPr>
-              <w:t>20</w:t>
+          </w:tcPr>
+          <w:p>
+            <w:pPr>
+              <w:jc w:val="center"/>
+              <w:cnfStyle w:val="000000100000" w:firstRow="0" w:lastRow="0" w:firstColumn="0" w:lastColumn="0" w:oddVBand="0" w:evenVBand="0" w:oddHBand="1" w:evenHBand="0" w:firstRowFirstColumn="0" w:firstRowLastColumn="0" w:lastRowFirstColumn="0" w:lastRowLastColumn="0"/>
+              <w:rPr>
+                <w:rFonts w:ascii="Courier New" w:eastAsia="Times New Roman" w:hAnsi="Courier New" w:cs="Courier New"/>
+                <w:b/>
+                <w:bCs/>
+                <w:color w:val="000000"/>
+                <w:kern w:val="0"/>
+                <w14:ligatures w14:val="none"/>
+              </w:rPr>
+            </w:pPr>
+            <w:r>
+              <w:rPr>
+                <w:rFonts w:ascii="Courier New" w:eastAsia="Times New Roman" w:hAnsi="Courier New" w:cs="Courier New"/>
+                <w:b/>
+                <w:bCs/>
+                <w:color w:val="000000"/>
+                <w:kern w:val="0"/>
+                <w14:ligatures w14:val="none"/>
+              </w:rPr>
+              <w:t>22</w:t>
             </w:r>
           </w:p>
         </w:tc>
@@ -7754,6 +7867,8 @@
               <w:cnfStyle w:val="000000100000" w:firstRow="0" w:lastRow="0" w:firstColumn="0" w:lastColumn="0" w:oddVBand="0" w:evenVBand="0" w:oddHBand="1" w:evenHBand="0" w:firstRowFirstColumn="0" w:firstRowLastColumn="0" w:lastRowFirstColumn="0" w:lastRowLastColumn="0"/>
               <w:rPr>
                 <w:rFonts w:ascii="Courier New" w:eastAsia="Times New Roman" w:hAnsi="Courier New" w:cs="Courier New"/>
+                <w:b/>
+                <w:bCs/>
                 <w:color w:val="000000"/>
                 <w:kern w:val="0"/>
                 <w14:ligatures w14:val="none"/>
@@ -7773,29 +7888,24 @@
             <w:tcW w:w="4405" w:type="dxa"/>
             <w:noWrap/>
             <w:vAlign w:val="center"/>
-            <w:hideMark/>
-          </w:tcPr>
-          <w:p>
-            <w:pPr>
-              <w:rPr>
-                <w:rFonts w:ascii="Courier New" w:eastAsia="Times New Roman" w:hAnsi="Courier New" w:cs="Courier New"/>
-                <w:b w:val="0"/>
-                <w:bCs w:val="0"/>
-                <w:color w:val="000000"/>
-                <w:kern w:val="0"/>
-                <w14:ligatures w14:val="none"/>
-              </w:rPr>
-            </w:pPr>
-            <w:r>
-              <w:rPr>
-                <w:rFonts w:ascii="Courier New" w:eastAsia="Times New Roman" w:hAnsi="Courier New" w:cs="Courier New"/>
-                <w:b w:val="0"/>
-                <w:bCs w:val="0"/>
-                <w:color w:val="000000"/>
-                <w:kern w:val="0"/>
-                <w14:ligatures w14:val="none"/>
-              </w:rPr>
-              <w:t>Whiskey Bottle</w:t>
+          </w:tcPr>
+          <w:p>
+            <w:pPr>
+              <w:rPr>
+                <w:rFonts w:ascii="Courier New" w:eastAsia="Times New Roman" w:hAnsi="Courier New" w:cs="Courier New"/>
+                <w:color w:val="000000"/>
+                <w:kern w:val="0"/>
+                <w14:ligatures w14:val="none"/>
+              </w:rPr>
+            </w:pPr>
+            <w:r>
+              <w:rPr>
+                <w:rFonts w:ascii="Courier New" w:eastAsia="Times New Roman" w:hAnsi="Courier New" w:cs="Courier New"/>
+                <w:color w:val="000000"/>
+                <w:kern w:val="0"/>
+                <w14:ligatures w14:val="none"/>
+              </w:rPr>
+              <w:t>Vase with flowers</w:t>
             </w:r>
           </w:p>
         </w:tc>
@@ -7812,14 +7922,18 @@
               <w:cnfStyle w:val="000000000000" w:firstRow="0" w:lastRow="0" w:firstColumn="0" w:lastColumn="0" w:oddVBand="0" w:evenVBand="0" w:oddHBand="0" w:evenHBand="0" w:firstRowFirstColumn="0" w:firstRowLastColumn="0" w:lastRowFirstColumn="0" w:lastRowLastColumn="0"/>
               <w:rPr>
                 <w:rFonts w:ascii="Courier New" w:eastAsia="Times New Roman" w:hAnsi="Courier New" w:cs="Courier New"/>
-                <w:color w:val="000000"/>
-                <w:kern w:val="0"/>
-                <w14:ligatures w14:val="none"/>
-              </w:rPr>
-            </w:pPr>
-            <w:r>
-              <w:rPr>
-                <w:rFonts w:ascii="Courier New" w:eastAsia="Times New Roman" w:hAnsi="Courier New" w:cs="Courier New"/>
+                <w:b/>
+                <w:bCs/>
+                <w:color w:val="000000"/>
+                <w:kern w:val="0"/>
+                <w14:ligatures w14:val="none"/>
+              </w:rPr>
+            </w:pPr>
+            <w:r>
+              <w:rPr>
+                <w:rFonts w:ascii="Courier New" w:eastAsia="Times New Roman" w:hAnsi="Courier New" w:cs="Courier New"/>
+                <w:b/>
+                <w:bCs/>
                 <w:color w:val="000000"/>
                 <w:kern w:val="0"/>
                 <w14:ligatures w14:val="none"/>
@@ -7841,19 +7955,23 @@
               <w:cnfStyle w:val="000000000000" w:firstRow="0" w:lastRow="0" w:firstColumn="0" w:lastColumn="0" w:oddVBand="0" w:evenVBand="0" w:oddHBand="0" w:evenHBand="0" w:firstRowFirstColumn="0" w:firstRowLastColumn="0" w:lastRowFirstColumn="0" w:lastRowLastColumn="0"/>
               <w:rPr>
                 <w:rFonts w:ascii="Courier New" w:eastAsia="Times New Roman" w:hAnsi="Courier New" w:cs="Courier New"/>
-                <w:color w:val="000000"/>
-                <w:kern w:val="0"/>
-                <w14:ligatures w14:val="none"/>
-              </w:rPr>
-            </w:pPr>
-            <w:r>
-              <w:rPr>
-                <w:rFonts w:ascii="Courier New" w:eastAsia="Times New Roman" w:hAnsi="Courier New" w:cs="Courier New"/>
-                <w:color w:val="000000"/>
-                <w:kern w:val="0"/>
-                <w14:ligatures w14:val="none"/>
-              </w:rPr>
-              <w:t>20</w:t>
+                <w:b/>
+                <w:bCs/>
+                <w:color w:val="000000"/>
+                <w:kern w:val="0"/>
+                <w14:ligatures w14:val="none"/>
+              </w:rPr>
+            </w:pPr>
+            <w:r>
+              <w:rPr>
+                <w:rFonts w:ascii="Courier New" w:eastAsia="Times New Roman" w:hAnsi="Courier New" w:cs="Courier New"/>
+                <w:b/>
+                <w:bCs/>
+                <w:color w:val="000000"/>
+                <w:kern w:val="0"/>
+                <w14:ligatures w14:val="none"/>
+              </w:rPr>
+              <w:t>22</w:t>
             </w:r>
           </w:p>
         </w:tc>
@@ -7867,6 +7985,8 @@
               <w:cnfStyle w:val="000000000000" w:firstRow="0" w:lastRow="0" w:firstColumn="0" w:lastColumn="0" w:oddVBand="0" w:evenVBand="0" w:oddHBand="0" w:evenHBand="0" w:firstRowFirstColumn="0" w:firstRowLastColumn="0" w:lastRowFirstColumn="0" w:lastRowLastColumn="0"/>
               <w:rPr>
                 <w:rFonts w:ascii="Courier New" w:eastAsia="Times New Roman" w:hAnsi="Courier New" w:cs="Courier New"/>
+                <w:b/>
+                <w:bCs/>
                 <w:color w:val="000000"/>
                 <w:kern w:val="0"/>
                 <w14:ligatures w14:val="none"/>
@@ -7893,23 +8013,19 @@
             <w:pPr>
               <w:rPr>
                 <w:rFonts w:ascii="Courier New" w:eastAsia="Times New Roman" w:hAnsi="Courier New" w:cs="Courier New"/>
-                <w:b w:val="0"/>
-                <w:bCs w:val="0"/>
-                <w:color w:val="000000"/>
-                <w:kern w:val="0"/>
-                <w14:ligatures w14:val="none"/>
-              </w:rPr>
-            </w:pPr>
-            <w:r>
-              <w:rPr>
-                <w:rFonts w:ascii="Courier New" w:eastAsia="Times New Roman" w:hAnsi="Courier New" w:cs="Courier New"/>
-                <w:b w:val="0"/>
-                <w:bCs w:val="0"/>
-                <w:color w:val="000000"/>
-                <w:kern w:val="0"/>
-                <w14:ligatures w14:val="none"/>
-              </w:rPr>
-              <w:t>Smoke creator</w:t>
+                <w:color w:val="000000"/>
+                <w:kern w:val="0"/>
+                <w14:ligatures w14:val="none"/>
+              </w:rPr>
+            </w:pPr>
+            <w:r>
+              <w:rPr>
+                <w:rFonts w:ascii="Courier New" w:eastAsia="Times New Roman" w:hAnsi="Courier New" w:cs="Courier New"/>
+                <w:color w:val="000000"/>
+                <w:kern w:val="0"/>
+                <w14:ligatures w14:val="none"/>
+              </w:rPr>
+              <w:t>Puffed Rice</w:t>
             </w:r>
           </w:p>
         </w:tc>
@@ -7926,14 +8042,18 @@
               <w:cnfStyle w:val="000000100000" w:firstRow="0" w:lastRow="0" w:firstColumn="0" w:lastColumn="0" w:oddVBand="0" w:evenVBand="0" w:oddHBand="1" w:evenHBand="0" w:firstRowFirstColumn="0" w:firstRowLastColumn="0" w:lastRowFirstColumn="0" w:lastRowLastColumn="0"/>
               <w:rPr>
                 <w:rFonts w:ascii="Courier New" w:eastAsia="Times New Roman" w:hAnsi="Courier New" w:cs="Courier New"/>
-                <w:color w:val="000000"/>
-                <w:kern w:val="0"/>
-                <w14:ligatures w14:val="none"/>
-              </w:rPr>
-            </w:pPr>
-            <w:r>
-              <w:rPr>
-                <w:rFonts w:ascii="Courier New" w:eastAsia="Times New Roman" w:hAnsi="Courier New" w:cs="Courier New"/>
+                <w:b/>
+                <w:bCs/>
+                <w:color w:val="000000"/>
+                <w:kern w:val="0"/>
+                <w14:ligatures w14:val="none"/>
+              </w:rPr>
+            </w:pPr>
+            <w:r>
+              <w:rPr>
+                <w:rFonts w:ascii="Courier New" w:eastAsia="Times New Roman" w:hAnsi="Courier New" w:cs="Courier New"/>
+                <w:b/>
+                <w:bCs/>
                 <w:color w:val="000000"/>
                 <w:kern w:val="0"/>
                 <w14:ligatures w14:val="none"/>
@@ -7955,19 +8075,23 @@
               <w:cnfStyle w:val="000000100000" w:firstRow="0" w:lastRow="0" w:firstColumn="0" w:lastColumn="0" w:oddVBand="0" w:evenVBand="0" w:oddHBand="1" w:evenHBand="0" w:firstRowFirstColumn="0" w:firstRowLastColumn="0" w:lastRowFirstColumn="0" w:lastRowLastColumn="0"/>
               <w:rPr>
                 <w:rFonts w:ascii="Courier New" w:eastAsia="Times New Roman" w:hAnsi="Courier New" w:cs="Courier New"/>
-                <w:color w:val="000000"/>
-                <w:kern w:val="0"/>
-                <w14:ligatures w14:val="none"/>
-              </w:rPr>
-            </w:pPr>
-            <w:r>
-              <w:rPr>
-                <w:rFonts w:ascii="Courier New" w:eastAsia="Times New Roman" w:hAnsi="Courier New" w:cs="Courier New"/>
-                <w:color w:val="000000"/>
-                <w:kern w:val="0"/>
-                <w14:ligatures w14:val="none"/>
-              </w:rPr>
-              <w:t>20</w:t>
+                <w:b/>
+                <w:bCs/>
+                <w:color w:val="000000"/>
+                <w:kern w:val="0"/>
+                <w14:ligatures w14:val="none"/>
+              </w:rPr>
+            </w:pPr>
+            <w:r>
+              <w:rPr>
+                <w:rFonts w:ascii="Courier New" w:eastAsia="Times New Roman" w:hAnsi="Courier New" w:cs="Courier New"/>
+                <w:b/>
+                <w:bCs/>
+                <w:color w:val="000000"/>
+                <w:kern w:val="0"/>
+                <w14:ligatures w14:val="none"/>
+              </w:rPr>
+              <w:t>22</w:t>
             </w:r>
           </w:p>
         </w:tc>
@@ -7981,6 +8105,8 @@
               <w:cnfStyle w:val="000000100000" w:firstRow="0" w:lastRow="0" w:firstColumn="0" w:lastColumn="0" w:oddVBand="0" w:evenVBand="0" w:oddHBand="1" w:evenHBand="0" w:firstRowFirstColumn="0" w:firstRowLastColumn="0" w:lastRowFirstColumn="0" w:lastRowLastColumn="0"/>
               <w:rPr>
                 <w:rFonts w:ascii="Courier New" w:eastAsia="Times New Roman" w:hAnsi="Courier New" w:cs="Courier New"/>
+                <w:b/>
+                <w:bCs/>
                 <w:color w:val="000000"/>
                 <w:kern w:val="0"/>
                 <w14:ligatures w14:val="none"/>
@@ -8006,23 +8132,19 @@
             <w:pPr>
               <w:rPr>
                 <w:rFonts w:ascii="Courier New" w:eastAsia="Times New Roman" w:hAnsi="Courier New" w:cs="Courier New"/>
-                <w:b w:val="0"/>
-                <w:bCs w:val="0"/>
-                <w:color w:val="000000"/>
-                <w:kern w:val="0"/>
-                <w14:ligatures w14:val="none"/>
-              </w:rPr>
-            </w:pPr>
-            <w:r>
-              <w:rPr>
-                <w:rFonts w:ascii="Courier New" w:eastAsia="Times New Roman" w:hAnsi="Courier New" w:cs="Courier New"/>
-                <w:b w:val="0"/>
-                <w:bCs w:val="0"/>
-                <w:color w:val="000000"/>
-                <w:kern w:val="0"/>
-                <w14:ligatures w14:val="none"/>
-              </w:rPr>
-              <w:t>An old TV</w:t>
+                <w:color w:val="000000"/>
+                <w:kern w:val="0"/>
+                <w14:ligatures w14:val="none"/>
+              </w:rPr>
+            </w:pPr>
+            <w:r>
+              <w:rPr>
+                <w:rFonts w:ascii="Courier New" w:eastAsia="Times New Roman" w:hAnsi="Courier New" w:cs="Courier New"/>
+                <w:color w:val="000000"/>
+                <w:kern w:val="0"/>
+                <w14:ligatures w14:val="none"/>
+              </w:rPr>
+              <w:t>Tender Coconut</w:t>
             </w:r>
           </w:p>
         </w:tc>
@@ -8039,14 +8161,18 @@
               <w:cnfStyle w:val="000000000000" w:firstRow="0" w:lastRow="0" w:firstColumn="0" w:lastColumn="0" w:oddVBand="0" w:evenVBand="0" w:oddHBand="0" w:evenHBand="0" w:firstRowFirstColumn="0" w:firstRowLastColumn="0" w:lastRowFirstColumn="0" w:lastRowLastColumn="0"/>
               <w:rPr>
                 <w:rFonts w:ascii="Courier New" w:eastAsia="Times New Roman" w:hAnsi="Courier New" w:cs="Courier New"/>
-                <w:color w:val="000000"/>
-                <w:kern w:val="0"/>
-                <w14:ligatures w14:val="none"/>
-              </w:rPr>
-            </w:pPr>
-            <w:r>
-              <w:rPr>
-                <w:rFonts w:ascii="Courier New" w:eastAsia="Times New Roman" w:hAnsi="Courier New" w:cs="Courier New"/>
+                <w:b/>
+                <w:bCs/>
+                <w:color w:val="000000"/>
+                <w:kern w:val="0"/>
+                <w14:ligatures w14:val="none"/>
+              </w:rPr>
+            </w:pPr>
+            <w:r>
+              <w:rPr>
+                <w:rFonts w:ascii="Courier New" w:eastAsia="Times New Roman" w:hAnsi="Courier New" w:cs="Courier New"/>
+                <w:b/>
+                <w:bCs/>
                 <w:color w:val="000000"/>
                 <w:kern w:val="0"/>
                 <w14:ligatures w14:val="none"/>
@@ -8068,14 +8194,18 @@
               <w:cnfStyle w:val="000000000000" w:firstRow="0" w:lastRow="0" w:firstColumn="0" w:lastColumn="0" w:oddVBand="0" w:evenVBand="0" w:oddHBand="0" w:evenHBand="0" w:firstRowFirstColumn="0" w:firstRowLastColumn="0" w:lastRowFirstColumn="0" w:lastRowLastColumn="0"/>
               <w:rPr>
                 <w:rFonts w:ascii="Courier New" w:eastAsia="Times New Roman" w:hAnsi="Courier New" w:cs="Courier New"/>
-                <w:color w:val="000000"/>
-                <w:kern w:val="0"/>
-                <w14:ligatures w14:val="none"/>
-              </w:rPr>
-            </w:pPr>
-            <w:r>
-              <w:rPr>
-                <w:rFonts w:ascii="Courier New" w:eastAsia="Times New Roman" w:hAnsi="Courier New" w:cs="Courier New"/>
+                <w:b/>
+                <w:bCs/>
+                <w:color w:val="000000"/>
+                <w:kern w:val="0"/>
+                <w14:ligatures w14:val="none"/>
+              </w:rPr>
+            </w:pPr>
+            <w:r>
+              <w:rPr>
+                <w:rFonts w:ascii="Courier New" w:eastAsia="Times New Roman" w:hAnsi="Courier New" w:cs="Courier New"/>
+                <w:b/>
+                <w:bCs/>
                 <w:color w:val="000000"/>
                 <w:kern w:val="0"/>
                 <w14:ligatures w14:val="none"/>
@@ -8094,6 +8224,8 @@
               <w:cnfStyle w:val="000000000000" w:firstRow="0" w:lastRow="0" w:firstColumn="0" w:lastColumn="0" w:oddVBand="0" w:evenVBand="0" w:oddHBand="0" w:evenHBand="0" w:firstRowFirstColumn="0" w:firstRowLastColumn="0" w:lastRowFirstColumn="0" w:lastRowLastColumn="0"/>
               <w:rPr>
                 <w:rFonts w:ascii="Courier New" w:eastAsia="Times New Roman" w:hAnsi="Courier New" w:cs="Courier New"/>
+                <w:b/>
+                <w:bCs/>
                 <w:color w:val="000000"/>
                 <w:kern w:val="0"/>
                 <w14:ligatures w14:val="none"/>
@@ -8114,29 +8246,24 @@
             <w:tcW w:w="4405" w:type="dxa"/>
             <w:noWrap/>
             <w:vAlign w:val="center"/>
-            <w:hideMark/>
-          </w:tcPr>
-          <w:p>
-            <w:pPr>
-              <w:rPr>
-                <w:rFonts w:ascii="Courier New" w:eastAsia="Times New Roman" w:hAnsi="Courier New" w:cs="Courier New"/>
-                <w:b w:val="0"/>
-                <w:bCs w:val="0"/>
-                <w:color w:val="000000"/>
-                <w:kern w:val="0"/>
-                <w14:ligatures w14:val="none"/>
-              </w:rPr>
-            </w:pPr>
-            <w:r>
-              <w:rPr>
-                <w:rFonts w:ascii="Courier New" w:eastAsia="Times New Roman" w:hAnsi="Courier New" w:cs="Courier New"/>
-                <w:b w:val="0"/>
-                <w:bCs w:val="0"/>
-                <w:color w:val="000000"/>
-                <w:kern w:val="0"/>
-                <w14:ligatures w14:val="none"/>
-              </w:rPr>
-              <w:t>Half-burnt doobie</w:t>
+          </w:tcPr>
+          <w:p>
+            <w:pPr>
+              <w:rPr>
+                <w:rFonts w:ascii="Courier New" w:eastAsia="Times New Roman" w:hAnsi="Courier New" w:cs="Courier New"/>
+                <w:color w:val="000000"/>
+                <w:kern w:val="0"/>
+                <w14:ligatures w14:val="none"/>
+              </w:rPr>
+            </w:pPr>
+            <w:r>
+              <w:rPr>
+                <w:rFonts w:ascii="Courier New" w:eastAsia="Times New Roman" w:hAnsi="Courier New" w:cs="Courier New"/>
+                <w:color w:val="000000"/>
+                <w:kern w:val="0"/>
+                <w14:ligatures w14:val="none"/>
+              </w:rPr>
+              <w:t>Knife</w:t>
             </w:r>
           </w:p>
         </w:tc>
@@ -8145,22 +8272,25 @@
             <w:tcW w:w="1890" w:type="dxa"/>
             <w:noWrap/>
             <w:vAlign w:val="center"/>
-            <w:hideMark/>
-          </w:tcPr>
-          <w:p>
-            <w:pPr>
-              <w:jc w:val="center"/>
-              <w:cnfStyle w:val="000000100000" w:firstRow="0" w:lastRow="0" w:firstColumn="0" w:lastColumn="0" w:oddVBand="0" w:evenVBand="0" w:oddHBand="1" w:evenHBand="0" w:firstRowFirstColumn="0" w:firstRowLastColumn="0" w:lastRowFirstColumn="0" w:lastRowLastColumn="0"/>
-              <w:rPr>
-                <w:rFonts w:ascii="Courier New" w:eastAsia="Times New Roman" w:hAnsi="Courier New" w:cs="Courier New"/>
-                <w:color w:val="000000"/>
-                <w:kern w:val="0"/>
-                <w14:ligatures w14:val="none"/>
-              </w:rPr>
-            </w:pPr>
-            <w:r>
-              <w:rPr>
-                <w:rFonts w:ascii="Courier New" w:eastAsia="Times New Roman" w:hAnsi="Courier New" w:cs="Courier New"/>
+          </w:tcPr>
+          <w:p>
+            <w:pPr>
+              <w:jc w:val="center"/>
+              <w:cnfStyle w:val="000000100000" w:firstRow="0" w:lastRow="0" w:firstColumn="0" w:lastColumn="0" w:oddVBand="0" w:evenVBand="0" w:oddHBand="1" w:evenHBand="0" w:firstRowFirstColumn="0" w:firstRowLastColumn="0" w:lastRowFirstColumn="0" w:lastRowLastColumn="0"/>
+              <w:rPr>
+                <w:rFonts w:ascii="Courier New" w:eastAsia="Times New Roman" w:hAnsi="Courier New" w:cs="Courier New"/>
+                <w:b/>
+                <w:bCs/>
+                <w:color w:val="000000"/>
+                <w:kern w:val="0"/>
+                <w14:ligatures w14:val="none"/>
+              </w:rPr>
+            </w:pPr>
+            <w:r>
+              <w:rPr>
+                <w:rFonts w:ascii="Courier New" w:eastAsia="Times New Roman" w:hAnsi="Courier New" w:cs="Courier New"/>
+                <w:b/>
+                <w:bCs/>
                 <w:color w:val="000000"/>
                 <w:kern w:val="0"/>
                 <w14:ligatures w14:val="none"/>
@@ -8174,22 +8304,25 @@
             <w:tcW w:w="3268" w:type="dxa"/>
             <w:noWrap/>
             <w:vAlign w:val="center"/>
-            <w:hideMark/>
-          </w:tcPr>
-          <w:p>
-            <w:pPr>
-              <w:jc w:val="center"/>
-              <w:cnfStyle w:val="000000100000" w:firstRow="0" w:lastRow="0" w:firstColumn="0" w:lastColumn="0" w:oddVBand="0" w:evenVBand="0" w:oddHBand="1" w:evenHBand="0" w:firstRowFirstColumn="0" w:firstRowLastColumn="0" w:lastRowFirstColumn="0" w:lastRowLastColumn="0"/>
-              <w:rPr>
-                <w:rFonts w:ascii="Courier New" w:eastAsia="Times New Roman" w:hAnsi="Courier New" w:cs="Courier New"/>
-                <w:color w:val="000000"/>
-                <w:kern w:val="0"/>
-                <w14:ligatures w14:val="none"/>
-              </w:rPr>
-            </w:pPr>
-            <w:r>
-              <w:rPr>
-                <w:rFonts w:ascii="Courier New" w:eastAsia="Times New Roman" w:hAnsi="Courier New" w:cs="Courier New"/>
+          </w:tcPr>
+          <w:p>
+            <w:pPr>
+              <w:jc w:val="center"/>
+              <w:cnfStyle w:val="000000100000" w:firstRow="0" w:lastRow="0" w:firstColumn="0" w:lastColumn="0" w:oddVBand="0" w:evenVBand="0" w:oddHBand="1" w:evenHBand="0" w:firstRowFirstColumn="0" w:firstRowLastColumn="0" w:lastRowFirstColumn="0" w:lastRowLastColumn="0"/>
+              <w:rPr>
+                <w:rFonts w:ascii="Courier New" w:eastAsia="Times New Roman" w:hAnsi="Courier New" w:cs="Courier New"/>
+                <w:b/>
+                <w:bCs/>
+                <w:color w:val="000000"/>
+                <w:kern w:val="0"/>
+                <w14:ligatures w14:val="none"/>
+              </w:rPr>
+            </w:pPr>
+            <w:r>
+              <w:rPr>
+                <w:rFonts w:ascii="Courier New" w:eastAsia="Times New Roman" w:hAnsi="Courier New" w:cs="Courier New"/>
+                <w:b/>
+                <w:bCs/>
                 <w:color w:val="000000"/>
                 <w:kern w:val="0"/>
                 <w14:ligatures w14:val="none"/>
@@ -8208,6 +8341,8 @@
               <w:cnfStyle w:val="000000100000" w:firstRow="0" w:lastRow="0" w:firstColumn="0" w:lastColumn="0" w:oddVBand="0" w:evenVBand="0" w:oddHBand="1" w:evenHBand="0" w:firstRowFirstColumn="0" w:firstRowLastColumn="0" w:lastRowFirstColumn="0" w:lastRowLastColumn="0"/>
               <w:rPr>
                 <w:rFonts w:ascii="Courier New" w:eastAsia="Times New Roman" w:hAnsi="Courier New" w:cs="Courier New"/>
+                <w:b/>
+                <w:bCs/>
                 <w:color w:val="000000"/>
                 <w:kern w:val="0"/>
                 <w14:ligatures w14:val="none"/>
@@ -8227,29 +8362,24 @@
             <w:tcW w:w="4405" w:type="dxa"/>
             <w:noWrap/>
             <w:vAlign w:val="center"/>
-            <w:hideMark/>
-          </w:tcPr>
-          <w:p>
-            <w:pPr>
-              <w:rPr>
-                <w:rFonts w:ascii="Courier New" w:eastAsia="Times New Roman" w:hAnsi="Courier New" w:cs="Courier New"/>
-                <w:b w:val="0"/>
-                <w:bCs w:val="0"/>
-                <w:color w:val="000000"/>
-                <w:kern w:val="0"/>
-                <w14:ligatures w14:val="none"/>
-              </w:rPr>
-            </w:pPr>
-            <w:r>
-              <w:rPr>
-                <w:rFonts w:ascii="Courier New" w:eastAsia="Times New Roman" w:hAnsi="Courier New" w:cs="Courier New"/>
-                <w:b w:val="0"/>
-                <w:bCs w:val="0"/>
-                <w:color w:val="000000"/>
-                <w:kern w:val="0"/>
-                <w14:ligatures w14:val="none"/>
-              </w:rPr>
-              <w:t>TV remote</w:t>
+          </w:tcPr>
+          <w:p>
+            <w:pPr>
+              <w:rPr>
+                <w:rFonts w:ascii="Courier New" w:eastAsia="Times New Roman" w:hAnsi="Courier New" w:cs="Courier New"/>
+                <w:color w:val="000000"/>
+                <w:kern w:val="0"/>
+                <w14:ligatures w14:val="none"/>
+              </w:rPr>
+            </w:pPr>
+            <w:r>
+              <w:rPr>
+                <w:rFonts w:ascii="Courier New" w:eastAsia="Times New Roman" w:hAnsi="Courier New" w:cs="Courier New"/>
+                <w:color w:val="000000"/>
+                <w:kern w:val="0"/>
+                <w14:ligatures w14:val="none"/>
+              </w:rPr>
+              <w:t>Ash</w:t>
             </w:r>
           </w:p>
         </w:tc>
@@ -8258,27 +8388,30 @@
             <w:tcW w:w="1890" w:type="dxa"/>
             <w:noWrap/>
             <w:vAlign w:val="center"/>
-            <w:hideMark/>
-          </w:tcPr>
-          <w:p>
-            <w:pPr>
-              <w:jc w:val="center"/>
-              <w:cnfStyle w:val="000000000000" w:firstRow="0" w:lastRow="0" w:firstColumn="0" w:lastColumn="0" w:oddVBand="0" w:evenVBand="0" w:oddHBand="0" w:evenHBand="0" w:firstRowFirstColumn="0" w:firstRowLastColumn="0" w:lastRowFirstColumn="0" w:lastRowLastColumn="0"/>
-              <w:rPr>
-                <w:rFonts w:ascii="Courier New" w:eastAsia="Times New Roman" w:hAnsi="Courier New" w:cs="Courier New"/>
-                <w:color w:val="000000"/>
-                <w:kern w:val="0"/>
-                <w14:ligatures w14:val="none"/>
-              </w:rPr>
-            </w:pPr>
-            <w:r>
-              <w:rPr>
-                <w:rFonts w:ascii="Courier New" w:eastAsia="Times New Roman" w:hAnsi="Courier New" w:cs="Courier New"/>
-                <w:color w:val="000000"/>
-                <w:kern w:val="0"/>
-                <w14:ligatures w14:val="none"/>
-              </w:rPr>
-              <w:t>1</w:t>
+          </w:tcPr>
+          <w:p>
+            <w:pPr>
+              <w:jc w:val="center"/>
+              <w:cnfStyle w:val="000000000000" w:firstRow="0" w:lastRow="0" w:firstColumn="0" w:lastColumn="0" w:oddVBand="0" w:evenVBand="0" w:oddHBand="0" w:evenHBand="0" w:firstRowFirstColumn="0" w:firstRowLastColumn="0" w:lastRowFirstColumn="0" w:lastRowLastColumn="0"/>
+              <w:rPr>
+                <w:rFonts w:ascii="Courier New" w:eastAsia="Times New Roman" w:hAnsi="Courier New" w:cs="Courier New"/>
+                <w:b/>
+                <w:bCs/>
+                <w:color w:val="000000"/>
+                <w:kern w:val="0"/>
+                <w14:ligatures w14:val="none"/>
+              </w:rPr>
+            </w:pPr>
+            <w:r>
+              <w:rPr>
+                <w:rFonts w:ascii="Courier New" w:eastAsia="Times New Roman" w:hAnsi="Courier New" w:cs="Courier New"/>
+                <w:b/>
+                <w:bCs/>
+                <w:color w:val="000000"/>
+                <w:kern w:val="0"/>
+                <w14:ligatures w14:val="none"/>
+              </w:rPr>
+              <w:t xml:space="preserve">1 </w:t>
             </w:r>
           </w:p>
         </w:tc>
@@ -8287,22 +8420,25 @@
             <w:tcW w:w="3268" w:type="dxa"/>
             <w:noWrap/>
             <w:vAlign w:val="center"/>
-            <w:hideMark/>
-          </w:tcPr>
-          <w:p>
-            <w:pPr>
-              <w:jc w:val="center"/>
-              <w:cnfStyle w:val="000000000000" w:firstRow="0" w:lastRow="0" w:firstColumn="0" w:lastColumn="0" w:oddVBand="0" w:evenVBand="0" w:oddHBand="0" w:evenHBand="0" w:firstRowFirstColumn="0" w:firstRowLastColumn="0" w:lastRowFirstColumn="0" w:lastRowLastColumn="0"/>
-              <w:rPr>
-                <w:rFonts w:ascii="Courier New" w:eastAsia="Times New Roman" w:hAnsi="Courier New" w:cs="Courier New"/>
-                <w:color w:val="000000"/>
-                <w:kern w:val="0"/>
-                <w14:ligatures w14:val="none"/>
-              </w:rPr>
-            </w:pPr>
-            <w:r>
-              <w:rPr>
-                <w:rFonts w:ascii="Courier New" w:eastAsia="Times New Roman" w:hAnsi="Courier New" w:cs="Courier New"/>
+          </w:tcPr>
+          <w:p>
+            <w:pPr>
+              <w:jc w:val="center"/>
+              <w:cnfStyle w:val="000000000000" w:firstRow="0" w:lastRow="0" w:firstColumn="0" w:lastColumn="0" w:oddVBand="0" w:evenVBand="0" w:oddHBand="0" w:evenHBand="0" w:firstRowFirstColumn="0" w:firstRowLastColumn="0" w:lastRowFirstColumn="0" w:lastRowLastColumn="0"/>
+              <w:rPr>
+                <w:rFonts w:ascii="Courier New" w:eastAsia="Times New Roman" w:hAnsi="Courier New" w:cs="Courier New"/>
+                <w:b/>
+                <w:bCs/>
+                <w:color w:val="000000"/>
+                <w:kern w:val="0"/>
+                <w14:ligatures w14:val="none"/>
+              </w:rPr>
+            </w:pPr>
+            <w:r>
+              <w:rPr>
+                <w:rFonts w:ascii="Courier New" w:eastAsia="Times New Roman" w:hAnsi="Courier New" w:cs="Courier New"/>
+                <w:b/>
+                <w:bCs/>
                 <w:color w:val="000000"/>
                 <w:kern w:val="0"/>
                 <w14:ligatures w14:val="none"/>
@@ -8321,6 +8457,8 @@
               <w:cnfStyle w:val="000000000000" w:firstRow="0" w:lastRow="0" w:firstColumn="0" w:lastColumn="0" w:oddVBand="0" w:evenVBand="0" w:oddHBand="0" w:evenHBand="0" w:firstRowFirstColumn="0" w:firstRowLastColumn="0" w:lastRowFirstColumn="0" w:lastRowLastColumn="0"/>
               <w:rPr>
                 <w:rFonts w:ascii="Courier New" w:eastAsia="Times New Roman" w:hAnsi="Courier New" w:cs="Courier New"/>
+                <w:b/>
+                <w:bCs/>
                 <w:color w:val="000000"/>
                 <w:kern w:val="0"/>
                 <w14:ligatures w14:val="none"/>
@@ -8347,23 +8485,19 @@
             <w:pPr>
               <w:rPr>
                 <w:rFonts w:ascii="Courier New" w:eastAsia="Times New Roman" w:hAnsi="Courier New" w:cs="Courier New"/>
-                <w:b w:val="0"/>
-                <w:bCs w:val="0"/>
-                <w:color w:val="000000"/>
-                <w:kern w:val="0"/>
-                <w14:ligatures w14:val="none"/>
-              </w:rPr>
-            </w:pPr>
-            <w:r>
-              <w:rPr>
-                <w:rFonts w:ascii="Courier New" w:eastAsia="Times New Roman" w:hAnsi="Courier New" w:cs="Courier New"/>
-                <w:b w:val="0"/>
-                <w:bCs w:val="0"/>
-                <w:color w:val="000000"/>
-                <w:kern w:val="0"/>
-                <w14:ligatures w14:val="none"/>
-              </w:rPr>
-              <w:t>TV Plug on the wall to pull out</w:t>
+                <w:color w:val="000000"/>
+                <w:kern w:val="0"/>
+                <w14:ligatures w14:val="none"/>
+              </w:rPr>
+            </w:pPr>
+            <w:r>
+              <w:rPr>
+                <w:rFonts w:ascii="Courier New" w:eastAsia="Times New Roman" w:hAnsi="Courier New" w:cs="Courier New"/>
+                <w:color w:val="000000"/>
+                <w:kern w:val="0"/>
+                <w14:ligatures w14:val="none"/>
+              </w:rPr>
+              <w:t>Smoke creator</w:t>
             </w:r>
           </w:p>
         </w:tc>
@@ -8380,14 +8514,18 @@
               <w:cnfStyle w:val="000000100000" w:firstRow="0" w:lastRow="0" w:firstColumn="0" w:lastColumn="0" w:oddVBand="0" w:evenVBand="0" w:oddHBand="1" w:evenHBand="0" w:firstRowFirstColumn="0" w:firstRowLastColumn="0" w:lastRowFirstColumn="0" w:lastRowLastColumn="0"/>
               <w:rPr>
                 <w:rFonts w:ascii="Courier New" w:eastAsia="Times New Roman" w:hAnsi="Courier New" w:cs="Courier New"/>
-                <w:color w:val="000000"/>
-                <w:kern w:val="0"/>
-                <w14:ligatures w14:val="none"/>
-              </w:rPr>
-            </w:pPr>
-            <w:r>
-              <w:rPr>
-                <w:rFonts w:ascii="Courier New" w:eastAsia="Times New Roman" w:hAnsi="Courier New" w:cs="Courier New"/>
+                <w:b/>
+                <w:bCs/>
+                <w:color w:val="000000"/>
+                <w:kern w:val="0"/>
+                <w14:ligatures w14:val="none"/>
+              </w:rPr>
+            </w:pPr>
+            <w:r>
+              <w:rPr>
+                <w:rFonts w:ascii="Courier New" w:eastAsia="Times New Roman" w:hAnsi="Courier New" w:cs="Courier New"/>
+                <w:b/>
+                <w:bCs/>
                 <w:color w:val="000000"/>
                 <w:kern w:val="0"/>
                 <w14:ligatures w14:val="none"/>
@@ -8409,19 +8547,34 @@
               <w:cnfStyle w:val="000000100000" w:firstRow="0" w:lastRow="0" w:firstColumn="0" w:lastColumn="0" w:oddVBand="0" w:evenVBand="0" w:oddHBand="1" w:evenHBand="0" w:firstRowFirstColumn="0" w:firstRowLastColumn="0" w:lastRowFirstColumn="0" w:lastRowLastColumn="0"/>
               <w:rPr>
                 <w:rFonts w:ascii="Courier New" w:eastAsia="Times New Roman" w:hAnsi="Courier New" w:cs="Courier New"/>
-                <w:color w:val="000000"/>
-                <w:kern w:val="0"/>
-                <w14:ligatures w14:val="none"/>
-              </w:rPr>
-            </w:pPr>
-            <w:r>
-              <w:rPr>
-                <w:rFonts w:ascii="Courier New" w:eastAsia="Times New Roman" w:hAnsi="Courier New" w:cs="Courier New"/>
-                <w:color w:val="000000"/>
-                <w:kern w:val="0"/>
-                <w14:ligatures w14:val="none"/>
-              </w:rPr>
-              <w:t>22</w:t>
+                <w:b/>
+                <w:bCs/>
+                <w:color w:val="000000"/>
+                <w:kern w:val="0"/>
+                <w14:ligatures w14:val="none"/>
+              </w:rPr>
+            </w:pPr>
+            <w:r>
+              <w:rPr>
+                <w:rFonts w:ascii="Courier New" w:eastAsia="Times New Roman" w:hAnsi="Courier New" w:cs="Courier New"/>
+                <w:b/>
+                <w:bCs/>
+                <w:color w:val="000000"/>
+                <w:kern w:val="0"/>
+                <w14:ligatures w14:val="none"/>
+              </w:rPr>
+              <w:t>2</w:t>
+            </w:r>
+            <w:r>
+              <w:rPr>
+                <w:rFonts w:ascii="Courier New" w:eastAsia="Times New Roman" w:hAnsi="Courier New" w:cs="Courier New"/>
+                <w:b/>
+                <w:bCs/>
+                <w:color w:val="000000"/>
+                <w:kern w:val="0"/>
+                <w14:ligatures w14:val="none"/>
+              </w:rPr>
+              <w:t>2</w:t>
             </w:r>
           </w:p>
         </w:tc>
@@ -8435,6 +8588,8 @@
               <w:cnfStyle w:val="000000100000" w:firstRow="0" w:lastRow="0" w:firstColumn="0" w:lastColumn="0" w:oddVBand="0" w:evenVBand="0" w:oddHBand="1" w:evenHBand="0" w:firstRowFirstColumn="0" w:firstRowLastColumn="0" w:lastRowFirstColumn="0" w:lastRowLastColumn="0"/>
               <w:rPr>
                 <w:rFonts w:ascii="Courier New" w:eastAsia="Times New Roman" w:hAnsi="Courier New" w:cs="Courier New"/>
+                <w:b/>
+                <w:bCs/>
                 <w:color w:val="000000"/>
                 <w:kern w:val="0"/>
                 <w14:ligatures w14:val="none"/>
@@ -8454,29 +8609,24 @@
             <w:tcW w:w="4405" w:type="dxa"/>
             <w:noWrap/>
             <w:vAlign w:val="center"/>
-            <w:hideMark/>
-          </w:tcPr>
-          <w:p>
-            <w:pPr>
-              <w:rPr>
-                <w:rFonts w:ascii="Courier New" w:eastAsia="Times New Roman" w:hAnsi="Courier New" w:cs="Courier New"/>
-                <w:b w:val="0"/>
-                <w:bCs w:val="0"/>
-                <w:color w:val="000000"/>
-                <w:kern w:val="0"/>
-                <w14:ligatures w14:val="none"/>
-              </w:rPr>
-            </w:pPr>
-            <w:r>
-              <w:rPr>
-                <w:rFonts w:ascii="Courier New" w:eastAsia="Times New Roman" w:hAnsi="Courier New" w:cs="Courier New"/>
-                <w:b w:val="0"/>
-                <w:bCs w:val="0"/>
-                <w:color w:val="000000"/>
-                <w:kern w:val="0"/>
-                <w14:ligatures w14:val="none"/>
-              </w:rPr>
-              <w:t>2 Red Balloon with thread</w:t>
+          </w:tcPr>
+          <w:p>
+            <w:pPr>
+              <w:rPr>
+                <w:rFonts w:ascii="Courier New" w:eastAsia="Times New Roman" w:hAnsi="Courier New" w:cs="Courier New"/>
+                <w:color w:val="000000"/>
+                <w:kern w:val="0"/>
+                <w14:ligatures w14:val="none"/>
+              </w:rPr>
+            </w:pPr>
+            <w:r>
+              <w:rPr>
+                <w:rFonts w:ascii="Courier New" w:eastAsia="Times New Roman" w:hAnsi="Courier New" w:cs="Courier New"/>
+                <w:color w:val="000000"/>
+                <w:kern w:val="0"/>
+                <w14:ligatures w14:val="none"/>
+              </w:rPr>
+              <w:t>Half-burnt doobie</w:t>
             </w:r>
           </w:p>
         </w:tc>
@@ -8485,27 +8635,30 @@
             <w:tcW w:w="1890" w:type="dxa"/>
             <w:noWrap/>
             <w:vAlign w:val="center"/>
-            <w:hideMark/>
-          </w:tcPr>
-          <w:p>
-            <w:pPr>
-              <w:jc w:val="center"/>
-              <w:cnfStyle w:val="000000000000" w:firstRow="0" w:lastRow="0" w:firstColumn="0" w:lastColumn="0" w:oddVBand="0" w:evenVBand="0" w:oddHBand="0" w:evenHBand="0" w:firstRowFirstColumn="0" w:firstRowLastColumn="0" w:lastRowFirstColumn="0" w:lastRowLastColumn="0"/>
-              <w:rPr>
-                <w:rFonts w:ascii="Courier New" w:eastAsia="Times New Roman" w:hAnsi="Courier New" w:cs="Courier New"/>
-                <w:color w:val="000000"/>
-                <w:kern w:val="0"/>
-                <w14:ligatures w14:val="none"/>
-              </w:rPr>
-            </w:pPr>
-            <w:r>
-              <w:rPr>
-                <w:rFonts w:ascii="Courier New" w:eastAsia="Times New Roman" w:hAnsi="Courier New" w:cs="Courier New"/>
-                <w:color w:val="000000"/>
-                <w:kern w:val="0"/>
-                <w14:ligatures w14:val="none"/>
-              </w:rPr>
-              <w:t>3</w:t>
+          </w:tcPr>
+          <w:p>
+            <w:pPr>
+              <w:jc w:val="center"/>
+              <w:cnfStyle w:val="000000000000" w:firstRow="0" w:lastRow="0" w:firstColumn="0" w:lastColumn="0" w:oddVBand="0" w:evenVBand="0" w:oddHBand="0" w:evenHBand="0" w:firstRowFirstColumn="0" w:firstRowLastColumn="0" w:lastRowFirstColumn="0" w:lastRowLastColumn="0"/>
+              <w:rPr>
+                <w:rFonts w:ascii="Courier New" w:eastAsia="Times New Roman" w:hAnsi="Courier New" w:cs="Courier New"/>
+                <w:b/>
+                <w:bCs/>
+                <w:color w:val="000000"/>
+                <w:kern w:val="0"/>
+                <w14:ligatures w14:val="none"/>
+              </w:rPr>
+            </w:pPr>
+            <w:r>
+              <w:rPr>
+                <w:rFonts w:ascii="Courier New" w:eastAsia="Times New Roman" w:hAnsi="Courier New" w:cs="Courier New"/>
+                <w:b/>
+                <w:bCs/>
+                <w:color w:val="000000"/>
+                <w:kern w:val="0"/>
+                <w14:ligatures w14:val="none"/>
+              </w:rPr>
+              <w:t>1</w:t>
             </w:r>
           </w:p>
         </w:tc>
@@ -8514,27 +8667,30 @@
             <w:tcW w:w="3268" w:type="dxa"/>
             <w:noWrap/>
             <w:vAlign w:val="center"/>
-            <w:hideMark/>
-          </w:tcPr>
-          <w:p>
-            <w:pPr>
-              <w:jc w:val="center"/>
-              <w:cnfStyle w:val="000000000000" w:firstRow="0" w:lastRow="0" w:firstColumn="0" w:lastColumn="0" w:oddVBand="0" w:evenVBand="0" w:oddHBand="0" w:evenHBand="0" w:firstRowFirstColumn="0" w:firstRowLastColumn="0" w:lastRowFirstColumn="0" w:lastRowLastColumn="0"/>
-              <w:rPr>
-                <w:rFonts w:ascii="Courier New" w:eastAsia="Times New Roman" w:hAnsi="Courier New" w:cs="Courier New"/>
-                <w:color w:val="000000"/>
-                <w:kern w:val="0"/>
-                <w14:ligatures w14:val="none"/>
-              </w:rPr>
-            </w:pPr>
-            <w:r>
-              <w:rPr>
-                <w:rFonts w:ascii="Courier New" w:eastAsia="Times New Roman" w:hAnsi="Courier New" w:cs="Courier New"/>
-                <w:color w:val="000000"/>
-                <w:kern w:val="0"/>
-                <w14:ligatures w14:val="none"/>
-              </w:rPr>
-              <w:t>22</w:t>
+          </w:tcPr>
+          <w:p>
+            <w:pPr>
+              <w:jc w:val="center"/>
+              <w:cnfStyle w:val="000000000000" w:firstRow="0" w:lastRow="0" w:firstColumn="0" w:lastColumn="0" w:oddVBand="0" w:evenVBand="0" w:oddHBand="0" w:evenHBand="0" w:firstRowFirstColumn="0" w:firstRowLastColumn="0" w:lastRowFirstColumn="0" w:lastRowLastColumn="0"/>
+              <w:rPr>
+                <w:rFonts w:ascii="Courier New" w:eastAsia="Times New Roman" w:hAnsi="Courier New" w:cs="Courier New"/>
+                <w:b/>
+                <w:bCs/>
+                <w:color w:val="000000"/>
+                <w:kern w:val="0"/>
+                <w14:ligatures w14:val="none"/>
+              </w:rPr>
+            </w:pPr>
+            <w:r>
+              <w:rPr>
+                <w:rFonts w:ascii="Courier New" w:eastAsia="Times New Roman" w:hAnsi="Courier New" w:cs="Courier New"/>
+                <w:b/>
+                <w:bCs/>
+                <w:color w:val="000000"/>
+                <w:kern w:val="0"/>
+                <w14:ligatures w14:val="none"/>
+              </w:rPr>
+              <w:t>25</w:t>
             </w:r>
           </w:p>
         </w:tc>
@@ -8568,29 +8724,24 @@
             <w:tcW w:w="4405" w:type="dxa"/>
             <w:noWrap/>
             <w:vAlign w:val="center"/>
-            <w:hideMark/>
-          </w:tcPr>
-          <w:p>
-            <w:pPr>
-              <w:rPr>
-                <w:rFonts w:ascii="Courier New" w:eastAsia="Times New Roman" w:hAnsi="Courier New" w:cs="Courier New"/>
-                <w:b w:val="0"/>
-                <w:bCs w:val="0"/>
-                <w:color w:val="000000"/>
-                <w:kern w:val="0"/>
-                <w14:ligatures w14:val="none"/>
-              </w:rPr>
-            </w:pPr>
-            <w:r>
-              <w:rPr>
-                <w:rFonts w:ascii="Courier New" w:eastAsia="Times New Roman" w:hAnsi="Courier New" w:cs="Courier New"/>
-                <w:b w:val="0"/>
-                <w:bCs w:val="0"/>
-                <w:color w:val="000000"/>
-                <w:kern w:val="0"/>
-                <w14:ligatures w14:val="none"/>
-              </w:rPr>
-              <w:t>Wheelchair</w:t>
+          </w:tcPr>
+          <w:p>
+            <w:pPr>
+              <w:rPr>
+                <w:rFonts w:ascii="Courier New" w:eastAsia="Times New Roman" w:hAnsi="Courier New" w:cs="Courier New"/>
+                <w:color w:val="000000"/>
+                <w:kern w:val="0"/>
+                <w14:ligatures w14:val="none"/>
+              </w:rPr>
+            </w:pPr>
+            <w:r>
+              <w:rPr>
+                <w:rFonts w:ascii="Courier New" w:eastAsia="Times New Roman" w:hAnsi="Courier New" w:cs="Courier New"/>
+                <w:color w:val="000000"/>
+                <w:kern w:val="0"/>
+                <w14:ligatures w14:val="none"/>
+              </w:rPr>
+              <w:t>Tulasi Katte</w:t>
             </w:r>
           </w:p>
         </w:tc>
@@ -8599,22 +8750,25 @@
             <w:tcW w:w="1890" w:type="dxa"/>
             <w:noWrap/>
             <w:vAlign w:val="center"/>
-            <w:hideMark/>
-          </w:tcPr>
-          <w:p>
-            <w:pPr>
-              <w:jc w:val="center"/>
-              <w:cnfStyle w:val="000000100000" w:firstRow="0" w:lastRow="0" w:firstColumn="0" w:lastColumn="0" w:oddVBand="0" w:evenVBand="0" w:oddHBand="1" w:evenHBand="0" w:firstRowFirstColumn="0" w:firstRowLastColumn="0" w:lastRowFirstColumn="0" w:lastRowLastColumn="0"/>
-              <w:rPr>
-                <w:rFonts w:ascii="Courier New" w:eastAsia="Times New Roman" w:hAnsi="Courier New" w:cs="Courier New"/>
-                <w:color w:val="000000"/>
-                <w:kern w:val="0"/>
-                <w14:ligatures w14:val="none"/>
-              </w:rPr>
-            </w:pPr>
-            <w:r>
-              <w:rPr>
-                <w:rFonts w:ascii="Courier New" w:eastAsia="Times New Roman" w:hAnsi="Courier New" w:cs="Courier New"/>
+          </w:tcPr>
+          <w:p>
+            <w:pPr>
+              <w:jc w:val="center"/>
+              <w:cnfStyle w:val="000000100000" w:firstRow="0" w:lastRow="0" w:firstColumn="0" w:lastColumn="0" w:oddVBand="0" w:evenVBand="0" w:oddHBand="1" w:evenHBand="0" w:firstRowFirstColumn="0" w:firstRowLastColumn="0" w:lastRowFirstColumn="0" w:lastRowLastColumn="0"/>
+              <w:rPr>
+                <w:rFonts w:ascii="Courier New" w:eastAsia="Times New Roman" w:hAnsi="Courier New" w:cs="Courier New"/>
+                <w:b/>
+                <w:bCs/>
+                <w:color w:val="000000"/>
+                <w:kern w:val="0"/>
+                <w14:ligatures w14:val="none"/>
+              </w:rPr>
+            </w:pPr>
+            <w:r>
+              <w:rPr>
+                <w:rFonts w:ascii="Courier New" w:eastAsia="Times New Roman" w:hAnsi="Courier New" w:cs="Courier New"/>
+                <w:b/>
+                <w:bCs/>
                 <w:color w:val="000000"/>
                 <w:kern w:val="0"/>
                 <w14:ligatures w14:val="none"/>
@@ -8628,27 +8782,30 @@
             <w:tcW w:w="3268" w:type="dxa"/>
             <w:noWrap/>
             <w:vAlign w:val="center"/>
-            <w:hideMark/>
-          </w:tcPr>
-          <w:p>
-            <w:pPr>
-              <w:jc w:val="center"/>
-              <w:cnfStyle w:val="000000100000" w:firstRow="0" w:lastRow="0" w:firstColumn="0" w:lastColumn="0" w:oddVBand="0" w:evenVBand="0" w:oddHBand="1" w:evenHBand="0" w:firstRowFirstColumn="0" w:firstRowLastColumn="0" w:lastRowFirstColumn="0" w:lastRowLastColumn="0"/>
-              <w:rPr>
-                <w:rFonts w:ascii="Courier New" w:eastAsia="Times New Roman" w:hAnsi="Courier New" w:cs="Courier New"/>
-                <w:color w:val="000000"/>
-                <w:kern w:val="0"/>
-                <w14:ligatures w14:val="none"/>
-              </w:rPr>
-            </w:pPr>
-            <w:r>
-              <w:rPr>
-                <w:rFonts w:ascii="Courier New" w:eastAsia="Times New Roman" w:hAnsi="Courier New" w:cs="Courier New"/>
-                <w:color w:val="000000"/>
-                <w:kern w:val="0"/>
-                <w14:ligatures w14:val="none"/>
-              </w:rPr>
-              <w:t>23</w:t>
+          </w:tcPr>
+          <w:p>
+            <w:pPr>
+              <w:jc w:val="center"/>
+              <w:cnfStyle w:val="000000100000" w:firstRow="0" w:lastRow="0" w:firstColumn="0" w:lastColumn="0" w:oddVBand="0" w:evenVBand="0" w:oddHBand="1" w:evenHBand="0" w:firstRowFirstColumn="0" w:firstRowLastColumn="0" w:lastRowFirstColumn="0" w:lastRowLastColumn="0"/>
+              <w:rPr>
+                <w:rFonts w:ascii="Courier New" w:eastAsia="Times New Roman" w:hAnsi="Courier New" w:cs="Courier New"/>
+                <w:b/>
+                <w:bCs/>
+                <w:color w:val="000000"/>
+                <w:kern w:val="0"/>
+                <w14:ligatures w14:val="none"/>
+              </w:rPr>
+            </w:pPr>
+            <w:r>
+              <w:rPr>
+                <w:rFonts w:ascii="Courier New" w:eastAsia="Times New Roman" w:hAnsi="Courier New" w:cs="Courier New"/>
+                <w:b/>
+                <w:bCs/>
+                <w:color w:val="000000"/>
+                <w:kern w:val="0"/>
+                <w14:ligatures w14:val="none"/>
+              </w:rPr>
+              <w:t>25</w:t>
             </w:r>
           </w:p>
         </w:tc>
@@ -8681,29 +8838,24 @@
             <w:tcW w:w="4405" w:type="dxa"/>
             <w:noWrap/>
             <w:vAlign w:val="center"/>
-            <w:hideMark/>
-          </w:tcPr>
-          <w:p>
-            <w:pPr>
-              <w:rPr>
-                <w:rFonts w:ascii="Courier New" w:eastAsia="Times New Roman" w:hAnsi="Courier New" w:cs="Courier New"/>
-                <w:b w:val="0"/>
-                <w:bCs w:val="0"/>
-                <w:color w:val="000000"/>
-                <w:kern w:val="0"/>
-                <w14:ligatures w14:val="none"/>
-              </w:rPr>
-            </w:pPr>
-            <w:r>
-              <w:rPr>
-                <w:rFonts w:ascii="Courier New" w:eastAsia="Times New Roman" w:hAnsi="Courier New" w:cs="Courier New"/>
-                <w:b w:val="0"/>
-                <w:bCs w:val="0"/>
-                <w:color w:val="000000"/>
-                <w:kern w:val="0"/>
-                <w14:ligatures w14:val="none"/>
-              </w:rPr>
-              <w:t>Blue spotlight</w:t>
+          </w:tcPr>
+          <w:p>
+            <w:pPr>
+              <w:rPr>
+                <w:rFonts w:ascii="Courier New" w:eastAsia="Times New Roman" w:hAnsi="Courier New" w:cs="Courier New"/>
+                <w:color w:val="000000"/>
+                <w:kern w:val="0"/>
+                <w14:ligatures w14:val="none"/>
+              </w:rPr>
+            </w:pPr>
+            <w:r>
+              <w:rPr>
+                <w:rFonts w:ascii="Courier New" w:eastAsia="Times New Roman" w:hAnsi="Courier New" w:cs="Courier New"/>
+                <w:color w:val="000000"/>
+                <w:kern w:val="0"/>
+                <w14:ligatures w14:val="none"/>
+              </w:rPr>
+              <w:t>Brass Tumbler</w:t>
             </w:r>
           </w:p>
         </w:tc>
@@ -8712,22 +8864,25 @@
             <w:tcW w:w="1890" w:type="dxa"/>
             <w:noWrap/>
             <w:vAlign w:val="center"/>
-            <w:hideMark/>
-          </w:tcPr>
-          <w:p>
-            <w:pPr>
-              <w:jc w:val="center"/>
-              <w:cnfStyle w:val="000000000000" w:firstRow="0" w:lastRow="0" w:firstColumn="0" w:lastColumn="0" w:oddVBand="0" w:evenVBand="0" w:oddHBand="0" w:evenHBand="0" w:firstRowFirstColumn="0" w:firstRowLastColumn="0" w:lastRowFirstColumn="0" w:lastRowLastColumn="0"/>
-              <w:rPr>
-                <w:rFonts w:ascii="Courier New" w:eastAsia="Times New Roman" w:hAnsi="Courier New" w:cs="Courier New"/>
-                <w:color w:val="000000"/>
-                <w:kern w:val="0"/>
-                <w14:ligatures w14:val="none"/>
-              </w:rPr>
-            </w:pPr>
-            <w:r>
-              <w:rPr>
-                <w:rFonts w:ascii="Courier New" w:eastAsia="Times New Roman" w:hAnsi="Courier New" w:cs="Courier New"/>
+          </w:tcPr>
+          <w:p>
+            <w:pPr>
+              <w:jc w:val="center"/>
+              <w:cnfStyle w:val="000000000000" w:firstRow="0" w:lastRow="0" w:firstColumn="0" w:lastColumn="0" w:oddVBand="0" w:evenVBand="0" w:oddHBand="0" w:evenHBand="0" w:firstRowFirstColumn="0" w:firstRowLastColumn="0" w:lastRowFirstColumn="0" w:lastRowLastColumn="0"/>
+              <w:rPr>
+                <w:rFonts w:ascii="Courier New" w:eastAsia="Times New Roman" w:hAnsi="Courier New" w:cs="Courier New"/>
+                <w:b/>
+                <w:bCs/>
+                <w:color w:val="000000"/>
+                <w:kern w:val="0"/>
+                <w14:ligatures w14:val="none"/>
+              </w:rPr>
+            </w:pPr>
+            <w:r>
+              <w:rPr>
+                <w:rFonts w:ascii="Courier New" w:eastAsia="Times New Roman" w:hAnsi="Courier New" w:cs="Courier New"/>
+                <w:b/>
+                <w:bCs/>
                 <w:color w:val="000000"/>
                 <w:kern w:val="0"/>
                 <w14:ligatures w14:val="none"/>
@@ -8741,27 +8896,30 @@
             <w:tcW w:w="3268" w:type="dxa"/>
             <w:noWrap/>
             <w:vAlign w:val="center"/>
-            <w:hideMark/>
-          </w:tcPr>
-          <w:p>
-            <w:pPr>
-              <w:jc w:val="center"/>
-              <w:cnfStyle w:val="000000000000" w:firstRow="0" w:lastRow="0" w:firstColumn="0" w:lastColumn="0" w:oddVBand="0" w:evenVBand="0" w:oddHBand="0" w:evenHBand="0" w:firstRowFirstColumn="0" w:firstRowLastColumn="0" w:lastRowFirstColumn="0" w:lastRowLastColumn="0"/>
-              <w:rPr>
-                <w:rFonts w:ascii="Courier New" w:eastAsia="Times New Roman" w:hAnsi="Courier New" w:cs="Courier New"/>
-                <w:color w:val="000000"/>
-                <w:kern w:val="0"/>
-                <w14:ligatures w14:val="none"/>
-              </w:rPr>
-            </w:pPr>
-            <w:r>
-              <w:rPr>
-                <w:rFonts w:ascii="Courier New" w:eastAsia="Times New Roman" w:hAnsi="Courier New" w:cs="Courier New"/>
-                <w:color w:val="000000"/>
-                <w:kern w:val="0"/>
-                <w14:ligatures w14:val="none"/>
-              </w:rPr>
-              <w:t>24</w:t>
+          </w:tcPr>
+          <w:p>
+            <w:pPr>
+              <w:jc w:val="center"/>
+              <w:cnfStyle w:val="000000000000" w:firstRow="0" w:lastRow="0" w:firstColumn="0" w:lastColumn="0" w:oddVBand="0" w:evenVBand="0" w:oddHBand="0" w:evenHBand="0" w:firstRowFirstColumn="0" w:firstRowLastColumn="0" w:lastRowFirstColumn="0" w:lastRowLastColumn="0"/>
+              <w:rPr>
+                <w:rFonts w:ascii="Courier New" w:eastAsia="Times New Roman" w:hAnsi="Courier New" w:cs="Courier New"/>
+                <w:b/>
+                <w:bCs/>
+                <w:color w:val="000000"/>
+                <w:kern w:val="0"/>
+                <w14:ligatures w14:val="none"/>
+              </w:rPr>
+            </w:pPr>
+            <w:r>
+              <w:rPr>
+                <w:rFonts w:ascii="Courier New" w:eastAsia="Times New Roman" w:hAnsi="Courier New" w:cs="Courier New"/>
+                <w:b/>
+                <w:bCs/>
+                <w:color w:val="000000"/>
+                <w:kern w:val="0"/>
+                <w14:ligatures w14:val="none"/>
+              </w:rPr>
+              <w:t>25</w:t>
             </w:r>
           </w:p>
         </w:tc>
@@ -8795,7 +8953,6 @@
             <w:tcW w:w="4405" w:type="dxa"/>
             <w:noWrap/>
             <w:vAlign w:val="center"/>
-            <w:hideMark/>
           </w:tcPr>
           <w:p>
             <w:pPr>
@@ -8808,17 +8965,6 @@
                 <w14:ligatures w14:val="none"/>
               </w:rPr>
             </w:pPr>
-            <w:r>
-              <w:rPr>
-                <w:rFonts w:ascii="Courier New" w:eastAsia="Times New Roman" w:hAnsi="Courier New" w:cs="Courier New"/>
-                <w:b w:val="0"/>
-                <w:bCs w:val="0"/>
-                <w:color w:val="000000"/>
-                <w:kern w:val="0"/>
-                <w14:ligatures w14:val="none"/>
-              </w:rPr>
-              <w:t>Fog machine</w:t>
-            </w:r>
           </w:p>
         </w:tc>
         <w:tc>
@@ -8826,28 +8972,18 @@
             <w:tcW w:w="1890" w:type="dxa"/>
             <w:noWrap/>
             <w:vAlign w:val="center"/>
-            <w:hideMark/>
-          </w:tcPr>
-          <w:p>
-            <w:pPr>
-              <w:jc w:val="center"/>
-              <w:cnfStyle w:val="000000100000" w:firstRow="0" w:lastRow="0" w:firstColumn="0" w:lastColumn="0" w:oddVBand="0" w:evenVBand="0" w:oddHBand="1" w:evenHBand="0" w:firstRowFirstColumn="0" w:firstRowLastColumn="0" w:lastRowFirstColumn="0" w:lastRowLastColumn="0"/>
-              <w:rPr>
-                <w:rFonts w:ascii="Courier New" w:eastAsia="Times New Roman" w:hAnsi="Courier New" w:cs="Courier New"/>
-                <w:color w:val="000000"/>
-                <w:kern w:val="0"/>
-                <w14:ligatures w14:val="none"/>
-              </w:rPr>
-            </w:pPr>
-            <w:r>
-              <w:rPr>
-                <w:rFonts w:ascii="Courier New" w:eastAsia="Times New Roman" w:hAnsi="Courier New" w:cs="Courier New"/>
-                <w:color w:val="000000"/>
-                <w:kern w:val="0"/>
-                <w14:ligatures w14:val="none"/>
-              </w:rPr>
-              <w:t>1</w:t>
-            </w:r>
+          </w:tcPr>
+          <w:p>
+            <w:pPr>
+              <w:jc w:val="center"/>
+              <w:cnfStyle w:val="000000100000" w:firstRow="0" w:lastRow="0" w:firstColumn="0" w:lastColumn="0" w:oddVBand="0" w:evenVBand="0" w:oddHBand="1" w:evenHBand="0" w:firstRowFirstColumn="0" w:firstRowLastColumn="0" w:lastRowFirstColumn="0" w:lastRowLastColumn="0"/>
+              <w:rPr>
+                <w:rFonts w:ascii="Courier New" w:eastAsia="Times New Roman" w:hAnsi="Courier New" w:cs="Courier New"/>
+                <w:color w:val="000000"/>
+                <w:kern w:val="0"/>
+                <w14:ligatures w14:val="none"/>
+              </w:rPr>
+            </w:pPr>
           </w:p>
         </w:tc>
         <w:tc>
@@ -8855,28 +8991,18 @@
             <w:tcW w:w="3268" w:type="dxa"/>
             <w:noWrap/>
             <w:vAlign w:val="center"/>
-            <w:hideMark/>
-          </w:tcPr>
-          <w:p>
-            <w:pPr>
-              <w:jc w:val="center"/>
-              <w:cnfStyle w:val="000000100000" w:firstRow="0" w:lastRow="0" w:firstColumn="0" w:lastColumn="0" w:oddVBand="0" w:evenVBand="0" w:oddHBand="1" w:evenHBand="0" w:firstRowFirstColumn="0" w:firstRowLastColumn="0" w:lastRowFirstColumn="0" w:lastRowLastColumn="0"/>
-              <w:rPr>
-                <w:rFonts w:ascii="Courier New" w:eastAsia="Times New Roman" w:hAnsi="Courier New" w:cs="Courier New"/>
-                <w:color w:val="000000"/>
-                <w:kern w:val="0"/>
-                <w14:ligatures w14:val="none"/>
-              </w:rPr>
-            </w:pPr>
-            <w:r>
-              <w:rPr>
-                <w:rFonts w:ascii="Courier New" w:eastAsia="Times New Roman" w:hAnsi="Courier New" w:cs="Courier New"/>
-                <w:color w:val="000000"/>
-                <w:kern w:val="0"/>
-                <w14:ligatures w14:val="none"/>
-              </w:rPr>
-              <w:t>24</w:t>
-            </w:r>
+          </w:tcPr>
+          <w:p>
+            <w:pPr>
+              <w:jc w:val="center"/>
+              <w:cnfStyle w:val="000000100000" w:firstRow="0" w:lastRow="0" w:firstColumn="0" w:lastColumn="0" w:oddVBand="0" w:evenVBand="0" w:oddHBand="1" w:evenHBand="0" w:firstRowFirstColumn="0" w:firstRowLastColumn="0" w:lastRowFirstColumn="0" w:lastRowLastColumn="0"/>
+              <w:rPr>
+                <w:rFonts w:ascii="Courier New" w:eastAsia="Times New Roman" w:hAnsi="Courier New" w:cs="Courier New"/>
+                <w:color w:val="000000"/>
+                <w:kern w:val="0"/>
+                <w14:ligatures w14:val="none"/>
+              </w:rPr>
+            </w:pPr>
           </w:p>
         </w:tc>
         <w:tc>
@@ -8930,7 +9056,7 @@
                 <w:kern w:val="0"/>
                 <w14:ligatures w14:val="none"/>
               </w:rPr>
-              <w:t>Envelope with funeral card</w:t>
+              <w:t>Fog machine</w:t>
             </w:r>
           </w:p>
         </w:tc>
@@ -9044,7 +9170,7 @@
                 <w:kern w:val="0"/>
                 <w14:ligatures w14:val="none"/>
               </w:rPr>
-              <w:t>Pyre</w:t>
+              <w:t>Envelope with funeral card</w:t>
             </w:r>
           </w:p>
         </w:tc>
@@ -9157,7 +9283,7 @@
                 <w:kern w:val="0"/>
                 <w14:ligatures w14:val="none"/>
               </w:rPr>
-              <w:t>Bhasma</w:t>
+              <w:t>Pyre</w:t>
             </w:r>
           </w:p>
         </w:tc>
@@ -9271,7 +9397,7 @@
                 <w:kern w:val="0"/>
                 <w14:ligatures w14:val="none"/>
               </w:rPr>
-              <w:t>Mailbox</w:t>
+              <w:t>Bhasma</w:t>
             </w:r>
           </w:p>
         </w:tc>
@@ -9384,7 +9510,7 @@
                 <w:kern w:val="0"/>
                 <w14:ligatures w14:val="none"/>
               </w:rPr>
-              <w:t>Black Sesame Seeds</w:t>
+              <w:t>Mailbox</w:t>
             </w:r>
           </w:p>
         </w:tc>
@@ -9442,7 +9568,7 @@
                 <w:kern w:val="0"/>
                 <w14:ligatures w14:val="none"/>
               </w:rPr>
-              <w:t>25</w:t>
+              <w:t>24</w:t>
             </w:r>
           </w:p>
         </w:tc>
@@ -9498,7 +9624,7 @@
                 <w:kern w:val="0"/>
                 <w14:ligatures w14:val="none"/>
               </w:rPr>
-              <w:t>Pinda</w:t>
+              <w:t>Black Sesame Seeds</w:t>
             </w:r>
           </w:p>
         </w:tc>
@@ -9611,7 +9737,7 @@
                 <w:kern w:val="0"/>
                 <w14:ligatures w14:val="none"/>
               </w:rPr>
-              <w:t>Long Mirror</w:t>
+              <w:t>Pinda</w:t>
             </w:r>
           </w:p>
         </w:tc>
@@ -9725,7 +9851,7 @@
                 <w:kern w:val="0"/>
                 <w14:ligatures w14:val="none"/>
               </w:rPr>
-              <w:t>Long curly hair</w:t>
+              <w:t>Long Mirror</w:t>
             </w:r>
           </w:p>
         </w:tc>
@@ -9783,7 +9909,7 @@
                 <w:kern w:val="0"/>
                 <w14:ligatures w14:val="none"/>
               </w:rPr>
-              <w:t>28</w:t>
+              <w:t>25</w:t>
             </w:r>
           </w:p>
         </w:tc>
@@ -9838,7 +9964,7 @@
                 <w:kern w:val="0"/>
                 <w14:ligatures w14:val="none"/>
               </w:rPr>
-              <w:t>Silver Earrings</w:t>
+              <w:t>Long curly hair</w:t>
             </w:r>
           </w:p>
         </w:tc>
@@ -9867,7 +9993,7 @@
                 <w:kern w:val="0"/>
                 <w14:ligatures w14:val="none"/>
               </w:rPr>
-              <w:t>2</w:t>
+              <w:t>1</w:t>
             </w:r>
           </w:p>
         </w:tc>
@@ -9952,7 +10078,7 @@
                 <w:kern w:val="0"/>
                 <w14:ligatures w14:val="none"/>
               </w:rPr>
-              <w:t>Silver Nose Ring</w:t>
+              <w:t>Silver Earrings</w:t>
             </w:r>
           </w:p>
         </w:tc>
@@ -9981,7 +10107,7 @@
                 <w:kern w:val="0"/>
                 <w14:ligatures w14:val="none"/>
               </w:rPr>
-              <w:t>1</w:t>
+              <w:t>2</w:t>
             </w:r>
           </w:p>
         </w:tc>
@@ -10065,7 +10191,7 @@
                 <w:kern w:val="0"/>
                 <w14:ligatures w14:val="none"/>
               </w:rPr>
-              <w:t>Silver Armbands</w:t>
+              <w:t>Silver Nose Ring</w:t>
             </w:r>
           </w:p>
         </w:tc>
@@ -10094,7 +10220,7 @@
                 <w:kern w:val="0"/>
                 <w14:ligatures w14:val="none"/>
               </w:rPr>
-              <w:t>2</w:t>
+              <w:t>1</w:t>
             </w:r>
           </w:p>
         </w:tc>
@@ -10179,7 +10305,7 @@
                 <w:kern w:val="0"/>
                 <w14:ligatures w14:val="none"/>
               </w:rPr>
-              <w:t>Flower decorated photo of Adi</w:t>
+              <w:t>Silver Armbands</w:t>
             </w:r>
           </w:p>
         </w:tc>
@@ -10208,7 +10334,7 @@
                 <w:kern w:val="0"/>
                 <w14:ligatures w14:val="none"/>
               </w:rPr>
-              <w:t>1</w:t>
+              <w:t>2</w:t>
             </w:r>
           </w:p>
         </w:tc>
@@ -10292,7 +10418,7 @@
                 <w:kern w:val="0"/>
                 <w14:ligatures w14:val="none"/>
               </w:rPr>
-              <w:t>Brass Lamp</w:t>
+              <w:t>Flower decorated photo of Adi</w:t>
             </w:r>
           </w:p>
         </w:tc>
@@ -10406,7 +10532,7 @@
                 <w:kern w:val="0"/>
                 <w14:ligatures w14:val="none"/>
               </w:rPr>
-              <w:t>Thick Metallic Chain</w:t>
+              <w:t>Brass Lamp</w:t>
             </w:r>
           </w:p>
         </w:tc>
@@ -10519,7 +10645,7 @@
                 <w:kern w:val="0"/>
                 <w14:ligatures w14:val="none"/>
               </w:rPr>
-              <w:t>-----------------------------</w:t>
+              <w:t>Thick Metallic Chain</w:t>
             </w:r>
           </w:p>
         </w:tc>
@@ -10548,7 +10674,7 @@
                 <w:kern w:val="0"/>
                 <w14:ligatures w14:val="none"/>
               </w:rPr>
-              <w:t>-----------</w:t>
+              <w:t>1</w:t>
             </w:r>
           </w:p>
         </w:tc>
@@ -10564,21 +10690,20 @@
               <w:jc w:val="center"/>
               <w:cnfStyle w:val="000000000000" w:firstRow="0" w:lastRow="0" w:firstColumn="0" w:lastColumn="0" w:oddVBand="0" w:evenVBand="0" w:oddHBand="0" w:evenHBand="0" w:firstRowFirstColumn="0" w:firstRowLastColumn="0" w:lastRowFirstColumn="0" w:lastRowLastColumn="0"/>
               <w:rPr>
-                <w:rFonts w:ascii="Times New Roman" w:eastAsia="Times New Roman" w:hAnsi="Times New Roman" w:cs="Times New Roman"/>
-                <w:kern w:val="0"/>
-                <w:sz w:val="20"/>
-                <w:szCs w:val="20"/>
-                <w14:ligatures w14:val="none"/>
-              </w:rPr>
-            </w:pPr>
-            <w:r>
-              <w:rPr>
-                <w:rFonts w:ascii="Courier New" w:eastAsia="Times New Roman" w:hAnsi="Courier New" w:cs="Courier New"/>
-                <w:color w:val="000000"/>
-                <w:kern w:val="0"/>
-                <w14:ligatures w14:val="none"/>
-              </w:rPr>
-              <w:t>---------------------</w:t>
+                <w:rFonts w:ascii="Courier New" w:eastAsia="Times New Roman" w:hAnsi="Courier New" w:cs="Courier New"/>
+                <w:color w:val="000000"/>
+                <w:kern w:val="0"/>
+                <w14:ligatures w14:val="none"/>
+              </w:rPr>
+            </w:pPr>
+            <w:r>
+              <w:rPr>
+                <w:rFonts w:ascii="Courier New" w:eastAsia="Times New Roman" w:hAnsi="Courier New" w:cs="Courier New"/>
+                <w:color w:val="000000"/>
+                <w:kern w:val="0"/>
+                <w14:ligatures w14:val="none"/>
+              </w:rPr>
+              <w:t>28</w:t>
             </w:r>
           </w:p>
         </w:tc>
@@ -10591,22 +10716,12 @@
             <w:pPr>
               <w:cnfStyle w:val="000000000000" w:firstRow="0" w:lastRow="0" w:firstColumn="0" w:lastColumn="0" w:oddVBand="0" w:evenVBand="0" w:oddHBand="0" w:evenHBand="0" w:firstRowFirstColumn="0" w:firstRowLastColumn="0" w:lastRowFirstColumn="0" w:lastRowLastColumn="0"/>
               <w:rPr>
-                <w:rFonts w:ascii="Times New Roman" w:eastAsia="Times New Roman" w:hAnsi="Times New Roman" w:cs="Times New Roman"/>
-                <w:kern w:val="0"/>
-                <w:sz w:val="20"/>
-                <w:szCs w:val="20"/>
-                <w14:ligatures w14:val="none"/>
-              </w:rPr>
-            </w:pPr>
-            <w:r>
-              <w:rPr>
-                <w:rFonts w:ascii="Courier New" w:eastAsia="Times New Roman" w:hAnsi="Courier New" w:cs="Courier New"/>
-                <w:color w:val="000000"/>
-                <w:kern w:val="0"/>
-                <w14:ligatures w14:val="none"/>
-              </w:rPr>
-              <w:t>-----------</w:t>
-            </w:r>
+                <w:rFonts w:ascii="Courier New" w:eastAsia="Times New Roman" w:hAnsi="Courier New" w:cs="Courier New"/>
+                <w:color w:val="000000"/>
+                <w:kern w:val="0"/>
+                <w14:ligatures w14:val="none"/>
+              </w:rPr>
+            </w:pPr>
           </w:p>
         </w:tc>
       </w:tr>
@@ -10644,7 +10759,7 @@
                 <w:kern w:val="0"/>
                 <w14:ligatures w14:val="none"/>
               </w:rPr>
-              <w:t>Crib with Cot Mobile</w:t>
+              <w:t>-----------------------------</w:t>
             </w:r>
           </w:p>
         </w:tc>
@@ -10666,6 +10781,15 @@
                 <w14:ligatures w14:val="none"/>
               </w:rPr>
             </w:pPr>
+            <w:r>
+              <w:rPr>
+                <w:rFonts w:ascii="Courier New" w:eastAsia="Times New Roman" w:hAnsi="Courier New" w:cs="Courier New"/>
+                <w:color w:val="000000"/>
+                <w:kern w:val="0"/>
+                <w14:ligatures w14:val="none"/>
+              </w:rPr>
+              <w:t>-----------</w:t>
+            </w:r>
           </w:p>
         </w:tc>
         <w:tc>
@@ -10694,7 +10818,7 @@
                 <w:kern w:val="0"/>
                 <w14:ligatures w14:val="none"/>
               </w:rPr>
-              <w:t>27</w:t>
+              <w:t>---------------------</w:t>
             </w:r>
           </w:p>
         </w:tc>
@@ -10714,6 +10838,15 @@
                 <w14:ligatures w14:val="none"/>
               </w:rPr>
             </w:pPr>
+            <w:r>
+              <w:rPr>
+                <w:rFonts w:ascii="Courier New" w:eastAsia="Times New Roman" w:hAnsi="Courier New" w:cs="Courier New"/>
+                <w:color w:val="000000"/>
+                <w:kern w:val="0"/>
+                <w14:ligatures w14:val="none"/>
+              </w:rPr>
+              <w:t>-----------</w:t>
+            </w:r>
           </w:p>
         </w:tc>
       </w:tr>
@@ -10750,7 +10883,7 @@
                 <w:kern w:val="0"/>
                 <w14:ligatures w14:val="none"/>
               </w:rPr>
-              <w:t>Cycle</w:t>
+              <w:t>Crib with Cot Mobile</w:t>
             </w:r>
           </w:p>
         </w:tc>
@@ -10857,7 +10990,7 @@
                 <w:kern w:val="0"/>
                 <w14:ligatures w14:val="none"/>
               </w:rPr>
-              <w:t>Band-aid</w:t>
+              <w:t>Cycle</w:t>
             </w:r>
           </w:p>
         </w:tc>
@@ -10963,7 +11096,7 @@
                 <w:kern w:val="0"/>
                 <w14:ligatures w14:val="none"/>
               </w:rPr>
-              <w:t>Puppy</w:t>
+              <w:t>Band-aid</w:t>
             </w:r>
           </w:p>
         </w:tc>
@@ -11070,7 +11203,7 @@
                 <w:kern w:val="0"/>
                 <w14:ligatures w14:val="none"/>
               </w:rPr>
-              <w:t>Bat and ball</w:t>
+              <w:t>Puppy</w:t>
             </w:r>
           </w:p>
         </w:tc>
@@ -11176,7 +11309,7 @@
                 <w:kern w:val="0"/>
                 <w14:ligatures w14:val="none"/>
               </w:rPr>
-              <w:t>Ice-lollies</w:t>
+              <w:t>Bat and ball</w:t>
             </w:r>
           </w:p>
         </w:tc>
@@ -11284,7 +11417,7 @@
                 <w14:ligatures w14:val="none"/>
               </w:rPr>
               <w:lastRenderedPageBreak/>
-              <w:t>Beer bottles to cheer</w:t>
+              <w:t>Ice-lollies</w:t>
             </w:r>
           </w:p>
         </w:tc>
@@ -11390,7 +11523,7 @@
                 <w:kern w:val="0"/>
                 <w14:ligatures w14:val="none"/>
               </w:rPr>
-              <w:t>Doobie</w:t>
+              <w:t>Beer bottles to cheer</w:t>
             </w:r>
           </w:p>
         </w:tc>
@@ -11475,6 +11608,7 @@
             <w:tcW w:w="4405" w:type="dxa"/>
             <w:noWrap/>
             <w:vAlign w:val="center"/>
+            <w:hideMark/>
           </w:tcPr>
           <w:p>
             <w:pPr>
@@ -11496,7 +11630,7 @@
                 <w:kern w:val="0"/>
                 <w14:ligatures w14:val="none"/>
               </w:rPr>
-              <w:t>Wedding Ring</w:t>
+              <w:t>Doobie</w:t>
             </w:r>
           </w:p>
         </w:tc>
@@ -11505,6 +11639,7 @@
             <w:tcW w:w="1890" w:type="dxa"/>
             <w:noWrap/>
             <w:vAlign w:val="center"/>
+            <w:hideMark/>
           </w:tcPr>
           <w:p>
             <w:pPr>
@@ -11524,15 +11659,17 @@
             <w:tcW w:w="3268" w:type="dxa"/>
             <w:noWrap/>
             <w:vAlign w:val="center"/>
-          </w:tcPr>
-          <w:p>
-            <w:pPr>
-              <w:jc w:val="center"/>
-              <w:cnfStyle w:val="000000100000" w:firstRow="0" w:lastRow="0" w:firstColumn="0" w:lastColumn="0" w:oddVBand="0" w:evenVBand="0" w:oddHBand="1" w:evenHBand="0" w:firstRowFirstColumn="0" w:firstRowLastColumn="0" w:lastRowFirstColumn="0" w:lastRowLastColumn="0"/>
-              <w:rPr>
-                <w:rFonts w:ascii="Courier New" w:eastAsia="Times New Roman" w:hAnsi="Courier New" w:cs="Courier New"/>
-                <w:color w:val="000000"/>
-                <w:kern w:val="0"/>
+            <w:hideMark/>
+          </w:tcPr>
+          <w:p>
+            <w:pPr>
+              <w:jc w:val="center"/>
+              <w:cnfStyle w:val="000000100000" w:firstRow="0" w:lastRow="0" w:firstColumn="0" w:lastColumn="0" w:oddVBand="0" w:evenVBand="0" w:oddHBand="1" w:evenHBand="0" w:firstRowFirstColumn="0" w:firstRowLastColumn="0" w:lastRowFirstColumn="0" w:lastRowLastColumn="0"/>
+              <w:rPr>
+                <w:rFonts w:ascii="Times New Roman" w:eastAsia="Times New Roman" w:hAnsi="Times New Roman" w:cs="Times New Roman"/>
+                <w:kern w:val="0"/>
+                <w:sz w:val="20"/>
+                <w:szCs w:val="20"/>
                 <w14:ligatures w14:val="none"/>
               </w:rPr>
             </w:pPr>
@@ -11598,7 +11735,7 @@
                 <w:kern w:val="0"/>
                 <w14:ligatures w14:val="none"/>
               </w:rPr>
-              <w:t xml:space="preserve">A cloth to cover invertor </w:t>
+              <w:t>Wedding Ring</w:t>
             </w:r>
           </w:p>
         </w:tc>
@@ -11607,7 +11744,6 @@
             <w:tcW w:w="1890" w:type="dxa"/>
             <w:noWrap/>
             <w:vAlign w:val="center"/>
-            <w:hideMark/>
           </w:tcPr>
           <w:p>
             <w:pPr>
@@ -11627,11 +11763,36 @@
             <w:tcW w:w="3268" w:type="dxa"/>
             <w:noWrap/>
             <w:vAlign w:val="center"/>
-            <w:hideMark/>
-          </w:tcPr>
-          <w:p>
-            <w:pPr>
-              <w:jc w:val="center"/>
+          </w:tcPr>
+          <w:p>
+            <w:pPr>
+              <w:jc w:val="center"/>
+              <w:cnfStyle w:val="000000000000" w:firstRow="0" w:lastRow="0" w:firstColumn="0" w:lastColumn="0" w:oddVBand="0" w:evenVBand="0" w:oddHBand="0" w:evenHBand="0" w:firstRowFirstColumn="0" w:firstRowLastColumn="0" w:lastRowFirstColumn="0" w:lastRowLastColumn="0"/>
+              <w:rPr>
+                <w:rFonts w:ascii="Courier New" w:eastAsia="Times New Roman" w:hAnsi="Courier New" w:cs="Courier New"/>
+                <w:color w:val="000000"/>
+                <w:kern w:val="0"/>
+                <w14:ligatures w14:val="none"/>
+              </w:rPr>
+            </w:pPr>
+            <w:r>
+              <w:rPr>
+                <w:rFonts w:ascii="Courier New" w:eastAsia="Times New Roman" w:hAnsi="Courier New" w:cs="Courier New"/>
+                <w:color w:val="000000"/>
+                <w:kern w:val="0"/>
+                <w14:ligatures w14:val="none"/>
+              </w:rPr>
+              <w:t>27</w:t>
+            </w:r>
+          </w:p>
+        </w:tc>
+        <w:tc>
+          <w:tcPr>
+            <w:tcW w:w="1804" w:type="dxa"/>
+            <w:vAlign w:val="center"/>
+          </w:tcPr>
+          <w:p>
+            <w:pPr>
               <w:cnfStyle w:val="000000000000" w:firstRow="0" w:lastRow="0" w:firstColumn="0" w:lastColumn="0" w:oddVBand="0" w:evenVBand="0" w:oddHBand="0" w:evenHBand="0" w:firstRowFirstColumn="0" w:firstRowLastColumn="0" w:lastRowFirstColumn="0" w:lastRowLastColumn="0"/>
               <w:rPr>
                 <w:rFonts w:ascii="Times New Roman" w:eastAsia="Times New Roman" w:hAnsi="Times New Roman" w:cs="Times New Roman"/>
@@ -11643,6 +11804,85 @@
             </w:pPr>
           </w:p>
         </w:tc>
+      </w:tr>
+      <w:tr>
+        <w:trPr>
+          <w:cnfStyle w:val="000000100000" w:firstRow="0" w:lastRow="0" w:firstColumn="0" w:lastColumn="0" w:oddVBand="0" w:evenVBand="0" w:oddHBand="1" w:evenHBand="0" w:firstRowFirstColumn="0" w:firstRowLastColumn="0" w:lastRowFirstColumn="0" w:lastRowLastColumn="0"/>
+          <w:trHeight w:val="432"/>
+          <w:jc w:val="center"/>
+        </w:trPr>
+        <w:tc>
+          <w:tcPr>
+            <w:cnfStyle w:val="001000000000" w:firstRow="0" w:lastRow="0" w:firstColumn="1" w:lastColumn="0" w:oddVBand="0" w:evenVBand="0" w:oddHBand="0" w:evenHBand="0" w:firstRowFirstColumn="0" w:firstRowLastColumn="0" w:lastRowFirstColumn="0" w:lastRowLastColumn="0"/>
+            <w:tcW w:w="4405" w:type="dxa"/>
+            <w:noWrap/>
+            <w:vAlign w:val="center"/>
+          </w:tcPr>
+          <w:p>
+            <w:pPr>
+              <w:rPr>
+                <w:rFonts w:ascii="Courier New" w:eastAsia="Times New Roman" w:hAnsi="Courier New" w:cs="Courier New"/>
+                <w:b w:val="0"/>
+                <w:bCs w:val="0"/>
+                <w:color w:val="000000"/>
+                <w:kern w:val="0"/>
+                <w14:ligatures w14:val="none"/>
+              </w:rPr>
+            </w:pPr>
+            <w:r>
+              <w:rPr>
+                <w:rFonts w:ascii="Courier New" w:eastAsia="Times New Roman" w:hAnsi="Courier New" w:cs="Courier New"/>
+                <w:b w:val="0"/>
+                <w:bCs w:val="0"/>
+                <w:color w:val="000000"/>
+                <w:kern w:val="0"/>
+                <w14:ligatures w14:val="none"/>
+              </w:rPr>
+              <w:t xml:space="preserve">A cloth to cover invertor </w:t>
+            </w:r>
+          </w:p>
+        </w:tc>
+        <w:tc>
+          <w:tcPr>
+            <w:tcW w:w="1890" w:type="dxa"/>
+            <w:noWrap/>
+            <w:vAlign w:val="center"/>
+            <w:hideMark/>
+          </w:tcPr>
+          <w:p>
+            <w:pPr>
+              <w:jc w:val="center"/>
+              <w:cnfStyle w:val="000000100000" w:firstRow="0" w:lastRow="0" w:firstColumn="0" w:lastColumn="0" w:oddVBand="0" w:evenVBand="0" w:oddHBand="1" w:evenHBand="0" w:firstRowFirstColumn="0" w:firstRowLastColumn="0" w:lastRowFirstColumn="0" w:lastRowLastColumn="0"/>
+              <w:rPr>
+                <w:rFonts w:ascii="Courier New" w:eastAsia="Times New Roman" w:hAnsi="Courier New" w:cs="Courier New"/>
+                <w:color w:val="000000"/>
+                <w:kern w:val="0"/>
+                <w14:ligatures w14:val="none"/>
+              </w:rPr>
+            </w:pPr>
+          </w:p>
+        </w:tc>
+        <w:tc>
+          <w:tcPr>
+            <w:tcW w:w="3268" w:type="dxa"/>
+            <w:noWrap/>
+            <w:vAlign w:val="center"/>
+            <w:hideMark/>
+          </w:tcPr>
+          <w:p>
+            <w:pPr>
+              <w:jc w:val="center"/>
+              <w:cnfStyle w:val="000000100000" w:firstRow="0" w:lastRow="0" w:firstColumn="0" w:lastColumn="0" w:oddVBand="0" w:evenVBand="0" w:oddHBand="1" w:evenHBand="0" w:firstRowFirstColumn="0" w:firstRowLastColumn="0" w:lastRowFirstColumn="0" w:lastRowLastColumn="0"/>
+              <w:rPr>
+                <w:rFonts w:ascii="Times New Roman" w:eastAsia="Times New Roman" w:hAnsi="Times New Roman" w:cs="Times New Roman"/>
+                <w:kern w:val="0"/>
+                <w:sz w:val="20"/>
+                <w:szCs w:val="20"/>
+                <w14:ligatures w14:val="none"/>
+              </w:rPr>
+            </w:pPr>
+          </w:p>
+        </w:tc>
         <w:tc>
           <w:tcPr>
             <w:tcW w:w="1804" w:type="dxa"/>
@@ -11650,7 +11890,7 @@
           </w:tcPr>
           <w:p>
             <w:pPr>
-              <w:cnfStyle w:val="000000000000" w:firstRow="0" w:lastRow="0" w:firstColumn="0" w:lastColumn="0" w:oddVBand="0" w:evenVBand="0" w:oddHBand="0" w:evenHBand="0" w:firstRowFirstColumn="0" w:firstRowLastColumn="0" w:lastRowFirstColumn="0" w:lastRowLastColumn="0"/>
+              <w:cnfStyle w:val="000000100000" w:firstRow="0" w:lastRow="0" w:firstColumn="0" w:lastColumn="0" w:oddVBand="0" w:evenVBand="0" w:oddHBand="1" w:evenHBand="0" w:firstRowFirstColumn="0" w:firstRowLastColumn="0" w:lastRowFirstColumn="0" w:lastRowLastColumn="0"/>
               <w:rPr>
                 <w:rFonts w:ascii="Times New Roman" w:eastAsia="Times New Roman" w:hAnsi="Times New Roman" w:cs="Times New Roman"/>
                 <w:kern w:val="0"/>

</xml_diff>